<commit_message>
Rapport FBC: traiter les 27 réponses comme un seul ensemble d'entreprises
Retire la distinction DAF / employés, non fournie dans les données, et
recalcule les chiffres sur les 27 réponses.

Co-Authored-By: Claude Sonnet 5.5 <noreply@anthropic.com>
Claude-Session: https://claude.ai/code/session_01FbcMrHUb4kmJopxkhiarAy
</commit_message>
<xml_diff>
--- a/rapport_fbc/Rapport_Enquete_First_Business_Clarity.docx
+++ b/rapport_fbc/Rapport_Enquete_First_Business_Clarity.docx
@@ -1104,7 +1104,7 @@
                 <w:sz w:val="16"/>
                 <w:szCs w:val="16"/>
               </w:rPr>
-              <w:t xml:space="preserve">réponses exploitables (22 DAF / dirigeants, 5 employés)</w:t>
+              <w:t xml:space="preserve">entreprises répondantes (45 % de l’objectif de 60)</w:t>
             </w:r>
           </w:p>
         </w:tc>
@@ -1139,7 +1139,7 @@
                 <w:sz w:val="40"/>
                 <w:szCs w:val="40"/>
               </w:rPr>
-              <w:t xml:space="preserve">77 %</w:t>
+              <w:t xml:space="preserve">67 %</w:t>
             </w:r>
           </w:p>
           <w:p>
@@ -1154,7 +1154,7 @@
                 <w:sz w:val="16"/>
                 <w:szCs w:val="16"/>
               </w:rPr>
-              <w:t xml:space="preserve">des entreprises interrogées règlent des dépenses en espèces (17/22)</w:t>
+              <w:t xml:space="preserve">règlent des dépenses en espèces (18/27)</w:t>
             </w:r>
           </w:p>
         </w:tc>
@@ -1189,7 +1189,7 @@
                 <w:sz w:val="40"/>
                 <w:szCs w:val="40"/>
               </w:rPr>
-              <w:t xml:space="preserve">9 %</w:t>
+              <w:t xml:space="preserve">15 %</w:t>
             </w:r>
           </w:p>
           <w:p>
@@ -1204,7 +1204,7 @@
                 <w:sz w:val="16"/>
                 <w:szCs w:val="16"/>
               </w:rPr>
-              <w:t xml:space="preserve">ont déjà adopté des cartes professionnelles (2/22 DAF)</w:t>
+              <w:t xml:space="preserve">ont déjà adopté des cartes professionnelles (4/27)</w:t>
             </w:r>
           </w:p>
         </w:tc>
@@ -1254,7 +1254,7 @@
                 <w:sz w:val="16"/>
                 <w:szCs w:val="16"/>
               </w:rPr>
-              <w:t xml:space="preserve">se disent favorables, dont 18 % sans condition (12/22)</w:t>
+              <w:t xml:space="preserve">se disent favorables à investir, dont 18 % sans condition (12/22)</w:t>
             </w:r>
           </w:p>
         </w:tc>
@@ -1311,7 +1311,7 @@
           <w:sz w:val="21"/>
           <w:szCs w:val="21"/>
         </w:rPr>
-        <w:t xml:space="preserve"> Les espèces dominent encore (77 %), loin devant le virement (45 %) et le mobile money (32 %). Aucune entreprise ne dispose d’un dispositif structuré de cartes commerciales pilotées : on observe un assemblage de solutions partielles (cartes carburant, flottes télécom, cartes bancaires ponctuelles, plateformes internes).</w:t>
+        <w:t xml:space="preserve"> Les espèces dominent encore (67 %), devant le virement (48 %) et le mobile money (30 %). Aucune entreprise ne dispose d’un dispositif structuré de cartes commerciales pilotées : on observe un assemblage de solutions partielles (cartes carburant, flottes télécom, cartes bancaires ponctuelles, plateformes internes).</w:t>
       </w:r>
     </w:p>
     <w:p>
@@ -1364,7 +1364,7 @@
           <w:sz w:val="21"/>
           <w:szCs w:val="21"/>
         </w:rPr>
-        <w:t xml:space="preserve">Un écart de perception sépare les DAF des employés.</w:t>
+        <w:t xml:space="preserve">Le besoin n’est pas ressenti par tous.</w:t>
       </w:r>
       <w:r>
         <w:rPr>
@@ -1373,7 +1373,7 @@
           <w:sz w:val="21"/>
           <w:szCs w:val="21"/>
         </w:rPr>
-        <w:t xml:space="preserve"> La moitié des DAF et dirigeants (11/22) ne citent aucune difficulté alors que les 5 employés en signalent au moins une : le besoin est plus visible de ceux qui vivent le processus que de ceux qui le décident.</w:t>
+        <w:t xml:space="preserve"> 11 répondants sur 27 (41 %) ne citent aucune difficulté, dont 9 qui paient pourtant en espèces : ce besoin devra être révélé par le discours commercial.</w:t>
       </w:r>
     </w:p>
     <w:p>
@@ -2320,7 +2320,7 @@
           <w:sz w:val="21"/>
           <w:szCs w:val="21"/>
         </w:rPr>
-        <w:t xml:space="preserve"> (28 grandes et 32 moyennes). L’accès aux répondants passe par les gestionnaires de comptes. L’analyse est une analyse thématique qualitative, consolidée sous Microsoft Excel. Elle est complétée par un recueil auprès de professionnels de grandes entreprises (formulaire employés) et par le benchmark d’Access Bank Nigeria.</w:t>
+        <w:t xml:space="preserve"> (28 grandes et 32 moyennes). L’accès aux répondants passe par les gestionnaires de comptes. L’analyse est une analyse thématique qualitative, consolidée sous Microsoft Excel. Elle est complétée par un benchmark auprès de professionnels de grandes entreprises et par celui d’Access Bank Nigeria.</w:t>
       </w:r>
     </w:p>
     <w:p>
@@ -2510,7 +2510,7 @@
                 <w:sz w:val="18"/>
                 <w:szCs w:val="18"/>
               </w:rPr>
-              <w:t xml:space="preserve">Répondants DAF / dirigeants</w:t>
+              <w:t xml:space="preserve">Entreprises répondantes</w:t>
             </w:r>
           </w:p>
         </w:tc>
@@ -2580,7 +2580,7 @@
                 <w:sz w:val="18"/>
                 <w:szCs w:val="18"/>
               </w:rPr>
-              <w:t xml:space="preserve">22 entreprises (guide d’entretien DAF)</w:t>
+              <w:t xml:space="preserve">27 réponses (45 % de l’objectif)</w:t>
             </w:r>
           </w:p>
         </w:tc>
@@ -2621,7 +2621,7 @@
                 <w:sz w:val="18"/>
                 <w:szCs w:val="18"/>
               </w:rPr>
-              <w:t xml:space="preserve">Volet employés</w:t>
+              <w:t xml:space="preserve">Versions du formulaire</w:t>
             </w:r>
           </w:p>
         </w:tc>
@@ -2657,7 +2657,7 @@
                 <w:sz w:val="18"/>
                 <w:szCs w:val="18"/>
               </w:rPr>
-              <w:t xml:space="preserve">Formulaire employés de grandes entreprises</w:t>
+              <w:t xml:space="preserve">Guide d’entretien téléphonique</w:t>
             </w:r>
           </w:p>
         </w:tc>
@@ -2693,7 +2693,7 @@
                 <w:sz w:val="18"/>
                 <w:szCs w:val="18"/>
               </w:rPr>
-              <w:t xml:space="preserve">5 réponses (formulaire employés)</w:t>
+              <w:t xml:space="preserve">Deux versions : lot 1 (5 réponses) et lot 2 (22 réponses)</w:t>
             </w:r>
           </w:p>
         </w:tc>
@@ -2733,7 +2733,7 @@
                 <w:sz w:val="18"/>
                 <w:szCs w:val="18"/>
               </w:rPr>
-              <w:t xml:space="preserve">Total</w:t>
+              <w:t xml:space="preserve">Période</w:t>
             </w:r>
           </w:p>
         </w:tc>
@@ -2768,7 +2768,7 @@
                 <w:sz w:val="18"/>
                 <w:szCs w:val="18"/>
               </w:rPr>
-              <w:t xml:space="preserve">60</w:t>
+              <w:t xml:space="preserve">24/08/2026 au 28/09/2026</w:t>
             </w:r>
           </w:p>
         </w:tc>
@@ -2803,7 +2803,7 @@
                 <w:sz w:val="18"/>
                 <w:szCs w:val="18"/>
               </w:rPr>
-              <w:t xml:space="preserve">27 (45 % de l’objectif)</w:t>
+              <w:t xml:space="preserve">Réponses du 09/09 au 30/09/2026</w:t>
             </w:r>
           </w:p>
         </w:tc>
@@ -2844,7 +2844,7 @@
                 <w:sz w:val="18"/>
                 <w:szCs w:val="18"/>
               </w:rPr>
-              <w:t xml:space="preserve">Période</w:t>
+              <w:t xml:space="preserve">Mode de collecte</w:t>
             </w:r>
           </w:p>
         </w:tc>
@@ -2880,7 +2880,7 @@
                 <w:sz w:val="18"/>
                 <w:szCs w:val="18"/>
               </w:rPr>
-              <w:t xml:space="preserve">24/08/2026 au 28/09/2026</w:t>
+              <w:t xml:space="preserve">Entretiens téléphoniques via gestionnaires de comptes</w:t>
             </w:r>
           </w:p>
         </w:tc>
@@ -2916,7 +2916,7 @@
                 <w:sz w:val="18"/>
                 <w:szCs w:val="18"/>
               </w:rPr>
-              <w:t xml:space="preserve">Réponses du 09/09 au 30/09/2026</w:t>
+              <w:t xml:space="preserve">Formulaires en ligne renseignés en mode anonyme ; plusieurs réponses sont rédigées à la troisième personne, signe d’une saisie par l’enquêteur</w:t>
             </w:r>
           </w:p>
         </w:tc>
@@ -2956,7 +2956,7 @@
                 <w:sz w:val="18"/>
                 <w:szCs w:val="18"/>
               </w:rPr>
-              <w:t xml:space="preserve">Mode de collecte</w:t>
+              <w:t xml:space="preserve">Taille des entreprises</w:t>
             </w:r>
           </w:p>
         </w:tc>
@@ -2991,7 +2991,7 @@
                 <w:sz w:val="18"/>
                 <w:szCs w:val="18"/>
               </w:rPr>
-              <w:t xml:space="preserve">Entretiens téléphoniques via gestionnaires de comptes</w:t>
+              <w:t xml:space="preserve">Segments GE / ME identifiés</w:t>
             </w:r>
           </w:p>
         </w:tc>
@@ -3004,119 +3004,6 @@
               <w:bottom w:val="single" w:color="BFBFBF" w:sz="4"/>
               <w:right w:val="single" w:color="BFBFBF" w:sz="4"/>
             </w:tcBorders>
-            <w:tcMar>
-              <w:top w:type="dxa" w:w="60"/>
-              <w:left w:type="dxa" w:w="90"/>
-              <w:bottom w:type="dxa" w:w="60"/>
-              <w:right w:type="dxa" w:w="90"/>
-            </w:tcMar>
-            <w:vAlign w:val="center"/>
-          </w:tcPr>
-          <w:p>
-            <w:pPr>
-              <w:spacing w:after="30" w:line="250"/>
-              <w:jc w:val="left"/>
-            </w:pPr>
-            <w:r>
-              <w:rPr>
-                <w:rFonts w:ascii="Cambria" w:cs="Cambria" w:eastAsia="Cambria" w:hAnsi="Cambria"/>
-                <w:b w:val="false"/>
-                <w:bCs w:val="false"/>
-                <w:color w:val="3A3A3A"/>
-                <w:sz w:val="18"/>
-                <w:szCs w:val="18"/>
-              </w:rPr>
-              <w:t xml:space="preserve">Formulaires en ligne renseignés en mode anonyme ; plusieurs réponses sont rédigées à la troisième personne, signe d’une saisie par l’enquêteur</w:t>
-            </w:r>
-          </w:p>
-        </w:tc>
-      </w:tr>
-      <w:tr>
-        <w:trPr>
-          <w:cantSplit/>
-        </w:trPr>
-        <w:tc>
-          <w:tcPr>
-            <w:tcW w:type="dxa" w:w="2300"/>
-            <w:tcBorders>
-              <w:top w:val="single" w:color="BFBFBF" w:sz="4"/>
-              <w:left w:val="single" w:color="BFBFBF" w:sz="4"/>
-              <w:bottom w:val="single" w:color="BFBFBF" w:sz="4"/>
-              <w:right w:val="single" w:color="BFBFBF" w:sz="4"/>
-            </w:tcBorders>
-            <w:shd w:fill="F2F2F2" w:color="auto" w:val="clear"/>
-            <w:tcMar>
-              <w:top w:type="dxa" w:w="60"/>
-              <w:left w:type="dxa" w:w="90"/>
-              <w:bottom w:type="dxa" w:w="60"/>
-              <w:right w:type="dxa" w:w="90"/>
-            </w:tcMar>
-            <w:vAlign w:val="center"/>
-          </w:tcPr>
-          <w:p>
-            <w:pPr>
-              <w:spacing w:after="30" w:line="250"/>
-              <w:jc w:val="left"/>
-            </w:pPr>
-            <w:r>
-              <w:rPr>
-                <w:rFonts w:ascii="Cambria" w:cs="Cambria" w:eastAsia="Cambria" w:hAnsi="Cambria"/>
-                <w:b/>
-                <w:bCs/>
-                <w:color w:val="3A3A3A"/>
-                <w:sz w:val="18"/>
-                <w:szCs w:val="18"/>
-              </w:rPr>
-              <w:t xml:space="preserve">Taille des entreprises</w:t>
-            </w:r>
-          </w:p>
-        </w:tc>
-        <w:tc>
-          <w:tcPr>
-            <w:tcW w:type="dxa" w:w="3200"/>
-            <w:tcBorders>
-              <w:top w:val="single" w:color="BFBFBF" w:sz="4"/>
-              <w:left w:val="single" w:color="BFBFBF" w:sz="4"/>
-              <w:bottom w:val="single" w:color="BFBFBF" w:sz="4"/>
-              <w:right w:val="single" w:color="BFBFBF" w:sz="4"/>
-            </w:tcBorders>
-            <w:shd w:fill="F2F2F2" w:color="auto" w:val="clear"/>
-            <w:tcMar>
-              <w:top w:type="dxa" w:w="60"/>
-              <w:left w:type="dxa" w:w="90"/>
-              <w:bottom w:type="dxa" w:w="60"/>
-              <w:right w:type="dxa" w:w="90"/>
-            </w:tcMar>
-            <w:vAlign w:val="center"/>
-          </w:tcPr>
-          <w:p>
-            <w:pPr>
-              <w:spacing w:after="30" w:line="250"/>
-              <w:jc w:val="left"/>
-            </w:pPr>
-            <w:r>
-              <w:rPr>
-                <w:rFonts w:ascii="Cambria" w:cs="Cambria" w:eastAsia="Cambria" w:hAnsi="Cambria"/>
-                <w:b w:val="false"/>
-                <w:bCs w:val="false"/>
-                <w:color w:val="3A3A3A"/>
-                <w:sz w:val="18"/>
-                <w:szCs w:val="18"/>
-              </w:rPr>
-              <w:t xml:space="preserve">Segments GE / ME identifiés</w:t>
-            </w:r>
-          </w:p>
-        </w:tc>
-        <w:tc>
-          <w:tcPr>
-            <w:tcW w:type="dxa" w:w="4138"/>
-            <w:tcBorders>
-              <w:top w:val="single" w:color="BFBFBF" w:sz="4"/>
-              <w:left w:val="single" w:color="BFBFBF" w:sz="4"/>
-              <w:bottom w:val="single" w:color="BFBFBF" w:sz="4"/>
-              <w:right w:val="single" w:color="BFBFBF" w:sz="4"/>
-            </w:tcBorders>
-            <w:shd w:fill="F2F2F2" w:color="auto" w:val="clear"/>
             <w:tcMar>
               <w:top w:type="dxa" w:w="60"/>
               <w:left w:type="dxa" w:w="90"/>
@@ -3183,7 +3070,7 @@
           <w:sz w:val="21"/>
           <w:szCs w:val="21"/>
         </w:rPr>
-        <w:t xml:space="preserve">Deux formulaires ont été utilisés, avec un tronc commun (identification, mécanismes de gestion par catégorie de dépenses, adoption des cartes professionnelles, difficultés rencontrées) :</w:t>
+        <w:t xml:space="preserve">Deux versions du formulaire ont été utilisées, avec un tronc commun (identification, mécanismes de gestion par catégorie de dépenses, adoption des cartes professionnelles, difficultés rencontrées) :</w:t>
       </w:r>
     </w:p>
     <w:p>
@@ -3205,7 +3092,7 @@
           <w:sz w:val="21"/>
           <w:szCs w:val="21"/>
         </w:rPr>
-        <w:t xml:space="preserve">Guide DAF / dirigeants (22 réponses)</w:t>
+        <w:t xml:space="preserve">Lot 2 (22 réponses)</w:t>
       </w:r>
       <w:r>
         <w:rPr>
@@ -3256,7 +3143,7 @@
           <w:sz w:val="21"/>
           <w:szCs w:val="21"/>
         </w:rPr>
-        <w:t xml:space="preserve">Formulaire employés (5 réponses)</w:t>
+        <w:t xml:space="preserve">Lot 1 (5 réponses)</w:t>
       </w:r>
       <w:r>
         <w:rPr>
@@ -3265,7 +3152,7 @@
           <w:sz w:val="21"/>
           <w:szCs w:val="21"/>
         </w:rPr>
-        <w:t xml:space="preserve"> : ajoute la raison principale de l’adoption ou de la non-adoption de cartes professionnelles.</w:t>
+        <w:t xml:space="preserve"> : ajoute la raison principale de l’adoption ou de la non-adoption de cartes professionnelles, sans question sur la disposition à investir.</w:t>
       </w:r>
     </w:p>
     <w:p>
@@ -3662,7 +3549,7 @@
                 <w:sz w:val="18"/>
                 <w:szCs w:val="18"/>
               </w:rPr>
-              <w:t xml:space="preserve">Questions du guide sur les bénéfices attendus, la valeur d’une plateforme connectée à la comptabilité et les critères de décision absentes des fichiers</w:t>
+              <w:t xml:space="preserve">Questions du guide d’entretien sur les bénéfices attendus, la valeur d’une plateforme connectée à la comptabilité et les critères de décision absentes des fichiers</w:t>
             </w:r>
           </w:p>
         </w:tc>
@@ -3734,7 +3621,7 @@
                 <w:sz w:val="18"/>
                 <w:szCs w:val="18"/>
               </w:rPr>
-              <w:t xml:space="preserve">Réponses courtes, enquête anonyme (pas de code client)</w:t>
+              <w:t xml:space="preserve">Deux versions du formulaire : la disposition à investir n’a été posée qu’à 22 répondants sur 27</w:t>
             </w:r>
           </w:p>
         </w:tc>
@@ -3767,7 +3654,7 @@
                 <w:sz w:val="18"/>
                 <w:szCs w:val="18"/>
               </w:rPr>
-              <w:t xml:space="preserve">Pas de croisement avec le segment ni les encours du portefeuille</w:t>
+              <w:t xml:space="preserve">Intentions mesurées sur 22 réponses uniquement</w:t>
             </w:r>
           </w:p>
         </w:tc>
@@ -3806,6 +3693,78 @@
                 <w:sz w:val="18"/>
                 <w:szCs w:val="18"/>
               </w:rPr>
+              <w:t xml:space="preserve">Réponses courtes, enquête anonyme (pas de code client)</w:t>
+            </w:r>
+          </w:p>
+        </w:tc>
+        <w:tc>
+          <w:tcPr>
+            <w:tcW w:type="dxa" w:w="4938"/>
+            <w:tcBorders>
+              <w:top w:val="single" w:color="BFBFBF" w:sz="4"/>
+              <w:left w:val="single" w:color="BFBFBF" w:sz="4"/>
+              <w:bottom w:val="single" w:color="BFBFBF" w:sz="4"/>
+              <w:right w:val="single" w:color="BFBFBF" w:sz="4"/>
+            </w:tcBorders>
+            <w:shd w:fill="F2F2F2" w:color="auto" w:val="clear"/>
+            <w:tcMar>
+              <w:top w:type="dxa" w:w="60"/>
+              <w:left w:type="dxa" w:w="90"/>
+              <w:bottom w:type="dxa" w:w="60"/>
+              <w:right w:type="dxa" w:w="90"/>
+            </w:tcMar>
+            <w:vAlign w:val="center"/>
+          </w:tcPr>
+          <w:p>
+            <w:pPr>
+              <w:spacing w:after="30" w:line="250"/>
+              <w:jc w:val="left"/>
+            </w:pPr>
+            <w:r>
+              <w:rPr>
+                <w:rFonts w:ascii="Cambria" w:cs="Cambria" w:eastAsia="Cambria" w:hAnsi="Cambria"/>
+                <w:color w:val="3A3A3A"/>
+                <w:sz w:val="18"/>
+                <w:szCs w:val="18"/>
+              </w:rPr>
+              <w:t xml:space="preserve">Pas de croisement avec le segment ni les encours du portefeuille</w:t>
+            </w:r>
+          </w:p>
+        </w:tc>
+      </w:tr>
+      <w:tr>
+        <w:trPr>
+          <w:cantSplit/>
+        </w:trPr>
+        <w:tc>
+          <w:tcPr>
+            <w:tcW w:type="dxa" w:w="4700"/>
+            <w:tcBorders>
+              <w:top w:val="single" w:color="BFBFBF" w:sz="4"/>
+              <w:left w:val="single" w:color="BFBFBF" w:sz="4"/>
+              <w:bottom w:val="single" w:color="BFBFBF" w:sz="4"/>
+              <w:right w:val="single" w:color="BFBFBF" w:sz="4"/>
+            </w:tcBorders>
+            <w:tcMar>
+              <w:top w:type="dxa" w:w="60"/>
+              <w:left w:type="dxa" w:w="90"/>
+              <w:bottom w:type="dxa" w:w="60"/>
+              <w:right w:type="dxa" w:w="90"/>
+            </w:tcMar>
+            <w:vAlign w:val="center"/>
+          </w:tcPr>
+          <w:p>
+            <w:pPr>
+              <w:spacing w:after="30" w:line="250"/>
+              <w:jc w:val="left"/>
+            </w:pPr>
+            <w:r>
+              <w:rPr>
+                <w:rFonts w:ascii="Cambria" w:cs="Cambria" w:eastAsia="Cambria" w:hAnsi="Cambria"/>
+                <w:color w:val="3A3A3A"/>
+                <w:sz w:val="18"/>
+                <w:szCs w:val="18"/>
+              </w:rPr>
               <w:t xml:space="preserve">Pas de seuils de décision définis dans le protocole</w:t>
             </w:r>
           </w:p>
@@ -3819,7 +3778,6 @@
               <w:bottom w:val="single" w:color="BFBFBF" w:sz="4"/>
               <w:right w:val="single" w:color="BFBFBF" w:sz="4"/>
             </w:tcBorders>
-            <w:shd w:fill="F2F2F2" w:color="auto" w:val="clear"/>
             <w:tcMar>
               <w:top w:type="dxa" w:w="60"/>
               <w:left w:type="dxa" w:w="90"/>
@@ -3878,7 +3836,7 @@
           <w:sz w:val="21"/>
           <w:szCs w:val="21"/>
         </w:rPr>
-        <w:t xml:space="preserve">Les 27 répondants se répartissent entre 22 DAF ou dirigeants et 5 employés. Vingt sont des entreprises locales et sept des filiales de groupes. Les secteurs sont variés ; le BTP et l’ingénierie (7), l’agriculture et l’agro-industrie (4), les télécommunications et technologies (4) sont les plus représentés.</w:t>
+        <w:t xml:space="preserve">Les 27 entreprises répondantes comptent vingt entreprises locales et sept filiales de groupes. Les secteurs sont variés ; le BTP et l’ingénierie (7), l’agriculture et l’agro-industrie (4), les télécommunications et technologies (4) sont les plus représentés.</w:t>
       </w:r>
     </w:p>
     <w:tbl>
@@ -3894,10 +3852,9 @@
         </w:tblBorders>
       </w:tblPr>
       <w:tblGrid>
-        <w:gridCol w:w="4638"/>
-        <w:gridCol w:w="1800"/>
-        <w:gridCol w:w="1600"/>
-        <w:gridCol w:w="1600"/>
+        <w:gridCol w:w="5238"/>
+        <w:gridCol w:w="2400"/>
+        <w:gridCol w:w="2000"/>
       </w:tblGrid>
       <w:tr>
         <w:trPr>
@@ -3906,7 +3863,7 @@
         </w:trPr>
         <w:tc>
           <w:tcPr>
-            <w:tcW w:type="dxa" w:w="4638"/>
+            <w:tcW w:type="dxa" w:w="5238"/>
             <w:tcBorders>
               <w:top w:val="single" w:color="BFBFBF" w:sz="4"/>
               <w:left w:val="single" w:color="BFBFBF" w:sz="4"/>
@@ -3942,7 +3899,7 @@
         </w:tc>
         <w:tc>
           <w:tcPr>
-            <w:tcW w:type="dxa" w:w="1800"/>
+            <w:tcW w:type="dxa" w:w="2400"/>
             <w:tcBorders>
               <w:top w:val="single" w:color="BFBFBF" w:sz="4"/>
               <w:left w:val="single" w:color="BFBFBF" w:sz="4"/>
@@ -3972,13 +3929,13 @@
                 <w:sz w:val="18"/>
                 <w:szCs w:val="18"/>
               </w:rPr>
-              <w:t xml:space="preserve">DAF / dirigeants</w:t>
-            </w:r>
-          </w:p>
-        </w:tc>
-        <w:tc>
-          <w:tcPr>
-            <w:tcW w:type="dxa" w:w="1600"/>
+              <w:t xml:space="preserve">Nombre d’entreprises</w:t>
+            </w:r>
+          </w:p>
+        </w:tc>
+        <w:tc>
+          <w:tcPr>
+            <w:tcW w:type="dxa" w:w="2000"/>
             <w:tcBorders>
               <w:top w:val="single" w:color="BFBFBF" w:sz="4"/>
               <w:left w:val="single" w:color="BFBFBF" w:sz="4"/>
@@ -4008,43 +3965,7 @@
                 <w:sz w:val="18"/>
                 <w:szCs w:val="18"/>
               </w:rPr>
-              <w:t xml:space="preserve">Employés</w:t>
-            </w:r>
-          </w:p>
-        </w:tc>
-        <w:tc>
-          <w:tcPr>
-            <w:tcW w:type="dxa" w:w="1600"/>
-            <w:tcBorders>
-              <w:top w:val="single" w:color="BFBFBF" w:sz="4"/>
-              <w:left w:val="single" w:color="BFBFBF" w:sz="4"/>
-              <w:bottom w:val="single" w:color="BFBFBF" w:sz="4"/>
-              <w:right w:val="single" w:color="BFBFBF" w:sz="4"/>
-            </w:tcBorders>
-            <w:shd w:fill="C00000" w:color="auto" w:val="clear"/>
-            <w:tcMar>
-              <w:top w:type="dxa" w:w="60"/>
-              <w:left w:type="dxa" w:w="90"/>
-              <w:bottom w:type="dxa" w:w="60"/>
-              <w:right w:type="dxa" w:w="90"/>
-            </w:tcMar>
-            <w:vAlign w:val="center"/>
-          </w:tcPr>
-          <w:p>
-            <w:pPr>
-              <w:spacing w:after="30" w:line="250"/>
-              <w:jc w:val="center"/>
-            </w:pPr>
-            <w:r>
-              <w:rPr>
-                <w:rFonts w:ascii="Cambria" w:cs="Cambria" w:eastAsia="Cambria" w:hAnsi="Cambria"/>
-                <w:b/>
-                <w:bCs/>
-                <w:color w:val="FFFFFF"/>
-                <w:sz w:val="18"/>
-                <w:szCs w:val="18"/>
-              </w:rPr>
-              <w:t xml:space="preserve">Total</w:t>
+              <w:t xml:space="preserve">Part</w:t>
             </w:r>
           </w:p>
         </w:tc>
@@ -4055,7 +3976,7 @@
         </w:trPr>
         <w:tc>
           <w:tcPr>
-            <w:tcW w:type="dxa" w:w="4638"/>
+            <w:tcW w:type="dxa" w:w="5238"/>
             <w:tcBorders>
               <w:top w:val="single" w:color="BFBFBF" w:sz="4"/>
               <w:left w:val="single" w:color="BFBFBF" w:sz="4"/>
@@ -4088,7 +4009,7 @@
         </w:tc>
         <w:tc>
           <w:tcPr>
-            <w:tcW w:type="dxa" w:w="1800"/>
+            <w:tcW w:type="dxa" w:w="2400"/>
             <w:tcBorders>
               <w:top w:val="single" w:color="BFBFBF" w:sz="4"/>
               <w:left w:val="single" w:color="BFBFBF" w:sz="4"/>
@@ -4115,13 +4036,13 @@
                 <w:sz w:val="18"/>
                 <w:szCs w:val="18"/>
               </w:rPr>
-              <w:t xml:space="preserve">5</w:t>
-            </w:r>
-          </w:p>
-        </w:tc>
-        <w:tc>
-          <w:tcPr>
-            <w:tcW w:type="dxa" w:w="1600"/>
+              <w:t xml:space="preserve">7</w:t>
+            </w:r>
+          </w:p>
+        </w:tc>
+        <w:tc>
+          <w:tcPr>
+            <w:tcW w:type="dxa" w:w="2000"/>
             <w:tcBorders>
               <w:top w:val="single" w:color="BFBFBF" w:sz="4"/>
               <w:left w:val="single" w:color="BFBFBF" w:sz="4"/>
@@ -4148,40 +4069,7 @@
                 <w:sz w:val="18"/>
                 <w:szCs w:val="18"/>
               </w:rPr>
-              <w:t xml:space="preserve">2</w:t>
-            </w:r>
-          </w:p>
-        </w:tc>
-        <w:tc>
-          <w:tcPr>
-            <w:tcW w:type="dxa" w:w="1600"/>
-            <w:tcBorders>
-              <w:top w:val="single" w:color="BFBFBF" w:sz="4"/>
-              <w:left w:val="single" w:color="BFBFBF" w:sz="4"/>
-              <w:bottom w:val="single" w:color="BFBFBF" w:sz="4"/>
-              <w:right w:val="single" w:color="BFBFBF" w:sz="4"/>
-            </w:tcBorders>
-            <w:tcMar>
-              <w:top w:type="dxa" w:w="60"/>
-              <w:left w:type="dxa" w:w="90"/>
-              <w:bottom w:type="dxa" w:w="60"/>
-              <w:right w:type="dxa" w:w="90"/>
-            </w:tcMar>
-            <w:vAlign w:val="center"/>
-          </w:tcPr>
-          <w:p>
-            <w:pPr>
-              <w:spacing w:after="30" w:line="250"/>
-              <w:jc w:val="center"/>
-            </w:pPr>
-            <w:r>
-              <w:rPr>
-                <w:rFonts w:ascii="Cambria" w:cs="Cambria" w:eastAsia="Cambria" w:hAnsi="Cambria"/>
-                <w:color w:val="3A3A3A"/>
-                <w:sz w:val="18"/>
-                <w:szCs w:val="18"/>
-              </w:rPr>
-              <w:t xml:space="preserve">7</w:t>
+              <w:t xml:space="preserve">26 %</w:t>
             </w:r>
           </w:p>
         </w:tc>
@@ -4192,7 +4080,7 @@
         </w:trPr>
         <w:tc>
           <w:tcPr>
-            <w:tcW w:type="dxa" w:w="4638"/>
+            <w:tcW w:type="dxa" w:w="5238"/>
             <w:tcBorders>
               <w:top w:val="single" w:color="BFBFBF" w:sz="4"/>
               <w:left w:val="single" w:color="BFBFBF" w:sz="4"/>
@@ -4226,7 +4114,7 @@
         </w:tc>
         <w:tc>
           <w:tcPr>
-            <w:tcW w:type="dxa" w:w="1800"/>
+            <w:tcW w:type="dxa" w:w="2400"/>
             <w:tcBorders>
               <w:top w:val="single" w:color="BFBFBF" w:sz="4"/>
               <w:left w:val="single" w:color="BFBFBF" w:sz="4"/>
@@ -4260,7 +4148,7 @@
         </w:tc>
         <w:tc>
           <w:tcPr>
-            <w:tcW w:type="dxa" w:w="1600"/>
+            <w:tcW w:type="dxa" w:w="2000"/>
             <w:tcBorders>
               <w:top w:val="single" w:color="BFBFBF" w:sz="4"/>
               <w:left w:val="single" w:color="BFBFBF" w:sz="4"/>
@@ -4288,41 +4176,7 @@
                 <w:sz w:val="18"/>
                 <w:szCs w:val="18"/>
               </w:rPr>
-              <w:t xml:space="preserve">–</w:t>
-            </w:r>
-          </w:p>
-        </w:tc>
-        <w:tc>
-          <w:tcPr>
-            <w:tcW w:type="dxa" w:w="1600"/>
-            <w:tcBorders>
-              <w:top w:val="single" w:color="BFBFBF" w:sz="4"/>
-              <w:left w:val="single" w:color="BFBFBF" w:sz="4"/>
-              <w:bottom w:val="single" w:color="BFBFBF" w:sz="4"/>
-              <w:right w:val="single" w:color="BFBFBF" w:sz="4"/>
-            </w:tcBorders>
-            <w:shd w:fill="F2F2F2" w:color="auto" w:val="clear"/>
-            <w:tcMar>
-              <w:top w:type="dxa" w:w="60"/>
-              <w:left w:type="dxa" w:w="90"/>
-              <w:bottom w:type="dxa" w:w="60"/>
-              <w:right w:type="dxa" w:w="90"/>
-            </w:tcMar>
-            <w:vAlign w:val="center"/>
-          </w:tcPr>
-          <w:p>
-            <w:pPr>
-              <w:spacing w:after="30" w:line="250"/>
-              <w:jc w:val="center"/>
-            </w:pPr>
-            <w:r>
-              <w:rPr>
-                <w:rFonts w:ascii="Cambria" w:cs="Cambria" w:eastAsia="Cambria" w:hAnsi="Cambria"/>
-                <w:color w:val="3A3A3A"/>
-                <w:sz w:val="18"/>
-                <w:szCs w:val="18"/>
-              </w:rPr>
-              <w:t xml:space="preserve">4</w:t>
+              <w:t xml:space="preserve">15 %</w:t>
             </w:r>
           </w:p>
         </w:tc>
@@ -4333,7 +4187,7 @@
         </w:trPr>
         <w:tc>
           <w:tcPr>
-            <w:tcW w:type="dxa" w:w="4638"/>
+            <w:tcW w:type="dxa" w:w="5238"/>
             <w:tcBorders>
               <w:top w:val="single" w:color="BFBFBF" w:sz="4"/>
               <w:left w:val="single" w:color="BFBFBF" w:sz="4"/>
@@ -4366,7 +4220,7 @@
         </w:tc>
         <w:tc>
           <w:tcPr>
-            <w:tcW w:type="dxa" w:w="1800"/>
+            <w:tcW w:type="dxa" w:w="2400"/>
             <w:tcBorders>
               <w:top w:val="single" w:color="BFBFBF" w:sz="4"/>
               <w:left w:val="single" w:color="BFBFBF" w:sz="4"/>
@@ -4399,7 +4253,7 @@
         </w:tc>
         <w:tc>
           <w:tcPr>
-            <w:tcW w:type="dxa" w:w="1600"/>
+            <w:tcW w:type="dxa" w:w="2000"/>
             <w:tcBorders>
               <w:top w:val="single" w:color="BFBFBF" w:sz="4"/>
               <w:left w:val="single" w:color="BFBFBF" w:sz="4"/>
@@ -4426,40 +4280,7 @@
                 <w:sz w:val="18"/>
                 <w:szCs w:val="18"/>
               </w:rPr>
-              <w:t xml:space="preserve">–</w:t>
-            </w:r>
-          </w:p>
-        </w:tc>
-        <w:tc>
-          <w:tcPr>
-            <w:tcW w:type="dxa" w:w="1600"/>
-            <w:tcBorders>
-              <w:top w:val="single" w:color="BFBFBF" w:sz="4"/>
-              <w:left w:val="single" w:color="BFBFBF" w:sz="4"/>
-              <w:bottom w:val="single" w:color="BFBFBF" w:sz="4"/>
-              <w:right w:val="single" w:color="BFBFBF" w:sz="4"/>
-            </w:tcBorders>
-            <w:tcMar>
-              <w:top w:type="dxa" w:w="60"/>
-              <w:left w:type="dxa" w:w="90"/>
-              <w:bottom w:type="dxa" w:w="60"/>
-              <w:right w:type="dxa" w:w="90"/>
-            </w:tcMar>
-            <w:vAlign w:val="center"/>
-          </w:tcPr>
-          <w:p>
-            <w:pPr>
-              <w:spacing w:after="30" w:line="250"/>
-              <w:jc w:val="center"/>
-            </w:pPr>
-            <w:r>
-              <w:rPr>
-                <w:rFonts w:ascii="Cambria" w:cs="Cambria" w:eastAsia="Cambria" w:hAnsi="Cambria"/>
-                <w:color w:val="3A3A3A"/>
-                <w:sz w:val="18"/>
-                <w:szCs w:val="18"/>
-              </w:rPr>
-              <w:t xml:space="preserve">4</w:t>
+              <w:t xml:space="preserve">15 %</w:t>
             </w:r>
           </w:p>
         </w:tc>
@@ -4470,7 +4291,7 @@
         </w:trPr>
         <w:tc>
           <w:tcPr>
-            <w:tcW w:type="dxa" w:w="4638"/>
+            <w:tcW w:type="dxa" w:w="5238"/>
             <w:tcBorders>
               <w:top w:val="single" w:color="BFBFBF" w:sz="4"/>
               <w:left w:val="single" w:color="BFBFBF" w:sz="4"/>
@@ -4504,7 +4325,7 @@
         </w:tc>
         <w:tc>
           <w:tcPr>
-            <w:tcW w:type="dxa" w:w="1800"/>
+            <w:tcW w:type="dxa" w:w="2400"/>
             <w:tcBorders>
               <w:top w:val="single" w:color="BFBFBF" w:sz="4"/>
               <w:left w:val="single" w:color="BFBFBF" w:sz="4"/>
@@ -4538,7 +4359,7 @@
         </w:tc>
         <w:tc>
           <w:tcPr>
-            <w:tcW w:type="dxa" w:w="1600"/>
+            <w:tcW w:type="dxa" w:w="2000"/>
             <w:tcBorders>
               <w:top w:val="single" w:color="BFBFBF" w:sz="4"/>
               <w:left w:val="single" w:color="BFBFBF" w:sz="4"/>
@@ -4566,41 +4387,7 @@
                 <w:sz w:val="18"/>
                 <w:szCs w:val="18"/>
               </w:rPr>
-              <w:t xml:space="preserve">–</w:t>
-            </w:r>
-          </w:p>
-        </w:tc>
-        <w:tc>
-          <w:tcPr>
-            <w:tcW w:type="dxa" w:w="1600"/>
-            <w:tcBorders>
-              <w:top w:val="single" w:color="BFBFBF" w:sz="4"/>
-              <w:left w:val="single" w:color="BFBFBF" w:sz="4"/>
-              <w:bottom w:val="single" w:color="BFBFBF" w:sz="4"/>
-              <w:right w:val="single" w:color="BFBFBF" w:sz="4"/>
-            </w:tcBorders>
-            <w:shd w:fill="F2F2F2" w:color="auto" w:val="clear"/>
-            <w:tcMar>
-              <w:top w:type="dxa" w:w="60"/>
-              <w:left w:type="dxa" w:w="90"/>
-              <w:bottom w:type="dxa" w:w="60"/>
-              <w:right w:type="dxa" w:w="90"/>
-            </w:tcMar>
-            <w:vAlign w:val="center"/>
-          </w:tcPr>
-          <w:p>
-            <w:pPr>
-              <w:spacing w:after="30" w:line="250"/>
-              <w:jc w:val="center"/>
-            </w:pPr>
-            <w:r>
-              <w:rPr>
-                <w:rFonts w:ascii="Cambria" w:cs="Cambria" w:eastAsia="Cambria" w:hAnsi="Cambria"/>
-                <w:color w:val="3A3A3A"/>
-                <w:sz w:val="18"/>
-                <w:szCs w:val="18"/>
-              </w:rPr>
-              <w:t xml:space="preserve">2</w:t>
+              <w:t xml:space="preserve">7 %</w:t>
             </w:r>
           </w:p>
         </w:tc>
@@ -4611,7 +4398,7 @@
         </w:trPr>
         <w:tc>
           <w:tcPr>
-            <w:tcW w:type="dxa" w:w="4638"/>
+            <w:tcW w:type="dxa" w:w="5238"/>
             <w:tcBorders>
               <w:top w:val="single" w:color="BFBFBF" w:sz="4"/>
               <w:left w:val="single" w:color="BFBFBF" w:sz="4"/>
@@ -4644,7 +4431,7 @@
         </w:tc>
         <w:tc>
           <w:tcPr>
-            <w:tcW w:type="dxa" w:w="1800"/>
+            <w:tcW w:type="dxa" w:w="2400"/>
             <w:tcBorders>
               <w:top w:val="single" w:color="BFBFBF" w:sz="4"/>
               <w:left w:val="single" w:color="BFBFBF" w:sz="4"/>
@@ -4677,7 +4464,7 @@
         </w:tc>
         <w:tc>
           <w:tcPr>
-            <w:tcW w:type="dxa" w:w="1600"/>
+            <w:tcW w:type="dxa" w:w="2000"/>
             <w:tcBorders>
               <w:top w:val="single" w:color="BFBFBF" w:sz="4"/>
               <w:left w:val="single" w:color="BFBFBF" w:sz="4"/>
@@ -4704,40 +4491,7 @@
                 <w:sz w:val="18"/>
                 <w:szCs w:val="18"/>
               </w:rPr>
-              <w:t xml:space="preserve">–</w:t>
-            </w:r>
-          </w:p>
-        </w:tc>
-        <w:tc>
-          <w:tcPr>
-            <w:tcW w:type="dxa" w:w="1600"/>
-            <w:tcBorders>
-              <w:top w:val="single" w:color="BFBFBF" w:sz="4"/>
-              <w:left w:val="single" w:color="BFBFBF" w:sz="4"/>
-              <w:bottom w:val="single" w:color="BFBFBF" w:sz="4"/>
-              <w:right w:val="single" w:color="BFBFBF" w:sz="4"/>
-            </w:tcBorders>
-            <w:tcMar>
-              <w:top w:type="dxa" w:w="60"/>
-              <w:left w:type="dxa" w:w="90"/>
-              <w:bottom w:type="dxa" w:w="60"/>
-              <w:right w:type="dxa" w:w="90"/>
-            </w:tcMar>
-            <w:vAlign w:val="center"/>
-          </w:tcPr>
-          <w:p>
-            <w:pPr>
-              <w:spacing w:after="30" w:line="250"/>
-              <w:jc w:val="center"/>
-            </w:pPr>
-            <w:r>
-              <w:rPr>
-                <w:rFonts w:ascii="Cambria" w:cs="Cambria" w:eastAsia="Cambria" w:hAnsi="Cambria"/>
-                <w:color w:val="3A3A3A"/>
-                <w:sz w:val="18"/>
-                <w:szCs w:val="18"/>
-              </w:rPr>
-              <w:t xml:space="preserve">2</w:t>
+              <w:t xml:space="preserve">7 %</w:t>
             </w:r>
           </w:p>
         </w:tc>
@@ -4748,7 +4502,7 @@
         </w:trPr>
         <w:tc>
           <w:tcPr>
-            <w:tcW w:type="dxa" w:w="4638"/>
+            <w:tcW w:type="dxa" w:w="5238"/>
             <w:tcBorders>
               <w:top w:val="single" w:color="BFBFBF" w:sz="4"/>
               <w:left w:val="single" w:color="BFBFBF" w:sz="4"/>
@@ -4782,7 +4536,7 @@
         </w:tc>
         <w:tc>
           <w:tcPr>
-            <w:tcW w:type="dxa" w:w="1800"/>
+            <w:tcW w:type="dxa" w:w="2400"/>
             <w:tcBorders>
               <w:top w:val="single" w:color="BFBFBF" w:sz="4"/>
               <w:left w:val="single" w:color="BFBFBF" w:sz="4"/>
@@ -4810,13 +4564,13 @@
                 <w:sz w:val="18"/>
                 <w:szCs w:val="18"/>
               </w:rPr>
-              <w:t xml:space="preserve">1</w:t>
-            </w:r>
-          </w:p>
-        </w:tc>
-        <w:tc>
-          <w:tcPr>
-            <w:tcW w:type="dxa" w:w="1600"/>
+              <w:t xml:space="preserve">2</w:t>
+            </w:r>
+          </w:p>
+        </w:tc>
+        <w:tc>
+          <w:tcPr>
+            <w:tcW w:type="dxa" w:w="2000"/>
             <w:tcBorders>
               <w:top w:val="single" w:color="BFBFBF" w:sz="4"/>
               <w:left w:val="single" w:color="BFBFBF" w:sz="4"/>
@@ -4844,41 +4598,7 @@
                 <w:sz w:val="18"/>
                 <w:szCs w:val="18"/>
               </w:rPr>
-              <w:t xml:space="preserve">1</w:t>
-            </w:r>
-          </w:p>
-        </w:tc>
-        <w:tc>
-          <w:tcPr>
-            <w:tcW w:type="dxa" w:w="1600"/>
-            <w:tcBorders>
-              <w:top w:val="single" w:color="BFBFBF" w:sz="4"/>
-              <w:left w:val="single" w:color="BFBFBF" w:sz="4"/>
-              <w:bottom w:val="single" w:color="BFBFBF" w:sz="4"/>
-              <w:right w:val="single" w:color="BFBFBF" w:sz="4"/>
-            </w:tcBorders>
-            <w:shd w:fill="F2F2F2" w:color="auto" w:val="clear"/>
-            <w:tcMar>
-              <w:top w:type="dxa" w:w="60"/>
-              <w:left w:type="dxa" w:w="90"/>
-              <w:bottom w:type="dxa" w:w="60"/>
-              <w:right w:type="dxa" w:w="90"/>
-            </w:tcMar>
-            <w:vAlign w:val="center"/>
-          </w:tcPr>
-          <w:p>
-            <w:pPr>
-              <w:spacing w:after="30" w:line="250"/>
-              <w:jc w:val="center"/>
-            </w:pPr>
-            <w:r>
-              <w:rPr>
-                <w:rFonts w:ascii="Cambria" w:cs="Cambria" w:eastAsia="Cambria" w:hAnsi="Cambria"/>
-                <w:color w:val="3A3A3A"/>
-                <w:sz w:val="18"/>
-                <w:szCs w:val="18"/>
-              </w:rPr>
-              <w:t xml:space="preserve">2</w:t>
+              <w:t xml:space="preserve">7 %</w:t>
             </w:r>
           </w:p>
         </w:tc>
@@ -4889,40 +4609,40 @@
         </w:trPr>
         <w:tc>
           <w:tcPr>
-            <w:tcW w:type="dxa" w:w="4638"/>
-            <w:tcBorders>
-              <w:top w:val="single" w:color="BFBFBF" w:sz="4"/>
-              <w:left w:val="single" w:color="BFBFBF" w:sz="4"/>
-              <w:bottom w:val="single" w:color="BFBFBF" w:sz="4"/>
-              <w:right w:val="single" w:color="BFBFBF" w:sz="4"/>
-            </w:tcBorders>
-            <w:tcMar>
-              <w:top w:type="dxa" w:w="60"/>
-              <w:left w:type="dxa" w:w="90"/>
-              <w:bottom w:type="dxa" w:w="60"/>
-              <w:right w:type="dxa" w:w="90"/>
-            </w:tcMar>
-            <w:vAlign w:val="center"/>
-          </w:tcPr>
-          <w:p>
-            <w:pPr>
-              <w:spacing w:after="30" w:line="250"/>
-              <w:jc w:val="left"/>
-            </w:pPr>
-            <w:r>
-              <w:rPr>
-                <w:rFonts w:ascii="Cambria" w:cs="Cambria" w:eastAsia="Cambria" w:hAnsi="Cambria"/>
-                <w:color w:val="3A3A3A"/>
-                <w:sz w:val="18"/>
-                <w:szCs w:val="18"/>
-              </w:rPr>
-              <w:t xml:space="preserve">Commerce</w:t>
-            </w:r>
-          </w:p>
-        </w:tc>
-        <w:tc>
-          <w:tcPr>
-            <w:tcW w:type="dxa" w:w="1800"/>
+            <w:tcW w:type="dxa" w:w="5238"/>
+            <w:tcBorders>
+              <w:top w:val="single" w:color="BFBFBF" w:sz="4"/>
+              <w:left w:val="single" w:color="BFBFBF" w:sz="4"/>
+              <w:bottom w:val="single" w:color="BFBFBF" w:sz="4"/>
+              <w:right w:val="single" w:color="BFBFBF" w:sz="4"/>
+            </w:tcBorders>
+            <w:tcMar>
+              <w:top w:type="dxa" w:w="60"/>
+              <w:left w:type="dxa" w:w="90"/>
+              <w:bottom w:type="dxa" w:w="60"/>
+              <w:right w:type="dxa" w:w="90"/>
+            </w:tcMar>
+            <w:vAlign w:val="center"/>
+          </w:tcPr>
+          <w:p>
+            <w:pPr>
+              <w:spacing w:after="30" w:line="250"/>
+              <w:jc w:val="left"/>
+            </w:pPr>
+            <w:r>
+              <w:rPr>
+                <w:rFonts w:ascii="Cambria" w:cs="Cambria" w:eastAsia="Cambria" w:hAnsi="Cambria"/>
+                <w:color w:val="3A3A3A"/>
+                <w:sz w:val="18"/>
+                <w:szCs w:val="18"/>
+              </w:rPr>
+              <w:t xml:space="preserve">Études, mécanique</w:t>
+            </w:r>
+          </w:p>
+        </w:tc>
+        <w:tc>
+          <w:tcPr>
+            <w:tcW w:type="dxa" w:w="2400"/>
             <w:tcBorders>
               <w:top w:val="single" w:color="BFBFBF" w:sz="4"/>
               <w:left w:val="single" w:color="BFBFBF" w:sz="4"/>
@@ -4949,13 +4669,13 @@
                 <w:sz w:val="18"/>
                 <w:szCs w:val="18"/>
               </w:rPr>
-              <w:t xml:space="preserve">1</w:t>
-            </w:r>
-          </w:p>
-        </w:tc>
-        <w:tc>
-          <w:tcPr>
-            <w:tcW w:type="dxa" w:w="1600"/>
+              <w:t xml:space="preserve">2</w:t>
+            </w:r>
+          </w:p>
+        </w:tc>
+        <w:tc>
+          <w:tcPr>
+            <w:tcW w:type="dxa" w:w="2000"/>
             <w:tcBorders>
               <w:top w:val="single" w:color="BFBFBF" w:sz="4"/>
               <w:left w:val="single" w:color="BFBFBF" w:sz="4"/>
@@ -4982,40 +4702,7 @@
                 <w:sz w:val="18"/>
                 <w:szCs w:val="18"/>
               </w:rPr>
-              <w:t xml:space="preserve">–</w:t>
-            </w:r>
-          </w:p>
-        </w:tc>
-        <w:tc>
-          <w:tcPr>
-            <w:tcW w:type="dxa" w:w="1600"/>
-            <w:tcBorders>
-              <w:top w:val="single" w:color="BFBFBF" w:sz="4"/>
-              <w:left w:val="single" w:color="BFBFBF" w:sz="4"/>
-              <w:bottom w:val="single" w:color="BFBFBF" w:sz="4"/>
-              <w:right w:val="single" w:color="BFBFBF" w:sz="4"/>
-            </w:tcBorders>
-            <w:tcMar>
-              <w:top w:type="dxa" w:w="60"/>
-              <w:left w:type="dxa" w:w="90"/>
-              <w:bottom w:type="dxa" w:w="60"/>
-              <w:right w:type="dxa" w:w="90"/>
-            </w:tcMar>
-            <w:vAlign w:val="center"/>
-          </w:tcPr>
-          <w:p>
-            <w:pPr>
-              <w:spacing w:after="30" w:line="250"/>
-              <w:jc w:val="center"/>
-            </w:pPr>
-            <w:r>
-              <w:rPr>
-                <w:rFonts w:ascii="Cambria" w:cs="Cambria" w:eastAsia="Cambria" w:hAnsi="Cambria"/>
-                <w:color w:val="3A3A3A"/>
-                <w:sz w:val="18"/>
-                <w:szCs w:val="18"/>
-              </w:rPr>
-              <w:t xml:space="preserve">1</w:t>
+              <w:t xml:space="preserve">7 %</w:t>
             </w:r>
           </w:p>
         </w:tc>
@@ -5026,41 +4713,41 @@
         </w:trPr>
         <w:tc>
           <w:tcPr>
-            <w:tcW w:type="dxa" w:w="4638"/>
-            <w:tcBorders>
-              <w:top w:val="single" w:color="BFBFBF" w:sz="4"/>
-              <w:left w:val="single" w:color="BFBFBF" w:sz="4"/>
-              <w:bottom w:val="single" w:color="BFBFBF" w:sz="4"/>
-              <w:right w:val="single" w:color="BFBFBF" w:sz="4"/>
-            </w:tcBorders>
-            <w:shd w:fill="F2F2F2" w:color="auto" w:val="clear"/>
-            <w:tcMar>
-              <w:top w:type="dxa" w:w="60"/>
-              <w:left w:type="dxa" w:w="90"/>
-              <w:bottom w:type="dxa" w:w="60"/>
-              <w:right w:type="dxa" w:w="90"/>
-            </w:tcMar>
-            <w:vAlign w:val="center"/>
-          </w:tcPr>
-          <w:p>
-            <w:pPr>
-              <w:spacing w:after="30" w:line="250"/>
-              <w:jc w:val="left"/>
-            </w:pPr>
-            <w:r>
-              <w:rPr>
-                <w:rFonts w:ascii="Cambria" w:cs="Cambria" w:eastAsia="Cambria" w:hAnsi="Cambria"/>
-                <w:color w:val="3A3A3A"/>
-                <w:sz w:val="18"/>
-                <w:szCs w:val="18"/>
-              </w:rPr>
-              <w:t xml:space="preserve">Microfinance</w:t>
-            </w:r>
-          </w:p>
-        </w:tc>
-        <w:tc>
-          <w:tcPr>
-            <w:tcW w:type="dxa" w:w="1800"/>
+            <w:tcW w:type="dxa" w:w="5238"/>
+            <w:tcBorders>
+              <w:top w:val="single" w:color="BFBFBF" w:sz="4"/>
+              <w:left w:val="single" w:color="BFBFBF" w:sz="4"/>
+              <w:bottom w:val="single" w:color="BFBFBF" w:sz="4"/>
+              <w:right w:val="single" w:color="BFBFBF" w:sz="4"/>
+            </w:tcBorders>
+            <w:shd w:fill="F2F2F2" w:color="auto" w:val="clear"/>
+            <w:tcMar>
+              <w:top w:type="dxa" w:w="60"/>
+              <w:left w:type="dxa" w:w="90"/>
+              <w:bottom w:type="dxa" w:w="60"/>
+              <w:right w:type="dxa" w:w="90"/>
+            </w:tcMar>
+            <w:vAlign w:val="center"/>
+          </w:tcPr>
+          <w:p>
+            <w:pPr>
+              <w:spacing w:after="30" w:line="250"/>
+              <w:jc w:val="left"/>
+            </w:pPr>
+            <w:r>
+              <w:rPr>
+                <w:rFonts w:ascii="Cambria" w:cs="Cambria" w:eastAsia="Cambria" w:hAnsi="Cambria"/>
+                <w:color w:val="3A3A3A"/>
+                <w:sz w:val="18"/>
+                <w:szCs w:val="18"/>
+              </w:rPr>
+              <w:t xml:space="preserve">Commerce</w:t>
+            </w:r>
+          </w:p>
+        </w:tc>
+        <w:tc>
+          <w:tcPr>
+            <w:tcW w:type="dxa" w:w="2400"/>
             <w:tcBorders>
               <w:top w:val="single" w:color="BFBFBF" w:sz="4"/>
               <w:left w:val="single" w:color="BFBFBF" w:sz="4"/>
@@ -5094,7 +4781,7 @@
         </w:tc>
         <w:tc>
           <w:tcPr>
-            <w:tcW w:type="dxa" w:w="1600"/>
+            <w:tcW w:type="dxa" w:w="2000"/>
             <w:tcBorders>
               <w:top w:val="single" w:color="BFBFBF" w:sz="4"/>
               <w:left w:val="single" w:color="BFBFBF" w:sz="4"/>
@@ -5122,41 +4809,7 @@
                 <w:sz w:val="18"/>
                 <w:szCs w:val="18"/>
               </w:rPr>
-              <w:t xml:space="preserve">–</w:t>
-            </w:r>
-          </w:p>
-        </w:tc>
-        <w:tc>
-          <w:tcPr>
-            <w:tcW w:type="dxa" w:w="1600"/>
-            <w:tcBorders>
-              <w:top w:val="single" w:color="BFBFBF" w:sz="4"/>
-              <w:left w:val="single" w:color="BFBFBF" w:sz="4"/>
-              <w:bottom w:val="single" w:color="BFBFBF" w:sz="4"/>
-              <w:right w:val="single" w:color="BFBFBF" w:sz="4"/>
-            </w:tcBorders>
-            <w:shd w:fill="F2F2F2" w:color="auto" w:val="clear"/>
-            <w:tcMar>
-              <w:top w:type="dxa" w:w="60"/>
-              <w:left w:type="dxa" w:w="90"/>
-              <w:bottom w:type="dxa" w:w="60"/>
-              <w:right w:type="dxa" w:w="90"/>
-            </w:tcMar>
-            <w:vAlign w:val="center"/>
-          </w:tcPr>
-          <w:p>
-            <w:pPr>
-              <w:spacing w:after="30" w:line="250"/>
-              <w:jc w:val="center"/>
-            </w:pPr>
-            <w:r>
-              <w:rPr>
-                <w:rFonts w:ascii="Cambria" w:cs="Cambria" w:eastAsia="Cambria" w:hAnsi="Cambria"/>
-                <w:color w:val="3A3A3A"/>
-                <w:sz w:val="18"/>
-                <w:szCs w:val="18"/>
-              </w:rPr>
-              <w:t xml:space="preserve">1</w:t>
+              <w:t xml:space="preserve">4 %</w:t>
             </w:r>
           </w:p>
         </w:tc>
@@ -5167,40 +4820,40 @@
         </w:trPr>
         <w:tc>
           <w:tcPr>
-            <w:tcW w:type="dxa" w:w="4638"/>
-            <w:tcBorders>
-              <w:top w:val="single" w:color="BFBFBF" w:sz="4"/>
-              <w:left w:val="single" w:color="BFBFBF" w:sz="4"/>
-              <w:bottom w:val="single" w:color="BFBFBF" w:sz="4"/>
-              <w:right w:val="single" w:color="BFBFBF" w:sz="4"/>
-            </w:tcBorders>
-            <w:tcMar>
-              <w:top w:type="dxa" w:w="60"/>
-              <w:left w:type="dxa" w:w="90"/>
-              <w:bottom w:type="dxa" w:w="60"/>
-              <w:right w:type="dxa" w:w="90"/>
-            </w:tcMar>
-            <w:vAlign w:val="center"/>
-          </w:tcPr>
-          <w:p>
-            <w:pPr>
-              <w:spacing w:after="30" w:line="250"/>
-              <w:jc w:val="left"/>
-            </w:pPr>
-            <w:r>
-              <w:rPr>
-                <w:rFonts w:ascii="Cambria" w:cs="Cambria" w:eastAsia="Cambria" w:hAnsi="Cambria"/>
-                <w:color w:val="3A3A3A"/>
-                <w:sz w:val="18"/>
-                <w:szCs w:val="18"/>
-              </w:rPr>
-              <w:t xml:space="preserve">Éducation et formation</w:t>
-            </w:r>
-          </w:p>
-        </w:tc>
-        <w:tc>
-          <w:tcPr>
-            <w:tcW w:type="dxa" w:w="1800"/>
+            <w:tcW w:type="dxa" w:w="5238"/>
+            <w:tcBorders>
+              <w:top w:val="single" w:color="BFBFBF" w:sz="4"/>
+              <w:left w:val="single" w:color="BFBFBF" w:sz="4"/>
+              <w:bottom w:val="single" w:color="BFBFBF" w:sz="4"/>
+              <w:right w:val="single" w:color="BFBFBF" w:sz="4"/>
+            </w:tcBorders>
+            <w:tcMar>
+              <w:top w:type="dxa" w:w="60"/>
+              <w:left w:type="dxa" w:w="90"/>
+              <w:bottom w:type="dxa" w:w="60"/>
+              <w:right w:type="dxa" w:w="90"/>
+            </w:tcMar>
+            <w:vAlign w:val="center"/>
+          </w:tcPr>
+          <w:p>
+            <w:pPr>
+              <w:spacing w:after="30" w:line="250"/>
+              <w:jc w:val="left"/>
+            </w:pPr>
+            <w:r>
+              <w:rPr>
+                <w:rFonts w:ascii="Cambria" w:cs="Cambria" w:eastAsia="Cambria" w:hAnsi="Cambria"/>
+                <w:color w:val="3A3A3A"/>
+                <w:sz w:val="18"/>
+                <w:szCs w:val="18"/>
+              </w:rPr>
+              <w:t xml:space="preserve">Microfinance</w:t>
+            </w:r>
+          </w:p>
+        </w:tc>
+        <w:tc>
+          <w:tcPr>
+            <w:tcW w:type="dxa" w:w="2400"/>
             <w:tcBorders>
               <w:top w:val="single" w:color="BFBFBF" w:sz="4"/>
               <w:left w:val="single" w:color="BFBFBF" w:sz="4"/>
@@ -5233,7 +4886,7 @@
         </w:tc>
         <w:tc>
           <w:tcPr>
-            <w:tcW w:type="dxa" w:w="1600"/>
+            <w:tcW w:type="dxa" w:w="2000"/>
             <w:tcBorders>
               <w:top w:val="single" w:color="BFBFBF" w:sz="4"/>
               <w:left w:val="single" w:color="BFBFBF" w:sz="4"/>
@@ -5260,40 +4913,7 @@
                 <w:sz w:val="18"/>
                 <w:szCs w:val="18"/>
               </w:rPr>
-              <w:t xml:space="preserve">–</w:t>
-            </w:r>
-          </w:p>
-        </w:tc>
-        <w:tc>
-          <w:tcPr>
-            <w:tcW w:type="dxa" w:w="1600"/>
-            <w:tcBorders>
-              <w:top w:val="single" w:color="BFBFBF" w:sz="4"/>
-              <w:left w:val="single" w:color="BFBFBF" w:sz="4"/>
-              <w:bottom w:val="single" w:color="BFBFBF" w:sz="4"/>
-              <w:right w:val="single" w:color="BFBFBF" w:sz="4"/>
-            </w:tcBorders>
-            <w:tcMar>
-              <w:top w:type="dxa" w:w="60"/>
-              <w:left w:type="dxa" w:w="90"/>
-              <w:bottom w:type="dxa" w:w="60"/>
-              <w:right w:type="dxa" w:w="90"/>
-            </w:tcMar>
-            <w:vAlign w:val="center"/>
-          </w:tcPr>
-          <w:p>
-            <w:pPr>
-              <w:spacing w:after="30" w:line="250"/>
-              <w:jc w:val="center"/>
-            </w:pPr>
-            <w:r>
-              <w:rPr>
-                <w:rFonts w:ascii="Cambria" w:cs="Cambria" w:eastAsia="Cambria" w:hAnsi="Cambria"/>
-                <w:color w:val="3A3A3A"/>
-                <w:sz w:val="18"/>
-                <w:szCs w:val="18"/>
-              </w:rPr>
-              <w:t xml:space="preserve">1</w:t>
+              <w:t xml:space="preserve">4 %</w:t>
             </w:r>
           </w:p>
         </w:tc>
@@ -5304,41 +4924,41 @@
         </w:trPr>
         <w:tc>
           <w:tcPr>
-            <w:tcW w:type="dxa" w:w="4638"/>
-            <w:tcBorders>
-              <w:top w:val="single" w:color="BFBFBF" w:sz="4"/>
-              <w:left w:val="single" w:color="BFBFBF" w:sz="4"/>
-              <w:bottom w:val="single" w:color="BFBFBF" w:sz="4"/>
-              <w:right w:val="single" w:color="BFBFBF" w:sz="4"/>
-            </w:tcBorders>
-            <w:shd w:fill="F2F2F2" w:color="auto" w:val="clear"/>
-            <w:tcMar>
-              <w:top w:type="dxa" w:w="60"/>
-              <w:left w:type="dxa" w:w="90"/>
-              <w:bottom w:type="dxa" w:w="60"/>
-              <w:right w:type="dxa" w:w="90"/>
-            </w:tcMar>
-            <w:vAlign w:val="center"/>
-          </w:tcPr>
-          <w:p>
-            <w:pPr>
-              <w:spacing w:after="30" w:line="250"/>
-              <w:jc w:val="left"/>
-            </w:pPr>
-            <w:r>
-              <w:rPr>
-                <w:rFonts w:ascii="Cambria" w:cs="Cambria" w:eastAsia="Cambria" w:hAnsi="Cambria"/>
-                <w:color w:val="3A3A3A"/>
-                <w:sz w:val="18"/>
-                <w:szCs w:val="18"/>
-              </w:rPr>
-              <w:t xml:space="preserve">Industrie et transformation</w:t>
-            </w:r>
-          </w:p>
-        </w:tc>
-        <w:tc>
-          <w:tcPr>
-            <w:tcW w:type="dxa" w:w="1800"/>
+            <w:tcW w:type="dxa" w:w="5238"/>
+            <w:tcBorders>
+              <w:top w:val="single" w:color="BFBFBF" w:sz="4"/>
+              <w:left w:val="single" w:color="BFBFBF" w:sz="4"/>
+              <w:bottom w:val="single" w:color="BFBFBF" w:sz="4"/>
+              <w:right w:val="single" w:color="BFBFBF" w:sz="4"/>
+            </w:tcBorders>
+            <w:shd w:fill="F2F2F2" w:color="auto" w:val="clear"/>
+            <w:tcMar>
+              <w:top w:type="dxa" w:w="60"/>
+              <w:left w:type="dxa" w:w="90"/>
+              <w:bottom w:type="dxa" w:w="60"/>
+              <w:right w:type="dxa" w:w="90"/>
+            </w:tcMar>
+            <w:vAlign w:val="center"/>
+          </w:tcPr>
+          <w:p>
+            <w:pPr>
+              <w:spacing w:after="30" w:line="250"/>
+              <w:jc w:val="left"/>
+            </w:pPr>
+            <w:r>
+              <w:rPr>
+                <w:rFonts w:ascii="Cambria" w:cs="Cambria" w:eastAsia="Cambria" w:hAnsi="Cambria"/>
+                <w:color w:val="3A3A3A"/>
+                <w:sz w:val="18"/>
+                <w:szCs w:val="18"/>
+              </w:rPr>
+              <w:t xml:space="preserve">Éducation et formation</w:t>
+            </w:r>
+          </w:p>
+        </w:tc>
+        <w:tc>
+          <w:tcPr>
+            <w:tcW w:type="dxa" w:w="2400"/>
             <w:tcBorders>
               <w:top w:val="single" w:color="BFBFBF" w:sz="4"/>
               <w:left w:val="single" w:color="BFBFBF" w:sz="4"/>
@@ -5372,7 +4992,7 @@
         </w:tc>
         <w:tc>
           <w:tcPr>
-            <w:tcW w:type="dxa" w:w="1600"/>
+            <w:tcW w:type="dxa" w:w="2000"/>
             <w:tcBorders>
               <w:top w:val="single" w:color="BFBFBF" w:sz="4"/>
               <w:left w:val="single" w:color="BFBFBF" w:sz="4"/>
@@ -5400,41 +5020,7 @@
                 <w:sz w:val="18"/>
                 <w:szCs w:val="18"/>
               </w:rPr>
-              <w:t xml:space="preserve">–</w:t>
-            </w:r>
-          </w:p>
-        </w:tc>
-        <w:tc>
-          <w:tcPr>
-            <w:tcW w:type="dxa" w:w="1600"/>
-            <w:tcBorders>
-              <w:top w:val="single" w:color="BFBFBF" w:sz="4"/>
-              <w:left w:val="single" w:color="BFBFBF" w:sz="4"/>
-              <w:bottom w:val="single" w:color="BFBFBF" w:sz="4"/>
-              <w:right w:val="single" w:color="BFBFBF" w:sz="4"/>
-            </w:tcBorders>
-            <w:shd w:fill="F2F2F2" w:color="auto" w:val="clear"/>
-            <w:tcMar>
-              <w:top w:type="dxa" w:w="60"/>
-              <w:left w:type="dxa" w:w="90"/>
-              <w:bottom w:type="dxa" w:w="60"/>
-              <w:right w:type="dxa" w:w="90"/>
-            </w:tcMar>
-            <w:vAlign w:val="center"/>
-          </w:tcPr>
-          <w:p>
-            <w:pPr>
-              <w:spacing w:after="30" w:line="250"/>
-              <w:jc w:val="center"/>
-            </w:pPr>
-            <w:r>
-              <w:rPr>
-                <w:rFonts w:ascii="Cambria" w:cs="Cambria" w:eastAsia="Cambria" w:hAnsi="Cambria"/>
-                <w:color w:val="3A3A3A"/>
-                <w:sz w:val="18"/>
-                <w:szCs w:val="18"/>
-              </w:rPr>
-              <w:t xml:space="preserve">1</w:t>
+              <w:t xml:space="preserve">4 %</w:t>
             </w:r>
           </w:p>
         </w:tc>
@@ -5445,40 +5031,40 @@
         </w:trPr>
         <w:tc>
           <w:tcPr>
-            <w:tcW w:type="dxa" w:w="4638"/>
-            <w:tcBorders>
-              <w:top w:val="single" w:color="BFBFBF" w:sz="4"/>
-              <w:left w:val="single" w:color="BFBFBF" w:sz="4"/>
-              <w:bottom w:val="single" w:color="BFBFBF" w:sz="4"/>
-              <w:right w:val="single" w:color="BFBFBF" w:sz="4"/>
-            </w:tcBorders>
-            <w:tcMar>
-              <w:top w:type="dxa" w:w="60"/>
-              <w:left w:type="dxa" w:w="90"/>
-              <w:bottom w:type="dxa" w:w="60"/>
-              <w:right w:type="dxa" w:w="90"/>
-            </w:tcMar>
-            <w:vAlign w:val="center"/>
-          </w:tcPr>
-          <w:p>
-            <w:pPr>
-              <w:spacing w:after="30" w:line="250"/>
-              <w:jc w:val="left"/>
-            </w:pPr>
-            <w:r>
-              <w:rPr>
-                <w:rFonts w:ascii="Cambria" w:cs="Cambria" w:eastAsia="Cambria" w:hAnsi="Cambria"/>
-                <w:color w:val="3A3A3A"/>
-                <w:sz w:val="18"/>
-                <w:szCs w:val="18"/>
-              </w:rPr>
-              <w:t xml:space="preserve">Études, mécanique</w:t>
-            </w:r>
-          </w:p>
-        </w:tc>
-        <w:tc>
-          <w:tcPr>
-            <w:tcW w:type="dxa" w:w="1800"/>
+            <w:tcW w:type="dxa" w:w="5238"/>
+            <w:tcBorders>
+              <w:top w:val="single" w:color="BFBFBF" w:sz="4"/>
+              <w:left w:val="single" w:color="BFBFBF" w:sz="4"/>
+              <w:bottom w:val="single" w:color="BFBFBF" w:sz="4"/>
+              <w:right w:val="single" w:color="BFBFBF" w:sz="4"/>
+            </w:tcBorders>
+            <w:tcMar>
+              <w:top w:type="dxa" w:w="60"/>
+              <w:left w:type="dxa" w:w="90"/>
+              <w:bottom w:type="dxa" w:w="60"/>
+              <w:right w:type="dxa" w:w="90"/>
+            </w:tcMar>
+            <w:vAlign w:val="center"/>
+          </w:tcPr>
+          <w:p>
+            <w:pPr>
+              <w:spacing w:after="30" w:line="250"/>
+              <w:jc w:val="left"/>
+            </w:pPr>
+            <w:r>
+              <w:rPr>
+                <w:rFonts w:ascii="Cambria" w:cs="Cambria" w:eastAsia="Cambria" w:hAnsi="Cambria"/>
+                <w:color w:val="3A3A3A"/>
+                <w:sz w:val="18"/>
+                <w:szCs w:val="18"/>
+              </w:rPr>
+              <w:t xml:space="preserve">Industrie et transformation</w:t>
+            </w:r>
+          </w:p>
+        </w:tc>
+        <w:tc>
+          <w:tcPr>
+            <w:tcW w:type="dxa" w:w="2400"/>
             <w:tcBorders>
               <w:top w:val="single" w:color="BFBFBF" w:sz="4"/>
               <w:left w:val="single" w:color="BFBFBF" w:sz="4"/>
@@ -5505,13 +5091,13 @@
                 <w:sz w:val="18"/>
                 <w:szCs w:val="18"/>
               </w:rPr>
-              <w:t xml:space="preserve">–</w:t>
-            </w:r>
-          </w:p>
-        </w:tc>
-        <w:tc>
-          <w:tcPr>
-            <w:tcW w:type="dxa" w:w="1600"/>
+              <w:t xml:space="preserve">1</w:t>
+            </w:r>
+          </w:p>
+        </w:tc>
+        <w:tc>
+          <w:tcPr>
+            <w:tcW w:type="dxa" w:w="2000"/>
             <w:tcBorders>
               <w:top w:val="single" w:color="BFBFBF" w:sz="4"/>
               <w:left w:val="single" w:color="BFBFBF" w:sz="4"/>
@@ -5538,40 +5124,7 @@
                 <w:sz w:val="18"/>
                 <w:szCs w:val="18"/>
               </w:rPr>
-              <w:t xml:space="preserve">2</w:t>
-            </w:r>
-          </w:p>
-        </w:tc>
-        <w:tc>
-          <w:tcPr>
-            <w:tcW w:type="dxa" w:w="1600"/>
-            <w:tcBorders>
-              <w:top w:val="single" w:color="BFBFBF" w:sz="4"/>
-              <w:left w:val="single" w:color="BFBFBF" w:sz="4"/>
-              <w:bottom w:val="single" w:color="BFBFBF" w:sz="4"/>
-              <w:right w:val="single" w:color="BFBFBF" w:sz="4"/>
-            </w:tcBorders>
-            <w:tcMar>
-              <w:top w:type="dxa" w:w="60"/>
-              <w:left w:type="dxa" w:w="90"/>
-              <w:bottom w:type="dxa" w:w="60"/>
-              <w:right w:type="dxa" w:w="90"/>
-            </w:tcMar>
-            <w:vAlign w:val="center"/>
-          </w:tcPr>
-          <w:p>
-            <w:pPr>
-              <w:spacing w:after="30" w:line="250"/>
-              <w:jc w:val="center"/>
-            </w:pPr>
-            <w:r>
-              <w:rPr>
-                <w:rFonts w:ascii="Cambria" w:cs="Cambria" w:eastAsia="Cambria" w:hAnsi="Cambria"/>
-                <w:color w:val="3A3A3A"/>
-                <w:sz w:val="18"/>
-                <w:szCs w:val="18"/>
-              </w:rPr>
-              <w:t xml:space="preserve">2</w:t>
+              <w:t xml:space="preserve">4 %</w:t>
             </w:r>
           </w:p>
         </w:tc>
@@ -5582,7 +5135,7 @@
         </w:trPr>
         <w:tc>
           <w:tcPr>
-            <w:tcW w:type="dxa" w:w="4638"/>
+            <w:tcW w:type="dxa" w:w="5238"/>
             <w:tcBorders>
               <w:top w:val="single" w:color="BFBFBF" w:sz="4"/>
               <w:left w:val="single" w:color="BFBFBF" w:sz="4"/>
@@ -5618,7 +5171,7 @@
         </w:tc>
         <w:tc>
           <w:tcPr>
-            <w:tcW w:type="dxa" w:w="1800"/>
+            <w:tcW w:type="dxa" w:w="2400"/>
             <w:tcBorders>
               <w:top w:val="single" w:color="BFBFBF" w:sz="4"/>
               <w:left w:val="single" w:color="BFBFBF" w:sz="4"/>
@@ -5648,13 +5201,13 @@
                 <w:sz w:val="18"/>
                 <w:szCs w:val="18"/>
               </w:rPr>
-              <w:t xml:space="preserve">22</w:t>
-            </w:r>
-          </w:p>
-        </w:tc>
-        <w:tc>
-          <w:tcPr>
-            <w:tcW w:type="dxa" w:w="1600"/>
+              <w:t xml:space="preserve">27</w:t>
+            </w:r>
+          </w:p>
+        </w:tc>
+        <w:tc>
+          <w:tcPr>
+            <w:tcW w:type="dxa" w:w="2000"/>
             <w:tcBorders>
               <w:top w:val="single" w:color="BFBFBF" w:sz="4"/>
               <w:left w:val="single" w:color="BFBFBF" w:sz="4"/>
@@ -5684,43 +5237,7 @@
                 <w:sz w:val="18"/>
                 <w:szCs w:val="18"/>
               </w:rPr>
-              <w:t xml:space="preserve">5</w:t>
-            </w:r>
-          </w:p>
-        </w:tc>
-        <w:tc>
-          <w:tcPr>
-            <w:tcW w:type="dxa" w:w="1600"/>
-            <w:tcBorders>
-              <w:top w:val="single" w:color="BFBFBF" w:sz="4"/>
-              <w:left w:val="single" w:color="BFBFBF" w:sz="4"/>
-              <w:bottom w:val="single" w:color="BFBFBF" w:sz="4"/>
-              <w:right w:val="single" w:color="BFBFBF" w:sz="4"/>
-            </w:tcBorders>
-            <w:shd w:fill="F2F2F2" w:color="auto" w:val="clear"/>
-            <w:tcMar>
-              <w:top w:type="dxa" w:w="60"/>
-              <w:left w:type="dxa" w:w="90"/>
-              <w:bottom w:type="dxa" w:w="60"/>
-              <w:right w:type="dxa" w:w="90"/>
-            </w:tcMar>
-            <w:vAlign w:val="center"/>
-          </w:tcPr>
-          <w:p>
-            <w:pPr>
-              <w:spacing w:after="30" w:line="250"/>
-              <w:jc w:val="center"/>
-            </w:pPr>
-            <w:r>
-              <w:rPr>
-                <w:rFonts w:ascii="Cambria" w:cs="Cambria" w:eastAsia="Cambria" w:hAnsi="Cambria"/>
-                <w:b/>
-                <w:bCs/>
-                <w:color w:val="3A3A3A"/>
-                <w:sz w:val="18"/>
-                <w:szCs w:val="18"/>
-              </w:rPr>
-              <w:t xml:space="preserve">27</w:t>
+              <w:t xml:space="preserve">100 %</w:t>
             </w:r>
           </w:p>
         </w:tc>
@@ -5881,7 +5398,7 @@
           <w:sz w:val="21"/>
           <w:szCs w:val="21"/>
         </w:rPr>
-        <w:t xml:space="preserve">Les 22 DAF et dirigeants ont décrit les mécanismes utilisés pour les frais de mission et déplacements, les frais de représentation et de communication, les abonnements et licences et les autres dépenses. </w:t>
+        <w:t xml:space="preserve">Les 27 entreprises ont décrit les mécanismes utilisés pour les frais de mission et déplacements, les frais de représentation et de communication, les abonnements et licences et les autres dépenses. </w:t>
       </w:r>
       <w:r>
         <w:rPr>
@@ -5892,7 +5409,7 @@
           <w:sz w:val="21"/>
           <w:szCs w:val="21"/>
         </w:rPr>
-        <w:t xml:space="preserve">Les espèces sont le mécanisme le plus répandu : 17 entreprises sur 22 (77 %) y recourent pour au moins un poste</w:t>
+        <w:t xml:space="preserve">Les espèces sont le mécanisme le plus répandu : 18 entreprises sur 27 (67 %) y recourent pour au moins un poste</w:t>
       </w:r>
       <w:r>
         <w:rPr>
@@ -5987,7 +5504,7 @@
           <w:sz w:val="21"/>
           <w:szCs w:val="21"/>
         </w:rPr>
-        <w:t xml:space="preserve">Virement bancaire (10/22)</w:t>
+        <w:t xml:space="preserve">Virement bancaire (13/27)</w:t>
       </w:r>
       <w:r>
         <w:rPr>
@@ -6018,7 +5535,7 @@
           <w:sz w:val="21"/>
           <w:szCs w:val="21"/>
         </w:rPr>
-        <w:t xml:space="preserve">Mobile money (7/22)</w:t>
+        <w:t xml:space="preserve">Mobile money (8/27)</w:t>
       </w:r>
       <w:r>
         <w:rPr>
@@ -6027,7 +5544,7 @@
           <w:sz w:val="21"/>
           <w:szCs w:val="21"/>
         </w:rPr>
-        <w:t xml:space="preserve"> : Orange Money et MTN MoMo sont utilisés pour les petits règlements, notamment dans les petites structures.</w:t>
+        <w:t xml:space="preserve"> : Orange Money, MTN MoMo ou paiement mobile servent aux petits règlements, notamment dans les petites structures.</w:t>
       </w:r>
     </w:p>
     <w:p>
@@ -6049,7 +5566,7 @@
           <w:sz w:val="21"/>
           <w:szCs w:val="21"/>
         </w:rPr>
-        <w:t xml:space="preserve">Flottes télécom (7/22)</w:t>
+        <w:t xml:space="preserve">Flottes télécom (7/27)</w:t>
       </w:r>
       <w:r>
         <w:rPr>
@@ -6080,7 +5597,7 @@
           <w:sz w:val="21"/>
           <w:szCs w:val="21"/>
         </w:rPr>
-        <w:t xml:space="preserve">Cartes (7/22)</w:t>
+        <w:t xml:space="preserve">Cartes (10/27)</w:t>
       </w:r>
       <w:r>
         <w:rPr>
@@ -6089,7 +5606,7 @@
           <w:sz w:val="21"/>
           <w:szCs w:val="21"/>
         </w:rPr>
-        <w:t xml:space="preserve"> : cartes carburant (Total, Tradex), carte prépayée du dirigeant, carte Visa, carte UBA. Il s’agit de cartes </w:t>
+        <w:t xml:space="preserve"> : cartes carburant (Total, Tradex), cartes prépayées, carte Visa, carte UBA. Il s’agit de cartes </w:t>
       </w:r>
       <w:r>
         <w:rPr>
@@ -6140,7 +5657,7 @@
           <w:sz w:val="21"/>
           <w:szCs w:val="21"/>
         </w:rPr>
-        <w:t xml:space="preserve"> : 9 DAF sur 22 déclarent ne pas gérer ces dépenses, n’avoir aucun mécanisme dédié ou n’ont pas répondu ; cinq paient par carte et cinq par virement.</w:t>
+        <w:t xml:space="preserve"> : 10 entreprises sur 27 déclarent ne pas gérer ces dépenses, n’avoir aucun mécanisme dédié ou n’ont pas répondu ; six paient par carte et sept par virement (certaines utilisent les deux).</w:t>
       </w:r>
     </w:p>
     <w:p>
@@ -6155,7 +5672,7 @@
           <w:sz w:val="21"/>
           <w:szCs w:val="21"/>
         </w:rPr>
-        <w:t xml:space="preserve">Du côté des employés, la situation est plus structurée dans les grands groupes (plateforme interne, notes de frais, bons de commande chez TotalEnergies Marketing Cameroun) et plus informelle dans les entreprises locales (espèces ou chèque chez Nura, plateforme Intouch et virement chez Ekipafond).</w:t>
+        <w:t xml:space="preserve">Certaines entreprises disposent d’outils plus structurés (plateforme interne, notes de frais et bons de commande chez TotalEnergies Marketing Cameroun, logiciel de comptabilité chez SOFANY, budget par dépense chez EGIS Cameroun), tandis que d’autres restent informelles (espèces ou chèque chez Nura, plateforme Intouch et virement chez Ekipafond).</w:t>
       </w:r>
     </w:p>
     <w:p>
@@ -6191,7 +5708,7 @@
           <w:sz w:val="21"/>
           <w:szCs w:val="21"/>
         </w:rPr>
-        <w:t xml:space="preserve">Les difficultés citées se regroupent en quatre thèmes (réponses ouvertes codées, 27 répondants) :</w:t>
+        <w:t xml:space="preserve">Les difficultés citées se regroupent en quatre thèmes, auxquels s’ajoutent les entreprises qui n’en citent aucune (réponses ouvertes codées, 27 répondants) :</w:t>
       </w:r>
     </w:p>
     <w:tbl>
@@ -6207,10 +5724,9 @@
         </w:tblBorders>
       </w:tblPr>
       <w:tblGrid>
-        <w:gridCol w:w="2600"/>
-        <w:gridCol w:w="1300"/>
-        <w:gridCol w:w="1300"/>
-        <w:gridCol w:w="4438"/>
+        <w:gridCol w:w="3000"/>
+        <w:gridCol w:w="1500"/>
+        <w:gridCol w:w="5138"/>
       </w:tblGrid>
       <w:tr>
         <w:trPr>
@@ -6219,7 +5735,7 @@
         </w:trPr>
         <w:tc>
           <w:tcPr>
-            <w:tcW w:type="dxa" w:w="2600"/>
+            <w:tcW w:type="dxa" w:w="3000"/>
             <w:tcBorders>
               <w:top w:val="single" w:color="BFBFBF" w:sz="4"/>
               <w:left w:val="single" w:color="BFBFBF" w:sz="4"/>
@@ -6255,7 +5771,7 @@
         </w:tc>
         <w:tc>
           <w:tcPr>
-            <w:tcW w:type="dxa" w:w="1300"/>
+            <w:tcW w:type="dxa" w:w="1500"/>
             <w:tcBorders>
               <w:top w:val="single" w:color="BFBFBF" w:sz="4"/>
               <w:left w:val="single" w:color="BFBFBF" w:sz="4"/>
@@ -6285,49 +5801,13 @@
                 <w:sz w:val="18"/>
                 <w:szCs w:val="18"/>
               </w:rPr>
-              <w:t xml:space="preserve">DAF / dirigeants (n=22)</w:t>
-            </w:r>
-          </w:p>
-        </w:tc>
-        <w:tc>
-          <w:tcPr>
-            <w:tcW w:type="dxa" w:w="1300"/>
-            <w:tcBorders>
-              <w:top w:val="single" w:color="BFBFBF" w:sz="4"/>
-              <w:left w:val="single" w:color="BFBFBF" w:sz="4"/>
-              <w:bottom w:val="single" w:color="BFBFBF" w:sz="4"/>
-              <w:right w:val="single" w:color="BFBFBF" w:sz="4"/>
-            </w:tcBorders>
-            <w:shd w:fill="C00000" w:color="auto" w:val="clear"/>
-            <w:tcMar>
-              <w:top w:type="dxa" w:w="60"/>
-              <w:left w:type="dxa" w:w="90"/>
-              <w:bottom w:type="dxa" w:w="60"/>
-              <w:right w:type="dxa" w:w="90"/>
-            </w:tcMar>
-            <w:vAlign w:val="center"/>
-          </w:tcPr>
-          <w:p>
-            <w:pPr>
-              <w:spacing w:after="30" w:line="250"/>
-              <w:jc w:val="left"/>
-            </w:pPr>
-            <w:r>
-              <w:rPr>
-                <w:rFonts w:ascii="Cambria" w:cs="Cambria" w:eastAsia="Cambria" w:hAnsi="Cambria"/>
-                <w:b/>
-                <w:bCs/>
-                <w:color w:val="FFFFFF"/>
-                <w:sz w:val="18"/>
-                <w:szCs w:val="18"/>
-              </w:rPr>
-              <w:t xml:space="preserve">Employés (n=5)</w:t>
-            </w:r>
-          </w:p>
-        </w:tc>
-        <w:tc>
-          <w:tcPr>
-            <w:tcW w:type="dxa" w:w="4438"/>
+              <w:t xml:space="preserve">Entreprises (n=27)</w:t>
+            </w:r>
+          </w:p>
+        </w:tc>
+        <w:tc>
+          <w:tcPr>
+            <w:tcW w:type="dxa" w:w="5138"/>
             <w:tcBorders>
               <w:top w:val="single" w:color="BFBFBF" w:sz="4"/>
               <w:left w:val="single" w:color="BFBFBF" w:sz="4"/>
@@ -6368,7 +5848,7 @@
         </w:trPr>
         <w:tc>
           <w:tcPr>
-            <w:tcW w:type="dxa" w:w="2600"/>
+            <w:tcW w:type="dxa" w:w="3000"/>
             <w:tcBorders>
               <w:top w:val="single" w:color="BFBFBF" w:sz="4"/>
               <w:left w:val="single" w:color="BFBFBF" w:sz="4"/>
@@ -6401,73 +5881,40 @@
         </w:tc>
         <w:tc>
           <w:tcPr>
-            <w:tcW w:type="dxa" w:w="1300"/>
-            <w:tcBorders>
-              <w:top w:val="single" w:color="BFBFBF" w:sz="4"/>
-              <w:left w:val="single" w:color="BFBFBF" w:sz="4"/>
-              <w:bottom w:val="single" w:color="BFBFBF" w:sz="4"/>
-              <w:right w:val="single" w:color="BFBFBF" w:sz="4"/>
-            </w:tcBorders>
-            <w:tcMar>
-              <w:top w:type="dxa" w:w="60"/>
-              <w:left w:type="dxa" w:w="90"/>
-              <w:bottom w:type="dxa" w:w="60"/>
-              <w:right w:type="dxa" w:w="90"/>
-            </w:tcMar>
-            <w:vAlign w:val="center"/>
-          </w:tcPr>
-          <w:p>
-            <w:pPr>
-              <w:spacing w:after="30" w:line="250"/>
-              <w:jc w:val="left"/>
-            </w:pPr>
-            <w:r>
-              <w:rPr>
-                <w:rFonts w:ascii="Cambria" w:cs="Cambria" w:eastAsia="Cambria" w:hAnsi="Cambria"/>
-                <w:color w:val="3A3A3A"/>
-                <w:sz w:val="18"/>
-                <w:szCs w:val="18"/>
-              </w:rPr>
-              <w:t xml:space="preserve">6</w:t>
-            </w:r>
-          </w:p>
-        </w:tc>
-        <w:tc>
-          <w:tcPr>
-            <w:tcW w:type="dxa" w:w="1300"/>
-            <w:tcBorders>
-              <w:top w:val="single" w:color="BFBFBF" w:sz="4"/>
-              <w:left w:val="single" w:color="BFBFBF" w:sz="4"/>
-              <w:bottom w:val="single" w:color="BFBFBF" w:sz="4"/>
-              <w:right w:val="single" w:color="BFBFBF" w:sz="4"/>
-            </w:tcBorders>
-            <w:tcMar>
-              <w:top w:type="dxa" w:w="60"/>
-              <w:left w:type="dxa" w:w="90"/>
-              <w:bottom w:type="dxa" w:w="60"/>
-              <w:right w:type="dxa" w:w="90"/>
-            </w:tcMar>
-            <w:vAlign w:val="center"/>
-          </w:tcPr>
-          <w:p>
-            <w:pPr>
-              <w:spacing w:after="30" w:line="250"/>
-              <w:jc w:val="left"/>
-            </w:pPr>
-            <w:r>
-              <w:rPr>
-                <w:rFonts w:ascii="Cambria" w:cs="Cambria" w:eastAsia="Cambria" w:hAnsi="Cambria"/>
-                <w:color w:val="3A3A3A"/>
-                <w:sz w:val="18"/>
-                <w:szCs w:val="18"/>
-              </w:rPr>
-              <w:t xml:space="preserve">2</w:t>
-            </w:r>
-          </w:p>
-        </w:tc>
-        <w:tc>
-          <w:tcPr>
-            <w:tcW w:type="dxa" w:w="4438"/>
+            <w:tcW w:type="dxa" w:w="1500"/>
+            <w:tcBorders>
+              <w:top w:val="single" w:color="BFBFBF" w:sz="4"/>
+              <w:left w:val="single" w:color="BFBFBF" w:sz="4"/>
+              <w:bottom w:val="single" w:color="BFBFBF" w:sz="4"/>
+              <w:right w:val="single" w:color="BFBFBF" w:sz="4"/>
+            </w:tcBorders>
+            <w:tcMar>
+              <w:top w:type="dxa" w:w="60"/>
+              <w:left w:type="dxa" w:w="90"/>
+              <w:bottom w:type="dxa" w:w="60"/>
+              <w:right w:type="dxa" w:w="90"/>
+            </w:tcMar>
+            <w:vAlign w:val="center"/>
+          </w:tcPr>
+          <w:p>
+            <w:pPr>
+              <w:spacing w:after="30" w:line="250"/>
+              <w:jc w:val="left"/>
+            </w:pPr>
+            <w:r>
+              <w:rPr>
+                <w:rFonts w:ascii="Cambria" w:cs="Cambria" w:eastAsia="Cambria" w:hAnsi="Cambria"/>
+                <w:color w:val="3A3A3A"/>
+                <w:sz w:val="18"/>
+                <w:szCs w:val="18"/>
+              </w:rPr>
+              <w:t xml:space="preserve">8 (30 %)</w:t>
+            </w:r>
+          </w:p>
+        </w:tc>
+        <w:tc>
+          <w:tcPr>
+            <w:tcW w:type="dxa" w:w="5138"/>
             <w:tcBorders>
               <w:top w:val="single" w:color="BFBFBF" w:sz="4"/>
               <w:left w:val="single" w:color="BFBFBF" w:sz="4"/>
@@ -6505,7 +5952,7 @@
         </w:trPr>
         <w:tc>
           <w:tcPr>
-            <w:tcW w:type="dxa" w:w="2600"/>
+            <w:tcW w:type="dxa" w:w="3000"/>
             <w:tcBorders>
               <w:top w:val="single" w:color="BFBFBF" w:sz="4"/>
               <w:left w:val="single" w:color="BFBFBF" w:sz="4"/>
@@ -6539,75 +5986,41 @@
         </w:tc>
         <w:tc>
           <w:tcPr>
-            <w:tcW w:type="dxa" w:w="1300"/>
-            <w:tcBorders>
-              <w:top w:val="single" w:color="BFBFBF" w:sz="4"/>
-              <w:left w:val="single" w:color="BFBFBF" w:sz="4"/>
-              <w:bottom w:val="single" w:color="BFBFBF" w:sz="4"/>
-              <w:right w:val="single" w:color="BFBFBF" w:sz="4"/>
-            </w:tcBorders>
-            <w:shd w:fill="F2F2F2" w:color="auto" w:val="clear"/>
-            <w:tcMar>
-              <w:top w:type="dxa" w:w="60"/>
-              <w:left w:type="dxa" w:w="90"/>
-              <w:bottom w:type="dxa" w:w="60"/>
-              <w:right w:type="dxa" w:w="90"/>
-            </w:tcMar>
-            <w:vAlign w:val="center"/>
-          </w:tcPr>
-          <w:p>
-            <w:pPr>
-              <w:spacing w:after="30" w:line="250"/>
-              <w:jc w:val="left"/>
-            </w:pPr>
-            <w:r>
-              <w:rPr>
-                <w:rFonts w:ascii="Cambria" w:cs="Cambria" w:eastAsia="Cambria" w:hAnsi="Cambria"/>
-                <w:color w:val="3A3A3A"/>
-                <w:sz w:val="18"/>
-                <w:szCs w:val="18"/>
-              </w:rPr>
-              <w:t xml:space="preserve">1</w:t>
-            </w:r>
-          </w:p>
-        </w:tc>
-        <w:tc>
-          <w:tcPr>
-            <w:tcW w:type="dxa" w:w="1300"/>
-            <w:tcBorders>
-              <w:top w:val="single" w:color="BFBFBF" w:sz="4"/>
-              <w:left w:val="single" w:color="BFBFBF" w:sz="4"/>
-              <w:bottom w:val="single" w:color="BFBFBF" w:sz="4"/>
-              <w:right w:val="single" w:color="BFBFBF" w:sz="4"/>
-            </w:tcBorders>
-            <w:shd w:fill="F2F2F2" w:color="auto" w:val="clear"/>
-            <w:tcMar>
-              <w:top w:type="dxa" w:w="60"/>
-              <w:left w:type="dxa" w:w="90"/>
-              <w:bottom w:type="dxa" w:w="60"/>
-              <w:right w:type="dxa" w:w="90"/>
-            </w:tcMar>
-            <w:vAlign w:val="center"/>
-          </w:tcPr>
-          <w:p>
-            <w:pPr>
-              <w:spacing w:after="30" w:line="250"/>
-              <w:jc w:val="left"/>
-            </w:pPr>
-            <w:r>
-              <w:rPr>
-                <w:rFonts w:ascii="Cambria" w:cs="Cambria" w:eastAsia="Cambria" w:hAnsi="Cambria"/>
-                <w:color w:val="3A3A3A"/>
-                <w:sz w:val="18"/>
-                <w:szCs w:val="18"/>
-              </w:rPr>
-              <w:t xml:space="preserve">2</w:t>
-            </w:r>
-          </w:p>
-        </w:tc>
-        <w:tc>
-          <w:tcPr>
-            <w:tcW w:type="dxa" w:w="4438"/>
+            <w:tcW w:type="dxa" w:w="1500"/>
+            <w:tcBorders>
+              <w:top w:val="single" w:color="BFBFBF" w:sz="4"/>
+              <w:left w:val="single" w:color="BFBFBF" w:sz="4"/>
+              <w:bottom w:val="single" w:color="BFBFBF" w:sz="4"/>
+              <w:right w:val="single" w:color="BFBFBF" w:sz="4"/>
+            </w:tcBorders>
+            <w:shd w:fill="F2F2F2" w:color="auto" w:val="clear"/>
+            <w:tcMar>
+              <w:top w:type="dxa" w:w="60"/>
+              <w:left w:type="dxa" w:w="90"/>
+              <w:bottom w:type="dxa" w:w="60"/>
+              <w:right w:type="dxa" w:w="90"/>
+            </w:tcMar>
+            <w:vAlign w:val="center"/>
+          </w:tcPr>
+          <w:p>
+            <w:pPr>
+              <w:spacing w:after="30" w:line="250"/>
+              <w:jc w:val="left"/>
+            </w:pPr>
+            <w:r>
+              <w:rPr>
+                <w:rFonts w:ascii="Cambria" w:cs="Cambria" w:eastAsia="Cambria" w:hAnsi="Cambria"/>
+                <w:color w:val="3A3A3A"/>
+                <w:sz w:val="18"/>
+                <w:szCs w:val="18"/>
+              </w:rPr>
+              <w:t xml:space="preserve">3 (11 %)</w:t>
+            </w:r>
+          </w:p>
+        </w:tc>
+        <w:tc>
+          <w:tcPr>
+            <w:tcW w:type="dxa" w:w="5138"/>
             <w:tcBorders>
               <w:top w:val="single" w:color="BFBFBF" w:sz="4"/>
               <w:left w:val="single" w:color="BFBFBF" w:sz="4"/>
@@ -6646,7 +6059,7 @@
         </w:trPr>
         <w:tc>
           <w:tcPr>
-            <w:tcW w:type="dxa" w:w="2600"/>
+            <w:tcW w:type="dxa" w:w="3000"/>
             <w:tcBorders>
               <w:top w:val="single" w:color="BFBFBF" w:sz="4"/>
               <w:left w:val="single" w:color="BFBFBF" w:sz="4"/>
@@ -6679,73 +6092,40 @@
         </w:tc>
         <w:tc>
           <w:tcPr>
-            <w:tcW w:type="dxa" w:w="1300"/>
-            <w:tcBorders>
-              <w:top w:val="single" w:color="BFBFBF" w:sz="4"/>
-              <w:left w:val="single" w:color="BFBFBF" w:sz="4"/>
-              <w:bottom w:val="single" w:color="BFBFBF" w:sz="4"/>
-              <w:right w:val="single" w:color="BFBFBF" w:sz="4"/>
-            </w:tcBorders>
-            <w:tcMar>
-              <w:top w:type="dxa" w:w="60"/>
-              <w:left w:type="dxa" w:w="90"/>
-              <w:bottom w:type="dxa" w:w="60"/>
-              <w:right w:type="dxa" w:w="90"/>
-            </w:tcMar>
-            <w:vAlign w:val="center"/>
-          </w:tcPr>
-          <w:p>
-            <w:pPr>
-              <w:spacing w:after="30" w:line="250"/>
-              <w:jc w:val="left"/>
-            </w:pPr>
-            <w:r>
-              <w:rPr>
-                <w:rFonts w:ascii="Cambria" w:cs="Cambria" w:eastAsia="Cambria" w:hAnsi="Cambria"/>
-                <w:color w:val="3A3A3A"/>
-                <w:sz w:val="18"/>
-                <w:szCs w:val="18"/>
-              </w:rPr>
-              <w:t xml:space="preserve">4</w:t>
-            </w:r>
-          </w:p>
-        </w:tc>
-        <w:tc>
-          <w:tcPr>
-            <w:tcW w:type="dxa" w:w="1300"/>
-            <w:tcBorders>
-              <w:top w:val="single" w:color="BFBFBF" w:sz="4"/>
-              <w:left w:val="single" w:color="BFBFBF" w:sz="4"/>
-              <w:bottom w:val="single" w:color="BFBFBF" w:sz="4"/>
-              <w:right w:val="single" w:color="BFBFBF" w:sz="4"/>
-            </w:tcBorders>
-            <w:tcMar>
-              <w:top w:type="dxa" w:w="60"/>
-              <w:left w:type="dxa" w:w="90"/>
-              <w:bottom w:type="dxa" w:w="60"/>
-              <w:right w:type="dxa" w:w="90"/>
-            </w:tcMar>
-            <w:vAlign w:val="center"/>
-          </w:tcPr>
-          <w:p>
-            <w:pPr>
-              <w:spacing w:after="30" w:line="250"/>
-              <w:jc w:val="left"/>
-            </w:pPr>
-            <w:r>
-              <w:rPr>
-                <w:rFonts w:ascii="Cambria" w:cs="Cambria" w:eastAsia="Cambria" w:hAnsi="Cambria"/>
-                <w:color w:val="3A3A3A"/>
-                <w:sz w:val="18"/>
-                <w:szCs w:val="18"/>
-              </w:rPr>
-              <w:t xml:space="preserve">–</w:t>
-            </w:r>
-          </w:p>
-        </w:tc>
-        <w:tc>
-          <w:tcPr>
-            <w:tcW w:type="dxa" w:w="4438"/>
+            <w:tcW w:type="dxa" w:w="1500"/>
+            <w:tcBorders>
+              <w:top w:val="single" w:color="BFBFBF" w:sz="4"/>
+              <w:left w:val="single" w:color="BFBFBF" w:sz="4"/>
+              <w:bottom w:val="single" w:color="BFBFBF" w:sz="4"/>
+              <w:right w:val="single" w:color="BFBFBF" w:sz="4"/>
+            </w:tcBorders>
+            <w:tcMar>
+              <w:top w:type="dxa" w:w="60"/>
+              <w:left w:type="dxa" w:w="90"/>
+              <w:bottom w:type="dxa" w:w="60"/>
+              <w:right w:type="dxa" w:w="90"/>
+            </w:tcMar>
+            <w:vAlign w:val="center"/>
+          </w:tcPr>
+          <w:p>
+            <w:pPr>
+              <w:spacing w:after="30" w:line="250"/>
+              <w:jc w:val="left"/>
+            </w:pPr>
+            <w:r>
+              <w:rPr>
+                <w:rFonts w:ascii="Cambria" w:cs="Cambria" w:eastAsia="Cambria" w:hAnsi="Cambria"/>
+                <w:color w:val="3A3A3A"/>
+                <w:sz w:val="18"/>
+                <w:szCs w:val="18"/>
+              </w:rPr>
+              <w:t xml:space="preserve">4 (15 %)</w:t>
+            </w:r>
+          </w:p>
+        </w:tc>
+        <w:tc>
+          <w:tcPr>
+            <w:tcW w:type="dxa" w:w="5138"/>
             <w:tcBorders>
               <w:top w:val="single" w:color="BFBFBF" w:sz="4"/>
               <w:left w:val="single" w:color="BFBFBF" w:sz="4"/>
@@ -6783,7 +6163,7 @@
         </w:trPr>
         <w:tc>
           <w:tcPr>
-            <w:tcW w:type="dxa" w:w="2600"/>
+            <w:tcW w:type="dxa" w:w="3000"/>
             <w:tcBorders>
               <w:top w:val="single" w:color="BFBFBF" w:sz="4"/>
               <w:left w:val="single" w:color="BFBFBF" w:sz="4"/>
@@ -6817,75 +6197,41 @@
         </w:tc>
         <w:tc>
           <w:tcPr>
-            <w:tcW w:type="dxa" w:w="1300"/>
-            <w:tcBorders>
-              <w:top w:val="single" w:color="BFBFBF" w:sz="4"/>
-              <w:left w:val="single" w:color="BFBFBF" w:sz="4"/>
-              <w:bottom w:val="single" w:color="BFBFBF" w:sz="4"/>
-              <w:right w:val="single" w:color="BFBFBF" w:sz="4"/>
-            </w:tcBorders>
-            <w:shd w:fill="F2F2F2" w:color="auto" w:val="clear"/>
-            <w:tcMar>
-              <w:top w:type="dxa" w:w="60"/>
-              <w:left w:type="dxa" w:w="90"/>
-              <w:bottom w:type="dxa" w:w="60"/>
-              <w:right w:type="dxa" w:w="90"/>
-            </w:tcMar>
-            <w:vAlign w:val="center"/>
-          </w:tcPr>
-          <w:p>
-            <w:pPr>
-              <w:spacing w:after="30" w:line="250"/>
-              <w:jc w:val="left"/>
-            </w:pPr>
-            <w:r>
-              <w:rPr>
-                <w:rFonts w:ascii="Cambria" w:cs="Cambria" w:eastAsia="Cambria" w:hAnsi="Cambria"/>
-                <w:color w:val="3A3A3A"/>
-                <w:sz w:val="18"/>
-                <w:szCs w:val="18"/>
-              </w:rPr>
-              <w:t xml:space="preserve">–</w:t>
-            </w:r>
-          </w:p>
-        </w:tc>
-        <w:tc>
-          <w:tcPr>
-            <w:tcW w:type="dxa" w:w="1300"/>
-            <w:tcBorders>
-              <w:top w:val="single" w:color="BFBFBF" w:sz="4"/>
-              <w:left w:val="single" w:color="BFBFBF" w:sz="4"/>
-              <w:bottom w:val="single" w:color="BFBFBF" w:sz="4"/>
-              <w:right w:val="single" w:color="BFBFBF" w:sz="4"/>
-            </w:tcBorders>
-            <w:shd w:fill="F2F2F2" w:color="auto" w:val="clear"/>
-            <w:tcMar>
-              <w:top w:type="dxa" w:w="60"/>
-              <w:left w:type="dxa" w:w="90"/>
-              <w:bottom w:type="dxa" w:w="60"/>
-              <w:right w:type="dxa" w:w="90"/>
-            </w:tcMar>
-            <w:vAlign w:val="center"/>
-          </w:tcPr>
-          <w:p>
-            <w:pPr>
-              <w:spacing w:after="30" w:line="250"/>
-              <w:jc w:val="left"/>
-            </w:pPr>
-            <w:r>
-              <w:rPr>
-                <w:rFonts w:ascii="Cambria" w:cs="Cambria" w:eastAsia="Cambria" w:hAnsi="Cambria"/>
-                <w:color w:val="3A3A3A"/>
-                <w:sz w:val="18"/>
-                <w:szCs w:val="18"/>
-              </w:rPr>
-              <w:t xml:space="preserve">1</w:t>
-            </w:r>
-          </w:p>
-        </w:tc>
-        <w:tc>
-          <w:tcPr>
-            <w:tcW w:type="dxa" w:w="4438"/>
+            <w:tcW w:type="dxa" w:w="1500"/>
+            <w:tcBorders>
+              <w:top w:val="single" w:color="BFBFBF" w:sz="4"/>
+              <w:left w:val="single" w:color="BFBFBF" w:sz="4"/>
+              <w:bottom w:val="single" w:color="BFBFBF" w:sz="4"/>
+              <w:right w:val="single" w:color="BFBFBF" w:sz="4"/>
+            </w:tcBorders>
+            <w:shd w:fill="F2F2F2" w:color="auto" w:val="clear"/>
+            <w:tcMar>
+              <w:top w:type="dxa" w:w="60"/>
+              <w:left w:type="dxa" w:w="90"/>
+              <w:bottom w:type="dxa" w:w="60"/>
+              <w:right w:type="dxa" w:w="90"/>
+            </w:tcMar>
+            <w:vAlign w:val="center"/>
+          </w:tcPr>
+          <w:p>
+            <w:pPr>
+              <w:spacing w:after="30" w:line="250"/>
+              <w:jc w:val="left"/>
+            </w:pPr>
+            <w:r>
+              <w:rPr>
+                <w:rFonts w:ascii="Cambria" w:cs="Cambria" w:eastAsia="Cambria" w:hAnsi="Cambria"/>
+                <w:color w:val="3A3A3A"/>
+                <w:sz w:val="18"/>
+                <w:szCs w:val="18"/>
+              </w:rPr>
+              <w:t xml:space="preserve">1 (4 %)</w:t>
+            </w:r>
+          </w:p>
+        </w:tc>
+        <w:tc>
+          <w:tcPr>
+            <w:tcW w:type="dxa" w:w="5138"/>
             <w:tcBorders>
               <w:top w:val="single" w:color="BFBFBF" w:sz="4"/>
               <w:left w:val="single" w:color="BFBFBF" w:sz="4"/>
@@ -6924,7 +6270,7 @@
         </w:trPr>
         <w:tc>
           <w:tcPr>
-            <w:tcW w:type="dxa" w:w="2600"/>
+            <w:tcW w:type="dxa" w:w="3000"/>
             <w:tcBorders>
               <w:top w:val="single" w:color="BFBFBF" w:sz="4"/>
               <w:left w:val="single" w:color="BFBFBF" w:sz="4"/>
@@ -6957,73 +6303,40 @@
         </w:tc>
         <w:tc>
           <w:tcPr>
-            <w:tcW w:type="dxa" w:w="1300"/>
-            <w:tcBorders>
-              <w:top w:val="single" w:color="BFBFBF" w:sz="4"/>
-              <w:left w:val="single" w:color="BFBFBF" w:sz="4"/>
-              <w:bottom w:val="single" w:color="BFBFBF" w:sz="4"/>
-              <w:right w:val="single" w:color="BFBFBF" w:sz="4"/>
-            </w:tcBorders>
-            <w:tcMar>
-              <w:top w:type="dxa" w:w="60"/>
-              <w:left w:type="dxa" w:w="90"/>
-              <w:bottom w:type="dxa" w:w="60"/>
-              <w:right w:type="dxa" w:w="90"/>
-            </w:tcMar>
-            <w:vAlign w:val="center"/>
-          </w:tcPr>
-          <w:p>
-            <w:pPr>
-              <w:spacing w:after="30" w:line="250"/>
-              <w:jc w:val="left"/>
-            </w:pPr>
-            <w:r>
-              <w:rPr>
-                <w:rFonts w:ascii="Cambria" w:cs="Cambria" w:eastAsia="Cambria" w:hAnsi="Cambria"/>
-                <w:color w:val="3A3A3A"/>
-                <w:sz w:val="18"/>
-                <w:szCs w:val="18"/>
-              </w:rPr>
-              <w:t xml:space="preserve">11</w:t>
-            </w:r>
-          </w:p>
-        </w:tc>
-        <w:tc>
-          <w:tcPr>
-            <w:tcW w:type="dxa" w:w="1300"/>
-            <w:tcBorders>
-              <w:top w:val="single" w:color="BFBFBF" w:sz="4"/>
-              <w:left w:val="single" w:color="BFBFBF" w:sz="4"/>
-              <w:bottom w:val="single" w:color="BFBFBF" w:sz="4"/>
-              <w:right w:val="single" w:color="BFBFBF" w:sz="4"/>
-            </w:tcBorders>
-            <w:tcMar>
-              <w:top w:type="dxa" w:w="60"/>
-              <w:left w:type="dxa" w:w="90"/>
-              <w:bottom w:type="dxa" w:w="60"/>
-              <w:right w:type="dxa" w:w="90"/>
-            </w:tcMar>
-            <w:vAlign w:val="center"/>
-          </w:tcPr>
-          <w:p>
-            <w:pPr>
-              <w:spacing w:after="30" w:line="250"/>
-              <w:jc w:val="left"/>
-            </w:pPr>
-            <w:r>
-              <w:rPr>
-                <w:rFonts w:ascii="Cambria" w:cs="Cambria" w:eastAsia="Cambria" w:hAnsi="Cambria"/>
-                <w:color w:val="3A3A3A"/>
-                <w:sz w:val="18"/>
-                <w:szCs w:val="18"/>
-              </w:rPr>
-              <w:t xml:space="preserve">–</w:t>
-            </w:r>
-          </w:p>
-        </w:tc>
-        <w:tc>
-          <w:tcPr>
-            <w:tcW w:type="dxa" w:w="4438"/>
+            <w:tcW w:type="dxa" w:w="1500"/>
+            <w:tcBorders>
+              <w:top w:val="single" w:color="BFBFBF" w:sz="4"/>
+              <w:left w:val="single" w:color="BFBFBF" w:sz="4"/>
+              <w:bottom w:val="single" w:color="BFBFBF" w:sz="4"/>
+              <w:right w:val="single" w:color="BFBFBF" w:sz="4"/>
+            </w:tcBorders>
+            <w:tcMar>
+              <w:top w:type="dxa" w:w="60"/>
+              <w:left w:type="dxa" w:w="90"/>
+              <w:bottom w:type="dxa" w:w="60"/>
+              <w:right w:type="dxa" w:w="90"/>
+            </w:tcMar>
+            <w:vAlign w:val="center"/>
+          </w:tcPr>
+          <w:p>
+            <w:pPr>
+              <w:spacing w:after="30" w:line="250"/>
+              <w:jc w:val="left"/>
+            </w:pPr>
+            <w:r>
+              <w:rPr>
+                <w:rFonts w:ascii="Cambria" w:cs="Cambria" w:eastAsia="Cambria" w:hAnsi="Cambria"/>
+                <w:color w:val="3A3A3A"/>
+                <w:sz w:val="18"/>
+                <w:szCs w:val="18"/>
+              </w:rPr>
+              <w:t xml:space="preserve">11 (41 %)</w:t>
+            </w:r>
+          </w:p>
+        </w:tc>
+        <w:tc>
+          <w:tcPr>
+            <w:tcW w:type="dxa" w:w="5138"/>
             <w:tcBorders>
               <w:top w:val="single" w:color="BFBFBF" w:sz="4"/>
               <w:left w:val="single" w:color="BFBFBF" w:sz="4"/>
@@ -7070,7 +6383,7 @@
       <w:r>
         <w:drawing>
           <wp:inline distT="0" distB="0" distL="0" distR="0">
-            <wp:extent cx="5334000" cy="2667000"/>
+            <wp:extent cx="5334000" cy="2428875"/>
             <wp:effectExtent t="0" r="0" b="0" l="0"/>
             <wp:docPr id="1" name="" descr="" title=""/>
             <wp:cNvGraphicFramePr>
@@ -7095,7 +6408,7 @@
                   <pic:spPr bwMode="auto">
                     <a:xfrm>
                       <a:off x="0" y="0"/>
-                      <a:ext cx="5334000" cy="2667000"/>
+                      <a:ext cx="5334000" cy="2428875"/>
                     </a:xfrm>
                     <a:prstGeom prst="rect">
                       <a:avLst/>
@@ -7122,7 +6435,7 @@
           <w:sz w:val="17"/>
           <w:szCs w:val="17"/>
         </w:rPr>
-        <w:t xml:space="preserve">Graphique 2 – Difficultés déclarées selon le profil du répondant (en % de chaque groupe ; employés : une réponse « centralisé » non représentée)</w:t>
+        <w:t xml:space="preserve">Graphique 2 – Difficultés principales déclarées</w:t>
       </w:r>
     </w:p>
     <w:p>
@@ -7188,7 +6501,7 @@
           <w:sz w:val="21"/>
           <w:szCs w:val="21"/>
         </w:rPr>
-        <w:t xml:space="preserve">. Les limites des cartes existantes (4 DAF) fournissent en outre un </w:t>
+        <w:t xml:space="preserve">. Les limites des cartes existantes (4 entreprises) fournissent en outre un </w:t>
       </w:r>
       <w:r>
         <w:rPr>
@@ -7234,7 +6547,7 @@
           <w:sz w:val="21"/>
           <w:szCs w:val="21"/>
         </w:rPr>
-        <w:t xml:space="preserve">9 des 17 entreprises qui paient en espèces ne citent aucune difficulté</w:t>
+        <w:t xml:space="preserve">9 des 18 entreprises qui paient en espèces ne citent aucune difficulté</w:t>
       </w:r>
       <w:r>
         <w:rPr>
@@ -7281,7 +6594,7 @@
           <w:sz w:val="21"/>
           <w:szCs w:val="21"/>
         </w:rPr>
-        <w:t xml:space="preserve">2 DAF sur 22 (9 %)</w:t>
+        <w:t xml:space="preserve">4 entreprises sur 27 (15 %)</w:t>
       </w:r>
       <w:r>
         <w:rPr>
@@ -7290,27 +6603,7 @@
           <w:sz w:val="21"/>
           <w:szCs w:val="21"/>
         </w:rPr>
-        <w:t xml:space="preserve"> déclarent avoir adopté des cartes bancaires professionnelles (Vision Confort et Express Union) ; chez les employés, 2 sur 5 (Draaijer Turbo Service et New Design Builtshine). Au total, </w:t>
-      </w:r>
-      <w:r>
-        <w:rPr>
-          <w:rFonts w:ascii="Cambria" w:cs="Cambria" w:eastAsia="Cambria" w:hAnsi="Cambria"/>
-          <w:b/>
-          <w:bCs/>
-          <w:color w:val="3A3A3A"/>
-          <w:sz w:val="21"/>
-          <w:szCs w:val="21"/>
-        </w:rPr>
-        <w:t xml:space="preserve">4 répondants sur 27 (15 %)</w:t>
-      </w:r>
-      <w:r>
-        <w:rPr>
-          <w:rFonts w:ascii="Cambria" w:cs="Cambria" w:eastAsia="Cambria" w:hAnsi="Cambria"/>
-          <w:color w:val="3A3A3A"/>
-          <w:sz w:val="21"/>
-          <w:szCs w:val="21"/>
-        </w:rPr>
-        <w:t xml:space="preserve">. Trois autres DAF mentionnent pourtant des cartes Visa ou bancaires dans leurs mécanismes tout en répondant « non » à la question : ce sont des cartes d’usage ponctuel ou personnel, qui ne relèvent pas d’un programme de cartes d’entreprise.</w:t>
+        <w:t xml:space="preserve"> déclarent avoir adopté des cartes bancaires professionnelles : Vision Confort et Express Union (lot 2), Draaijer Turbo Service et New Design Builtshine (lot 1). Trois autres répondants (EGIS Cameroun, Carino, Digital Art 237) mentionnent pourtant des cartes Visa ou bancaires dans leurs mécanismes tout en répondant « non » à la question : ce sont des cartes d’usage ponctuel ou personnel, qui ne relèvent pas d’un programme de cartes d’entreprise.</w:t>
       </w:r>
     </w:p>
     <w:p>
@@ -7409,7 +6702,7 @@
           <w:sz w:val="21"/>
           <w:szCs w:val="21"/>
         </w:rPr>
-        <w:t xml:space="preserve">Employés</w:t>
+        <w:t xml:space="preserve">New Design Builtshine et Draaijer Turbo Service</w:t>
       </w:r>
       <w:r>
         <w:rPr>
@@ -7418,7 +6711,7 @@
           <w:sz w:val="21"/>
           <w:szCs w:val="21"/>
         </w:rPr>
-        <w:t xml:space="preserve"> : les cartes sont retenues pour la « facilité de gestion », « faciliter les échanges » et le fait d’être « centralisé ».</w:t>
+        <w:t xml:space="preserve"> : les cartes sont retenues pour la « facilité de gestion » et pour « faciliter les échanges ».</w:t>
       </w:r>
     </w:p>
     <w:p>
@@ -7433,7 +6726,7 @@
           <w:sz w:val="21"/>
           <w:szCs w:val="21"/>
         </w:rPr>
-        <w:t xml:space="preserve">Un DAF (Innovendi Data) souhaite par ailleurs « une flotte de cartes prépayées » pour les dépenses qu’il ne gère pas encore, ce qui confirme l’attrait du format prépayé pour déléguer en gardant la main sur les montants.</w:t>
+        <w:t xml:space="preserve">Une entreprise (Innovendi Data) souhaite par ailleurs « une flotte de cartes prépayées » pour les dépenses qu’il ne gère pas encore, ce qui confirme l’attrait du format prépayé pour déléguer en gardant la main sur les montants.</w:t>
       </w:r>
     </w:p>
     <w:p>
@@ -7469,7 +6762,27 @@
           <w:sz w:val="21"/>
           <w:szCs w:val="21"/>
         </w:rPr>
-        <w:t xml:space="preserve">Les DAF ont été interrogés sur leur disposition à investir dans une solution assurant la gestion, la restriction, la collecte des justificatifs et la maîtrise globale de ces dépenses. Les 22 réponses ont été classées en quatre catégories.</w:t>
+        <w:t xml:space="preserve">La question de la disposition à investir dans une solution assurant la gestion, la restriction, la collecte des justificatifs et la maîtrise globale de ces dépenses figurait dans le lot 2 : elle porte sur </w:t>
+      </w:r>
+      <w:r>
+        <w:rPr>
+          <w:rFonts w:ascii="Cambria" w:cs="Cambria" w:eastAsia="Cambria" w:hAnsi="Cambria"/>
+          <w:b/>
+          <w:bCs/>
+          <w:color w:val="3A3A3A"/>
+          <w:sz w:val="21"/>
+          <w:szCs w:val="21"/>
+        </w:rPr>
+        <w:t xml:space="preserve">22 réponses</w:t>
+      </w:r>
+      <w:r>
+        <w:rPr>
+          <w:rFonts w:ascii="Cambria" w:cs="Cambria" w:eastAsia="Cambria" w:hAnsi="Cambria"/>
+          <w:color w:val="3A3A3A"/>
+          <w:sz w:val="21"/>
+          <w:szCs w:val="21"/>
+        </w:rPr>
+        <w:t xml:space="preserve">, classées en quatre catégories.</w:t>
       </w:r>
     </w:p>
     <w:p>
@@ -7533,7 +6846,7 @@
           <w:sz w:val="17"/>
           <w:szCs w:val="17"/>
         </w:rPr>
-        <w:t xml:space="preserve">Graphique 3 – Disposition à investir (réponses ouvertes codées)</w:t>
+        <w:t xml:space="preserve">Graphique 3 – Disposition à investir (réponses ouvertes codées, n = 22)</w:t>
       </w:r>
     </w:p>
     <w:p>
@@ -7817,7 +7130,7 @@
                 <w:sz w:val="18"/>
                 <w:szCs w:val="18"/>
               </w:rPr>
-              <w:t xml:space="preserve">Nombre de répondants (DAF)</w:t>
+              <w:t xml:space="preserve">Nombre d’entreprises (n=22)</w:t>
             </w:r>
           </w:p>
         </w:tc>
@@ -8557,7 +7870,7 @@
                 <w:sz w:val="18"/>
                 <w:szCs w:val="18"/>
               </w:rPr>
-              <w:t xml:space="preserve">n (DAF)</w:t>
+              <w:t xml:space="preserve">n (lot 2)</w:t>
             </w:r>
           </w:p>
         </w:tc>
@@ -10229,7 +9542,7 @@
                 <w:sz w:val="18"/>
                 <w:szCs w:val="18"/>
               </w:rPr>
-              <w:t xml:space="preserve">Besoin non ressenti par les DAF</w:t>
+              <w:t xml:space="preserve">Besoin non ressenti par tous</w:t>
             </w:r>
           </w:p>
         </w:tc>
@@ -10265,7 +9578,7 @@
                 <w:sz w:val="18"/>
                 <w:szCs w:val="18"/>
               </w:rPr>
-              <w:t xml:space="preserve">50 % des DAF ne citent aucune difficulté, y compris 9 entreprises qui paient en espèces</w:t>
+              <w:t xml:space="preserve">41 % des répondants (11/27) ne citent aucune difficulté, dont 9 entreprises qui paient en espèces</w:t>
             </w:r>
           </w:p>
         </w:tc>
@@ -10599,7 +9912,7 @@
                 <w:sz w:val="18"/>
                 <w:szCs w:val="18"/>
               </w:rPr>
-              <w:t xml:space="preserve">Réticence signalée par 2 DAF</w:t>
+              <w:t xml:space="preserve">Réticence signalée par 2 entreprises</w:t>
             </w:r>
           </w:p>
         </w:tc>
@@ -10994,7 +10307,7 @@
                 <w:sz w:val="18"/>
                 <w:szCs w:val="18"/>
               </w:rPr>
-              <w:t xml:space="preserve">Espèces pour 77 % des DAF ; aucun programme de cartes commerciales ; assemblage de solutions partielles</w:t>
+              <w:t xml:space="preserve">Espèces pour 67 % des entreprises ; aucun programme de cartes commerciales ; assemblage de solutions partielles</w:t>
             </w:r>
           </w:p>
         </w:tc>
@@ -11890,7 +11203,7 @@
           <w:sz w:val="21"/>
           <w:szCs w:val="21"/>
         </w:rPr>
-        <w:t xml:space="preserve"> : les espèces dominent, les cartes d’entreprise structurées sont quasi absentes et les difficultés de traçabilité, de contrôle et de lenteur sont réelles, surtout du point de vue des employés. Plus de la moitié des DAF interrogés se disent prêts à envisager la solution, ce qui est encourageant pour un produit encore inconnu. Mais cet intérêt est </w:t>
+        <w:t xml:space="preserve"> : les espèces dominent, les cartes d’entreprise structurées sont quasi absentes et les difficultés de traçabilité, de contrôle et de lenteur sont réelles. Plus de la moitié des entreprises ayant répondu à la question (12 sur 22) se disent prêtes à envisager la solution, ce qui est encourageant. Mais cet intérêt est </w:t>
       </w:r>
       <w:r>
         <w:rPr>
@@ -11910,7 +11223,7 @@
           <w:sz w:val="21"/>
           <w:szCs w:val="21"/>
         </w:rPr>
-        <w:t xml:space="preserve"> (coût, fiabilité, plafonds, usage terrain), et une part importante des DAF ne ressent pas le besoin.</w:t>
+        <w:t xml:space="preserve"> (coût, fiabilité, plafonds, usage terrain), et plus de quatre répondants sur dix ne ressentent pas de difficulté.</w:t>
       </w:r>
     </w:p>
     <w:p>
@@ -12389,7 +11702,7 @@
                 <w:sz w:val="18"/>
                 <w:szCs w:val="18"/>
               </w:rPr>
-              <w:t xml:space="preserve">Le concurrent principal est l’espèce ; 50 % des DAF ne perçoivent pas le besoin</w:t>
+              <w:t xml:space="preserve">Le concurrent principal est l’espèce ; 41 % des répondants ne citent aucune difficulté</w:t>
             </w:r>
           </w:p>
         </w:tc>
@@ -12538,7 +11851,7 @@
                 <w:sz w:val="18"/>
                 <w:szCs w:val="18"/>
               </w:rPr>
-              <w:t xml:space="preserve">Quatre DAF citent ces limites ; frein sur l’adhésion</w:t>
+              <w:t xml:space="preserve">Quatre entreprises citent ces limites ; frein sur l’adhésion</w:t>
             </w:r>
           </w:p>
         </w:tc>
@@ -12689,7 +12002,7 @@
                 <w:sz w:val="18"/>
                 <w:szCs w:val="18"/>
               </w:rPr>
-              <w:t xml:space="preserve">Lenteur citée par les employés et par un DAF</w:t>
+              <w:t xml:space="preserve">Lenteur des circuits citée par 3 entreprises</w:t>
             </w:r>
           </w:p>
         </w:tc>
@@ -13438,7 +12751,7 @@
                 <w:sz w:val="18"/>
                 <w:szCs w:val="18"/>
               </w:rPr>
-              <w:t xml:space="preserve">Réticence signalée par 2 DAF</w:t>
+              <w:t xml:space="preserve">Réticence signalée par 2 entreprises</w:t>
             </w:r>
           </w:p>
         </w:tc>
@@ -13711,6 +13024,26 @@
           <w:sz w:val="19"/>
           <w:szCs w:val="19"/>
         </w:rPr>
+        <w:t xml:space="preserve">Lot</w:t>
+      </w:r>
+      <w:r>
+        <w:rPr>
+          <w:rFonts w:ascii="Cambria" w:cs="Cambria" w:eastAsia="Cambria" w:hAnsi="Cambria"/>
+          <w:color w:val="3A3A3A"/>
+          <w:sz w:val="19"/>
+          <w:szCs w:val="19"/>
+        </w:rPr>
+        <w:t xml:space="preserve"> = version du formulaire (1 : 5 réponses ; 2 : 22 réponses) ; </w:t>
+      </w:r>
+      <w:r>
+        <w:rPr>
+          <w:rFonts w:ascii="Cambria" w:cs="Cambria" w:eastAsia="Cambria" w:hAnsi="Cambria"/>
+          <w:b/>
+          <w:bCs/>
+          <w:color w:val="3A3A3A"/>
+          <w:sz w:val="19"/>
+          <w:szCs w:val="19"/>
+        </w:rPr>
         <w:t xml:space="preserve">Cash</w:t>
       </w:r>
       <w:r>
@@ -13751,7 +13084,7 @@
           <w:sz w:val="19"/>
           <w:szCs w:val="19"/>
         </w:rPr>
-        <w:t xml:space="preserve">Intention</w:t>
+        <w:t xml:space="preserve">Int.</w:t>
       </w:r>
       <w:r>
         <w:rPr>
@@ -13760,7 +13093,7 @@
           <w:sz w:val="19"/>
           <w:szCs w:val="19"/>
         </w:rPr>
-        <w:t xml:space="preserve"> : F = favorable, F* = favorable sous conditions, O = ouvert ou à reporter, D = défavorable (formulaire DAF uniquement). Statut : L = entreprise locale, G = filiale de groupe.</w:t>
+        <w:t xml:space="preserve"> = intention : F = favorable, F* = favorable sous conditions, O = ouvert ou à reporter, D = défavorable (question posée dans le lot 2 uniquement). St. : L = entreprise locale, G = filiale de groupe.</w:t>
       </w:r>
     </w:p>
     <w:tbl>
@@ -13822,7 +13155,7 @@
                 <w:sz w:val="18"/>
                 <w:szCs w:val="18"/>
               </w:rPr>
-              <w:t xml:space="preserve">Type</w:t>
+              <w:t xml:space="preserve">Lot</w:t>
             </w:r>
           </w:p>
         </w:tc>
@@ -14112,7 +13445,7 @@
                 <w:sz w:val="18"/>
                 <w:szCs w:val="18"/>
               </w:rPr>
-              <w:t xml:space="preserve">DAF</w:t>
+              <w:t xml:space="preserve">2</w:t>
             </w:r>
           </w:p>
         </w:tc>
@@ -14382,7 +13715,7 @@
                 <w:sz w:val="18"/>
                 <w:szCs w:val="18"/>
               </w:rPr>
-              <w:t xml:space="preserve">DAF</w:t>
+              <w:t xml:space="preserve">2</w:t>
             </w:r>
           </w:p>
         </w:tc>
@@ -14658,7 +13991,7 @@
                 <w:sz w:val="18"/>
                 <w:szCs w:val="18"/>
               </w:rPr>
-              <w:t xml:space="preserve">DAF</w:t>
+              <w:t xml:space="preserve">2</w:t>
             </w:r>
           </w:p>
         </w:tc>
@@ -14928,7 +14261,7 @@
                 <w:sz w:val="18"/>
                 <w:szCs w:val="18"/>
               </w:rPr>
-              <w:t xml:space="preserve">DAF</w:t>
+              <w:t xml:space="preserve">2</w:t>
             </w:r>
           </w:p>
         </w:tc>
@@ -15204,7 +14537,7 @@
                 <w:sz w:val="18"/>
                 <w:szCs w:val="18"/>
               </w:rPr>
-              <w:t xml:space="preserve">DAF</w:t>
+              <w:t xml:space="preserve">2</w:t>
             </w:r>
           </w:p>
         </w:tc>
@@ -15474,7 +14807,7 @@
                 <w:sz w:val="18"/>
                 <w:szCs w:val="18"/>
               </w:rPr>
-              <w:t xml:space="preserve">DAF</w:t>
+              <w:t xml:space="preserve">2</w:t>
             </w:r>
           </w:p>
         </w:tc>
@@ -15750,7 +15083,7 @@
                 <w:sz w:val="18"/>
                 <w:szCs w:val="18"/>
               </w:rPr>
-              <w:t xml:space="preserve">DAF</w:t>
+              <w:t xml:space="preserve">2</w:t>
             </w:r>
           </w:p>
         </w:tc>
@@ -16020,7 +15353,7 @@
                 <w:sz w:val="18"/>
                 <w:szCs w:val="18"/>
               </w:rPr>
-              <w:t xml:space="preserve">DAF</w:t>
+              <w:t xml:space="preserve">2</w:t>
             </w:r>
           </w:p>
         </w:tc>
@@ -16296,7 +15629,7 @@
                 <w:sz w:val="18"/>
                 <w:szCs w:val="18"/>
               </w:rPr>
-              <w:t xml:space="preserve">DAF</w:t>
+              <w:t xml:space="preserve">2</w:t>
             </w:r>
           </w:p>
         </w:tc>
@@ -16566,7 +15899,7 @@
                 <w:sz w:val="18"/>
                 <w:szCs w:val="18"/>
               </w:rPr>
-              <w:t xml:space="preserve">DAF</w:t>
+              <w:t xml:space="preserve">2</w:t>
             </w:r>
           </w:p>
         </w:tc>
@@ -16842,7 +16175,7 @@
                 <w:sz w:val="18"/>
                 <w:szCs w:val="18"/>
               </w:rPr>
-              <w:t xml:space="preserve">DAF</w:t>
+              <w:t xml:space="preserve">2</w:t>
             </w:r>
           </w:p>
         </w:tc>
@@ -17112,7 +16445,7 @@
                 <w:sz w:val="18"/>
                 <w:szCs w:val="18"/>
               </w:rPr>
-              <w:t xml:space="preserve">DAF</w:t>
+              <w:t xml:space="preserve">2</w:t>
             </w:r>
           </w:p>
         </w:tc>
@@ -17388,7 +16721,7 @@
                 <w:sz w:val="18"/>
                 <w:szCs w:val="18"/>
               </w:rPr>
-              <w:t xml:space="preserve">DAF</w:t>
+              <w:t xml:space="preserve">2</w:t>
             </w:r>
           </w:p>
         </w:tc>
@@ -17658,7 +16991,7 @@
                 <w:sz w:val="18"/>
                 <w:szCs w:val="18"/>
               </w:rPr>
-              <w:t xml:space="preserve">DAF</w:t>
+              <w:t xml:space="preserve">2</w:t>
             </w:r>
           </w:p>
         </w:tc>
@@ -17934,7 +17267,7 @@
                 <w:sz w:val="18"/>
                 <w:szCs w:val="18"/>
               </w:rPr>
-              <w:t xml:space="preserve">DAF</w:t>
+              <w:t xml:space="preserve">2</w:t>
             </w:r>
           </w:p>
         </w:tc>
@@ -18204,7 +17537,7 @@
                 <w:sz w:val="18"/>
                 <w:szCs w:val="18"/>
               </w:rPr>
-              <w:t xml:space="preserve">DAF</w:t>
+              <w:t xml:space="preserve">2</w:t>
             </w:r>
           </w:p>
         </w:tc>
@@ -18480,7 +17813,7 @@
                 <w:sz w:val="18"/>
                 <w:szCs w:val="18"/>
               </w:rPr>
-              <w:t xml:space="preserve">DAF</w:t>
+              <w:t xml:space="preserve">2</w:t>
             </w:r>
           </w:p>
         </w:tc>
@@ -18750,7 +18083,7 @@
                 <w:sz w:val="18"/>
                 <w:szCs w:val="18"/>
               </w:rPr>
-              <w:t xml:space="preserve">DAF</w:t>
+              <w:t xml:space="preserve">2</w:t>
             </w:r>
           </w:p>
         </w:tc>
@@ -19026,7 +18359,7 @@
                 <w:sz w:val="18"/>
                 <w:szCs w:val="18"/>
               </w:rPr>
-              <w:t xml:space="preserve">DAF</w:t>
+              <w:t xml:space="preserve">2</w:t>
             </w:r>
           </w:p>
         </w:tc>
@@ -19296,7 +18629,7 @@
                 <w:sz w:val="18"/>
                 <w:szCs w:val="18"/>
               </w:rPr>
-              <w:t xml:space="preserve">DAF</w:t>
+              <w:t xml:space="preserve">2</w:t>
             </w:r>
           </w:p>
         </w:tc>
@@ -19572,7 +18905,7 @@
                 <w:sz w:val="18"/>
                 <w:szCs w:val="18"/>
               </w:rPr>
-              <w:t xml:space="preserve">DAF</w:t>
+              <w:t xml:space="preserve">2</w:t>
             </w:r>
           </w:p>
         </w:tc>
@@ -19842,7 +19175,7 @@
                 <w:sz w:val="18"/>
                 <w:szCs w:val="18"/>
               </w:rPr>
-              <w:t xml:space="preserve">DAF</w:t>
+              <w:t xml:space="preserve">2</w:t>
             </w:r>
           </w:p>
         </w:tc>
@@ -20118,7 +19451,7 @@
                 <w:sz w:val="18"/>
                 <w:szCs w:val="18"/>
               </w:rPr>
-              <w:t xml:space="preserve">Empl.</w:t>
+              <w:t xml:space="preserve">1</w:t>
             </w:r>
           </w:p>
         </w:tc>
@@ -20388,7 +19721,7 @@
                 <w:sz w:val="18"/>
                 <w:szCs w:val="18"/>
               </w:rPr>
-              <w:t xml:space="preserve">Empl.</w:t>
+              <w:t xml:space="preserve">1</w:t>
             </w:r>
           </w:p>
         </w:tc>
@@ -20664,7 +19997,7 @@
                 <w:sz w:val="18"/>
                 <w:szCs w:val="18"/>
               </w:rPr>
-              <w:t xml:space="preserve">Empl.</w:t>
+              <w:t xml:space="preserve">1</w:t>
             </w:r>
           </w:p>
         </w:tc>
@@ -20934,7 +20267,7 @@
                 <w:sz w:val="18"/>
                 <w:szCs w:val="18"/>
               </w:rPr>
-              <w:t xml:space="preserve">Empl.</w:t>
+              <w:t xml:space="preserve">1</w:t>
             </w:r>
           </w:p>
         </w:tc>
@@ -21210,7 +20543,7 @@
                 <w:sz w:val="18"/>
                 <w:szCs w:val="18"/>
               </w:rPr>
-              <w:t xml:space="preserve">Empl.</w:t>
+              <w:t xml:space="preserve">1</w:t>
             </w:r>
           </w:p>
         </w:tc>
@@ -21460,7 +20793,7 @@
           <w:sz w:val="17"/>
           <w:szCs w:val="17"/>
         </w:rPr>
-        <w:t xml:space="preserve">n.c. : « paiement direct », mode de règlement non précisé. Les employés n’ont pas été interrogés sur leur disposition à investir.</w:t>
+        <w:t xml:space="preserve">n.c. : « paiement direct », mode de règlement non précisé. Int. « – » : question non posée (lot 1).</w:t>
       </w:r>
     </w:p>
     <w:p>

</xml_diff>

<commit_message>
Rapport FBC: intégrer fiche idée produit et documents Visa
Ajoute la comparaison détaillée avec l'idée produit, la section sur les
tarifs et prérequis techniques Visa, et de nouvelles recommandations.

Co-Authored-By: Claude Sonnet 5.5 <noreply@anthropic.com>
Claude-Session: https://claude.ai/code/session_01FbcMrHUb4kmJopxkhiarAy
</commit_message>
<xml_diff>
--- a/rapport_fbc/Rapport_Enquete_First_Business_Clarity.docx
+++ b/rapport_fbc/Rapport_Enquete_First_Business_Clarity.docx
@@ -1487,6 +1487,126 @@
     </w:p>
     <w:p>
       <w:pPr>
+        <w:pStyle w:val="Heading3"/>
+        <w:keepNext/>
+        <w:spacing w:after="80" w:before="180"/>
+      </w:pPr>
+      <w:r>
+        <w:rPr>
+          <w:rFonts w:ascii="Cambria" w:cs="Cambria" w:eastAsia="Cambria" w:hAnsi="Cambria"/>
+          <w:b/>
+          <w:bCs/>
+          <w:color w:val="3A3A3A"/>
+          <w:sz w:val="22"/>
+          <w:szCs w:val="22"/>
+        </w:rPr>
+        <w:t xml:space="preserve">Ce que les documents complémentaires (idée produit, tarifs Visa) ajoutent</w:t>
+      </w:r>
+    </w:p>
+    <w:p>
+      <w:pPr>
+        <w:pStyle w:val="ListParagraph"/>
+        <w:numPr>
+          <w:ilvl w:val="0"/>
+          <w:numId w:val="2"/>
+        </w:numPr>
+        <w:spacing w:after="70" w:line="290"/>
+        <w:jc w:val="left"/>
+      </w:pPr>
+      <w:r>
+        <w:rPr>
+          <w:rFonts w:ascii="Cambria" w:cs="Cambria" w:eastAsia="Cambria" w:hAnsi="Cambria"/>
+          <w:b/>
+          <w:bCs/>
+          <w:color w:val="3A3A3A"/>
+          <w:sz w:val="21"/>
+          <w:szCs w:val="21"/>
+        </w:rPr>
+        <w:t xml:space="preserve">Deux caractéristiques de l’idée produit sont à réexaminer</w:t>
+      </w:r>
+      <w:r>
+        <w:rPr>
+          <w:rFonts w:ascii="Cambria" w:cs="Cambria" w:eastAsia="Cambria" w:hAnsi="Cambria"/>
+          <w:color w:val="3A3A3A"/>
+          <w:sz w:val="21"/>
+          <w:szCs w:val="21"/>
+        </w:rPr>
+        <w:t xml:space="preserve"> : des cartes </w:t>
+      </w:r>
+      <w:r>
+        <w:rPr>
+          <w:rFonts w:ascii="Cambria" w:cs="Cambria" w:eastAsia="Cambria" w:hAnsi="Cambria"/>
+          <w:b/>
+          <w:bCs/>
+          <w:color w:val="3A3A3A"/>
+          <w:sz w:val="21"/>
+          <w:szCs w:val="21"/>
+        </w:rPr>
+        <w:t xml:space="preserve">sans retrait d’espèces</w:t>
+      </w:r>
+      <w:r>
+        <w:rPr>
+          <w:rFonts w:ascii="Cambria" w:cs="Cambria" w:eastAsia="Cambria" w:hAnsi="Cambria"/>
+          <w:color w:val="3A3A3A"/>
+          <w:sz w:val="21"/>
+          <w:szCs w:val="21"/>
+        </w:rPr>
+        <w:t xml:space="preserve">, alors que 67 % des répondants règlent en espèces ; et un </w:t>
+      </w:r>
+      <w:r>
+        <w:rPr>
+          <w:rFonts w:ascii="Cambria" w:cs="Cambria" w:eastAsia="Cambria" w:hAnsi="Cambria"/>
+          <w:b/>
+          <w:bCs/>
+          <w:color w:val="3A3A3A"/>
+          <w:sz w:val="21"/>
+          <w:szCs w:val="21"/>
+        </w:rPr>
+        <w:t xml:space="preserve">minimum de 20 cartes par contrat</w:t>
+      </w:r>
+      <w:r>
+        <w:rPr>
+          <w:rFonts w:ascii="Cambria" w:cs="Cambria" w:eastAsia="Cambria" w:hAnsi="Cambria"/>
+          <w:color w:val="3A3A3A"/>
+          <w:sz w:val="21"/>
+          <w:szCs w:val="21"/>
+        </w:rPr>
+        <w:t xml:space="preserve">, alors que l’échantillon est composé en majorité de petites entreprises locales.</w:t>
+      </w:r>
+    </w:p>
+    <w:p>
+      <w:pPr>
+        <w:pStyle w:val="ListParagraph"/>
+        <w:numPr>
+          <w:ilvl w:val="0"/>
+          <w:numId w:val="2"/>
+        </w:numPr>
+        <w:spacing w:after="70" w:line="290"/>
+        <w:jc w:val="left"/>
+      </w:pPr>
+      <w:r>
+        <w:rPr>
+          <w:rFonts w:ascii="Cambria" w:cs="Cambria" w:eastAsia="Cambria" w:hAnsi="Cambria"/>
+          <w:b/>
+          <w:bCs/>
+          <w:color w:val="3A3A3A"/>
+          <w:sz w:val="21"/>
+          <w:szCs w:val="21"/>
+        </w:rPr>
+        <w:t xml:space="preserve">Les besoins prioritaires de l’enquête (contrôle, plafonds, justificatifs) correspondent au package Visa PLUS (6 bps) complété du module Expense Management (+2 bps).</w:t>
+      </w:r>
+      <w:r>
+        <w:rPr>
+          <w:rFonts w:ascii="Cambria" w:cs="Cambria" w:eastAsia="Cambria" w:hAnsi="Cambria"/>
+          <w:color w:val="3A3A3A"/>
+          <w:sz w:val="21"/>
+          <w:szCs w:val="21"/>
+        </w:rPr>
+        <w:t xml:space="preserve"> Visa facture en outre 25 000 USD de mise en œuvre, 14 000 USD de certification VCF et un minimum de 2 000 USD par mois : l’équilibre économique dépend du nombre de contrats signés.</w:t>
+      </w:r>
+    </w:p>
+    <w:p>
+      <w:pPr>
         <w:spacing w:after="80"/>
       </w:pPr>
     </w:p>
@@ -1506,6 +1626,9 @@
         <w:gridCol w:w="9638"/>
       </w:tblGrid>
       <w:tr>
+        <w:trPr>
+          <w:cantSplit/>
+        </w:trPr>
         <w:tc>
           <w:tcPr>
             <w:tcW w:type="dxa" w:w="9638"/>
@@ -1561,7 +1684,7 @@
                 <w:sz w:val="20"/>
                 <w:szCs w:val="20"/>
               </w:rPr>
-              <w:t xml:space="preserve">, en retenant le principe d’un lancement pilote auprès d’un petit groupe d’entreprises favorables, en ajustant la conception sur quatre points (plafonds et usage à l’étranger, circuit de validation/remboursement rapide, justificatifs digitaux, offre tarifaire accessible) et en </w:t>
+              <w:t xml:space="preserve">, en retenant le principe d’un lancement pilote auprès d’un petit groupe d’entreprises favorables, en ajustant la conception sur cinq points (plafonds et usage à l’étranger, circuit de validation rapide, justificatifs digitaux, modes de dotation complémentaires au retrait d’espèces, offre tarifaire d’entrée accessible) et en </w:t>
             </w:r>
             <w:r>
               <w:rPr>
@@ -1587,11 +1710,6 @@
         </w:tc>
       </w:tr>
     </w:tbl>
-    <w:p>
-      <w:r>
-        <w:br w:type="page"/>
-      </w:r>
-    </w:p>
     <w:p>
       <w:pPr>
         <w:pStyle w:val="Heading1"/>
@@ -1681,6 +1799,81 @@
           <w:szCs w:val="21"/>
         </w:rPr>
         <w:t xml:space="preserve">, une offre reposant sur des solutions éprouvées du marché. Un benchmark préalable a porté sur NCBA Bank (Kenya, déploiement en octobre 2023) et Access Bank (Nigeria, lancement en janvier 2026 pour les moyennes et grandes entreprises). L’absence d’offre structurée déployée à grande échelle au Cameroun et dans la CEMAC constitue l’opportunité de marché visée.</w:t>
+      </w:r>
+    </w:p>
+    <w:p>
+      <w:pPr>
+        <w:spacing w:after="120" w:line="300"/>
+        <w:jc w:val="both"/>
+      </w:pPr>
+      <w:r>
+        <w:rPr>
+          <w:rFonts w:ascii="Cambria" w:cs="Cambria" w:eastAsia="Cambria" w:hAnsi="Cambria"/>
+          <w:color w:val="3A3A3A"/>
+          <w:sz w:val="21"/>
+          <w:szCs w:val="21"/>
+        </w:rPr>
+        <w:t xml:space="preserve">La fiche idée produit de juin 2026 (dénommée « FirstSpend » dans ce document de travail, et « First Business Clarity » dans le protocole d’enquête) précise le dispositif. Il s’agit d’une </w:t>
+      </w:r>
+      <w:r>
+        <w:rPr>
+          <w:rFonts w:ascii="Cambria" w:cs="Cambria" w:eastAsia="Cambria" w:hAnsi="Cambria"/>
+          <w:b/>
+          <w:bCs/>
+          <w:color w:val="3A3A3A"/>
+          <w:sz w:val="21"/>
+          <w:szCs w:val="21"/>
+        </w:rPr>
+        <w:t xml:space="preserve">offre packagée</w:t>
+      </w:r>
+      <w:r>
+        <w:rPr>
+          <w:rFonts w:ascii="Cambria" w:cs="Cambria" w:eastAsia="Cambria" w:hAnsi="Cambria"/>
+          <w:color w:val="3A3A3A"/>
+          <w:sz w:val="21"/>
+          <w:szCs w:val="21"/>
+        </w:rPr>
+        <w:t xml:space="preserve"> : un pack d’au moins </w:t>
+      </w:r>
+      <w:r>
+        <w:rPr>
+          <w:rFonts w:ascii="Cambria" w:cs="Cambria" w:eastAsia="Cambria" w:hAnsi="Cambria"/>
+          <w:b/>
+          <w:bCs/>
+          <w:color w:val="3A3A3A"/>
+          <w:sz w:val="21"/>
+          <w:szCs w:val="21"/>
+        </w:rPr>
+        <w:t xml:space="preserve">20 cartes commerciales Visa</w:t>
+      </w:r>
+      <w:r>
+        <w:rPr>
+          <w:rFonts w:ascii="Cambria" w:cs="Cambria" w:eastAsia="Cambria" w:hAnsi="Cambria"/>
+          <w:color w:val="3A3A3A"/>
+          <w:sz w:val="21"/>
+          <w:szCs w:val="21"/>
+        </w:rPr>
+        <w:t xml:space="preserve"> (débit ou prépayées, dédiées aux paiements, </w:t>
+      </w:r>
+      <w:r>
+        <w:rPr>
+          <w:rFonts w:ascii="Cambria" w:cs="Cambria" w:eastAsia="Cambria" w:hAnsi="Cambria"/>
+          <w:b/>
+          <w:bCs/>
+          <w:color w:val="3A3A3A"/>
+          <w:sz w:val="21"/>
+          <w:szCs w:val="21"/>
+        </w:rPr>
+        <w:t xml:space="preserve">sans fonction de retrait d’espèces</w:t>
+      </w:r>
+      <w:r>
+        <w:rPr>
+          <w:rFonts w:ascii="Cambria" w:cs="Cambria" w:eastAsia="Cambria" w:hAnsi="Cambria"/>
+          <w:color w:val="3A3A3A"/>
+          <w:sz w:val="21"/>
+          <w:szCs w:val="21"/>
+        </w:rPr>
+        <w:t xml:space="preserve">), des cartes virtuelles et une plateforme de pilotage en temps réel accessible sur navigateur et application mobile. Afriland First Bank ne développe pas la plateforme : elle commercialise une solution Visa. Trois packages sont envisagés (Starter de 20 à 49 cartes, Business de 50 à 199 cartes, Corporate+ à partir de 200 cartes). Le marché adressable est estimé à environ 300 grandes entreprises et 1 200 PME/ETI structurées au Cameroun, avec un pilote auprès de 3 à 5 grandes entreprises et un seuil de rentabilité d’environ 500 cartes actives.</w:t>
       </w:r>
     </w:p>
     <w:p>
@@ -2241,7 +2434,7 @@
                 <w:sz w:val="18"/>
                 <w:szCs w:val="18"/>
               </w:rPr>
-              <w:t xml:space="preserve">Sections 5.4 et 8</w:t>
+              <w:t xml:space="preserve">Sections 5.4, 8 et 9</w:t>
             </w:r>
           </w:p>
         </w:tc>
@@ -3188,7 +3381,487 @@
           <w:sz w:val="25"/>
           <w:szCs w:val="25"/>
         </w:rPr>
-        <w:t xml:space="preserve">3.4 Traitement et limites de l’analyse</w:t>
+        <w:t xml:space="preserve">3.4 Documents de référence mobilisés</w:t>
+      </w:r>
+    </w:p>
+    <w:tbl>
+      <w:tblPr>
+        <w:tblW w:type="dxa" w:w="9638"/>
+        <w:tblBorders>
+          <w:top w:val="single" w:color="auto" w:sz="4"/>
+          <w:left w:val="single" w:color="auto" w:sz="4"/>
+          <w:bottom w:val="single" w:color="auto" w:sz="4"/>
+          <w:right w:val="single" w:color="auto" w:sz="4"/>
+          <w:insideH w:val="single" w:color="auto" w:sz="4"/>
+          <w:insideV w:val="single" w:color="auto" w:sz="4"/>
+        </w:tblBorders>
+      </w:tblPr>
+      <w:tblGrid>
+        <w:gridCol w:w="4300"/>
+        <w:gridCol w:w="5338"/>
+      </w:tblGrid>
+      <w:tr>
+        <w:trPr>
+          <w:cantSplit/>
+          <w:tblHeader/>
+        </w:trPr>
+        <w:tc>
+          <w:tcPr>
+            <w:tcW w:type="dxa" w:w="4300"/>
+            <w:tcBorders>
+              <w:top w:val="single" w:color="BFBFBF" w:sz="4"/>
+              <w:left w:val="single" w:color="BFBFBF" w:sz="4"/>
+              <w:bottom w:val="single" w:color="BFBFBF" w:sz="4"/>
+              <w:right w:val="single" w:color="BFBFBF" w:sz="4"/>
+            </w:tcBorders>
+            <w:shd w:fill="C00000" w:color="auto" w:val="clear"/>
+            <w:tcMar>
+              <w:top w:type="dxa" w:w="60"/>
+              <w:left w:type="dxa" w:w="90"/>
+              <w:bottom w:type="dxa" w:w="60"/>
+              <w:right w:type="dxa" w:w="90"/>
+            </w:tcMar>
+            <w:vAlign w:val="center"/>
+          </w:tcPr>
+          <w:p>
+            <w:pPr>
+              <w:spacing w:after="30" w:line="250"/>
+              <w:jc w:val="left"/>
+            </w:pPr>
+            <w:r>
+              <w:rPr>
+                <w:rFonts w:ascii="Cambria" w:cs="Cambria" w:eastAsia="Cambria" w:hAnsi="Cambria"/>
+                <w:b/>
+                <w:bCs/>
+                <w:color w:val="FFFFFF"/>
+                <w:sz w:val="18"/>
+                <w:szCs w:val="18"/>
+              </w:rPr>
+              <w:t xml:space="preserve">Document</w:t>
+            </w:r>
+          </w:p>
+        </w:tc>
+        <w:tc>
+          <w:tcPr>
+            <w:tcW w:type="dxa" w:w="5338"/>
+            <w:tcBorders>
+              <w:top w:val="single" w:color="BFBFBF" w:sz="4"/>
+              <w:left w:val="single" w:color="BFBFBF" w:sz="4"/>
+              <w:bottom w:val="single" w:color="BFBFBF" w:sz="4"/>
+              <w:right w:val="single" w:color="BFBFBF" w:sz="4"/>
+            </w:tcBorders>
+            <w:shd w:fill="C00000" w:color="auto" w:val="clear"/>
+            <w:tcMar>
+              <w:top w:type="dxa" w:w="60"/>
+              <w:left w:type="dxa" w:w="90"/>
+              <w:bottom w:type="dxa" w:w="60"/>
+              <w:right w:type="dxa" w:w="90"/>
+            </w:tcMar>
+            <w:vAlign w:val="center"/>
+          </w:tcPr>
+          <w:p>
+            <w:pPr>
+              <w:spacing w:after="30" w:line="250"/>
+              <w:jc w:val="left"/>
+            </w:pPr>
+            <w:r>
+              <w:rPr>
+                <w:rFonts w:ascii="Cambria" w:cs="Cambria" w:eastAsia="Cambria" w:hAnsi="Cambria"/>
+                <w:b/>
+                <w:bCs/>
+                <w:color w:val="FFFFFF"/>
+                <w:sz w:val="18"/>
+                <w:szCs w:val="18"/>
+              </w:rPr>
+              <w:t xml:space="preserve">Usage dans ce rapport</w:t>
+            </w:r>
+          </w:p>
+        </w:tc>
+      </w:tr>
+      <w:tr>
+        <w:trPr>
+          <w:cantSplit/>
+        </w:trPr>
+        <w:tc>
+          <w:tcPr>
+            <w:tcW w:type="dxa" w:w="4300"/>
+            <w:tcBorders>
+              <w:top w:val="single" w:color="BFBFBF" w:sz="4"/>
+              <w:left w:val="single" w:color="BFBFBF" w:sz="4"/>
+              <w:bottom w:val="single" w:color="BFBFBF" w:sz="4"/>
+              <w:right w:val="single" w:color="BFBFBF" w:sz="4"/>
+            </w:tcBorders>
+            <w:tcMar>
+              <w:top w:type="dxa" w:w="60"/>
+              <w:left w:type="dxa" w:w="90"/>
+              <w:bottom w:type="dxa" w:w="60"/>
+              <w:right w:type="dxa" w:w="90"/>
+            </w:tcMar>
+            <w:vAlign w:val="center"/>
+          </w:tcPr>
+          <w:p>
+            <w:pPr>
+              <w:spacing w:after="30" w:line="250"/>
+              <w:jc w:val="left"/>
+            </w:pPr>
+            <w:r>
+              <w:rPr>
+                <w:rFonts w:ascii="Cambria" w:cs="Cambria" w:eastAsia="Cambria" w:hAnsi="Cambria"/>
+                <w:color w:val="3A3A3A"/>
+                <w:sz w:val="18"/>
+                <w:szCs w:val="18"/>
+              </w:rPr>
+              <w:t xml:space="preserve">Protocole d’étude First Business Clarity (18/08/2026)</w:t>
+            </w:r>
+          </w:p>
+        </w:tc>
+        <w:tc>
+          <w:tcPr>
+            <w:tcW w:type="dxa" w:w="5338"/>
+            <w:tcBorders>
+              <w:top w:val="single" w:color="BFBFBF" w:sz="4"/>
+              <w:left w:val="single" w:color="BFBFBF" w:sz="4"/>
+              <w:bottom w:val="single" w:color="BFBFBF" w:sz="4"/>
+              <w:right w:val="single" w:color="BFBFBF" w:sz="4"/>
+            </w:tcBorders>
+            <w:tcMar>
+              <w:top w:type="dxa" w:w="60"/>
+              <w:left w:type="dxa" w:w="90"/>
+              <w:bottom w:type="dxa" w:w="60"/>
+              <w:right w:type="dxa" w:w="90"/>
+            </w:tcMar>
+            <w:vAlign w:val="center"/>
+          </w:tcPr>
+          <w:p>
+            <w:pPr>
+              <w:spacing w:after="30" w:line="250"/>
+              <w:jc w:val="left"/>
+            </w:pPr>
+            <w:r>
+              <w:rPr>
+                <w:rFonts w:ascii="Cambria" w:cs="Cambria" w:eastAsia="Cambria" w:hAnsi="Cambria"/>
+                <w:color w:val="3A3A3A"/>
+                <w:sz w:val="18"/>
+                <w:szCs w:val="18"/>
+              </w:rPr>
+              <w:t xml:space="preserve">Objectifs, cible, méthode, guide d’entretien</w:t>
+            </w:r>
+          </w:p>
+        </w:tc>
+      </w:tr>
+      <w:tr>
+        <w:trPr>
+          <w:cantSplit/>
+        </w:trPr>
+        <w:tc>
+          <w:tcPr>
+            <w:tcW w:type="dxa" w:w="4300"/>
+            <w:tcBorders>
+              <w:top w:val="single" w:color="BFBFBF" w:sz="4"/>
+              <w:left w:val="single" w:color="BFBFBF" w:sz="4"/>
+              <w:bottom w:val="single" w:color="BFBFBF" w:sz="4"/>
+              <w:right w:val="single" w:color="BFBFBF" w:sz="4"/>
+            </w:tcBorders>
+            <w:shd w:fill="F2F2F2" w:color="auto" w:val="clear"/>
+            <w:tcMar>
+              <w:top w:type="dxa" w:w="60"/>
+              <w:left w:type="dxa" w:w="90"/>
+              <w:bottom w:type="dxa" w:w="60"/>
+              <w:right w:type="dxa" w:w="90"/>
+            </w:tcMar>
+            <w:vAlign w:val="center"/>
+          </w:tcPr>
+          <w:p>
+            <w:pPr>
+              <w:spacing w:after="30" w:line="250"/>
+              <w:jc w:val="left"/>
+            </w:pPr>
+            <w:r>
+              <w:rPr>
+                <w:rFonts w:ascii="Cambria" w:cs="Cambria" w:eastAsia="Cambria" w:hAnsi="Cambria"/>
+                <w:color w:val="3A3A3A"/>
+                <w:sz w:val="18"/>
+                <w:szCs w:val="18"/>
+              </w:rPr>
+              <w:t xml:space="preserve">Fiche idée produit « FirstSpend » (juin 2026)</w:t>
+            </w:r>
+          </w:p>
+        </w:tc>
+        <w:tc>
+          <w:tcPr>
+            <w:tcW w:type="dxa" w:w="5338"/>
+            <w:tcBorders>
+              <w:top w:val="single" w:color="BFBFBF" w:sz="4"/>
+              <w:left w:val="single" w:color="BFBFBF" w:sz="4"/>
+              <w:bottom w:val="single" w:color="BFBFBF" w:sz="4"/>
+              <w:right w:val="single" w:color="BFBFBF" w:sz="4"/>
+            </w:tcBorders>
+            <w:shd w:fill="F2F2F2" w:color="auto" w:val="clear"/>
+            <w:tcMar>
+              <w:top w:type="dxa" w:w="60"/>
+              <w:left w:type="dxa" w:w="90"/>
+              <w:bottom w:type="dxa" w:w="60"/>
+              <w:right w:type="dxa" w:w="90"/>
+            </w:tcMar>
+            <w:vAlign w:val="center"/>
+          </w:tcPr>
+          <w:p>
+            <w:pPr>
+              <w:spacing w:after="30" w:line="250"/>
+              <w:jc w:val="left"/>
+            </w:pPr>
+            <w:r>
+              <w:rPr>
+                <w:rFonts w:ascii="Cambria" w:cs="Cambria" w:eastAsia="Cambria" w:hAnsi="Cambria"/>
+                <w:color w:val="3A3A3A"/>
+                <w:sz w:val="18"/>
+                <w:szCs w:val="18"/>
+              </w:rPr>
+              <w:t xml:space="preserve">Caractéristiques de l’offre, packages tarifaires, cible, risques, planning : base de la comparaison (section 7)</w:t>
+            </w:r>
+          </w:p>
+        </w:tc>
+      </w:tr>
+      <w:tr>
+        <w:trPr>
+          <w:cantSplit/>
+        </w:trPr>
+        <w:tc>
+          <w:tcPr>
+            <w:tcW w:type="dxa" w:w="4300"/>
+            <w:tcBorders>
+              <w:top w:val="single" w:color="BFBFBF" w:sz="4"/>
+              <w:left w:val="single" w:color="BFBFBF" w:sz="4"/>
+              <w:bottom w:val="single" w:color="BFBFBF" w:sz="4"/>
+              <w:right w:val="single" w:color="BFBFBF" w:sz="4"/>
+            </w:tcBorders>
+            <w:tcMar>
+              <w:top w:type="dxa" w:w="60"/>
+              <w:left w:type="dxa" w:w="90"/>
+              <w:bottom w:type="dxa" w:w="60"/>
+              <w:right w:type="dxa" w:w="90"/>
+            </w:tcMar>
+            <w:vAlign w:val="center"/>
+          </w:tcPr>
+          <w:p>
+            <w:pPr>
+              <w:spacing w:after="30" w:line="250"/>
+              <w:jc w:val="left"/>
+            </w:pPr>
+            <w:r>
+              <w:rPr>
+                <w:rFonts w:ascii="Cambria" w:cs="Cambria" w:eastAsia="Cambria" w:hAnsi="Cambria"/>
+                <w:color w:val="3A3A3A"/>
+                <w:sz w:val="18"/>
+                <w:szCs w:val="18"/>
+              </w:rPr>
+              <w:t xml:space="preserve">Visa Spend Clarity for Enterprise Pricing (2023)</w:t>
+            </w:r>
+          </w:p>
+        </w:tc>
+        <w:tc>
+          <w:tcPr>
+            <w:tcW w:type="dxa" w:w="5338"/>
+            <w:tcBorders>
+              <w:top w:val="single" w:color="BFBFBF" w:sz="4"/>
+              <w:left w:val="single" w:color="BFBFBF" w:sz="4"/>
+              <w:bottom w:val="single" w:color="BFBFBF" w:sz="4"/>
+              <w:right w:val="single" w:color="BFBFBF" w:sz="4"/>
+            </w:tcBorders>
+            <w:tcMar>
+              <w:top w:type="dxa" w:w="60"/>
+              <w:left w:type="dxa" w:w="90"/>
+              <w:bottom w:type="dxa" w:w="60"/>
+              <w:right w:type="dxa" w:w="90"/>
+            </w:tcMar>
+            <w:vAlign w:val="center"/>
+          </w:tcPr>
+          <w:p>
+            <w:pPr>
+              <w:spacing w:after="30" w:line="250"/>
+              <w:jc w:val="left"/>
+            </w:pPr>
+            <w:r>
+              <w:rPr>
+                <w:rFonts w:ascii="Cambria" w:cs="Cambria" w:eastAsia="Cambria" w:hAnsi="Cambria"/>
+                <w:color w:val="3A3A3A"/>
+                <w:sz w:val="18"/>
+                <w:szCs w:val="18"/>
+              </w:rPr>
+              <w:t xml:space="preserve">Coûts d’accès à la solution pour la banque (section 8)</w:t>
+            </w:r>
+          </w:p>
+        </w:tc>
+      </w:tr>
+      <w:tr>
+        <w:trPr>
+          <w:cantSplit/>
+        </w:trPr>
+        <w:tc>
+          <w:tcPr>
+            <w:tcW w:type="dxa" w:w="4300"/>
+            <w:tcBorders>
+              <w:top w:val="single" w:color="BFBFBF" w:sz="4"/>
+              <w:left w:val="single" w:color="BFBFBF" w:sz="4"/>
+              <w:bottom w:val="single" w:color="BFBFBF" w:sz="4"/>
+              <w:right w:val="single" w:color="BFBFBF" w:sz="4"/>
+            </w:tcBorders>
+            <w:shd w:fill="F2F2F2" w:color="auto" w:val="clear"/>
+            <w:tcMar>
+              <w:top w:type="dxa" w:w="60"/>
+              <w:left w:type="dxa" w:w="90"/>
+              <w:bottom w:type="dxa" w:w="60"/>
+              <w:right w:type="dxa" w:w="90"/>
+            </w:tcMar>
+            <w:vAlign w:val="center"/>
+          </w:tcPr>
+          <w:p>
+            <w:pPr>
+              <w:spacing w:after="30" w:line="250"/>
+              <w:jc w:val="left"/>
+            </w:pPr>
+            <w:r>
+              <w:rPr>
+                <w:rFonts w:ascii="Cambria" w:cs="Cambria" w:eastAsia="Cambria" w:hAnsi="Cambria"/>
+                <w:color w:val="3A3A3A"/>
+                <w:sz w:val="18"/>
+                <w:szCs w:val="18"/>
+              </w:rPr>
+              <w:t xml:space="preserve">Visa Data File Delivery Options</w:t>
+            </w:r>
+          </w:p>
+        </w:tc>
+        <w:tc>
+          <w:tcPr>
+            <w:tcW w:type="dxa" w:w="5338"/>
+            <w:tcBorders>
+              <w:top w:val="single" w:color="BFBFBF" w:sz="4"/>
+              <w:left w:val="single" w:color="BFBFBF" w:sz="4"/>
+              <w:bottom w:val="single" w:color="BFBFBF" w:sz="4"/>
+              <w:right w:val="single" w:color="BFBFBF" w:sz="4"/>
+            </w:tcBorders>
+            <w:shd w:fill="F2F2F2" w:color="auto" w:val="clear"/>
+            <w:tcMar>
+              <w:top w:type="dxa" w:w="60"/>
+              <w:left w:type="dxa" w:w="90"/>
+              <w:bottom w:type="dxa" w:w="60"/>
+              <w:right w:type="dxa" w:w="90"/>
+            </w:tcMar>
+            <w:vAlign w:val="center"/>
+          </w:tcPr>
+          <w:p>
+            <w:pPr>
+              <w:spacing w:after="30" w:line="250"/>
+              <w:jc w:val="left"/>
+            </w:pPr>
+            <w:r>
+              <w:rPr>
+                <w:rFonts w:ascii="Cambria" w:cs="Cambria" w:eastAsia="Cambria" w:hAnsi="Cambria"/>
+                <w:color w:val="3A3A3A"/>
+                <w:sz w:val="18"/>
+                <w:szCs w:val="18"/>
+              </w:rPr>
+              <w:t xml:space="preserve">Modalités techniques de transmission des fichiers à Visa (section 8)</w:t>
+            </w:r>
+          </w:p>
+        </w:tc>
+      </w:tr>
+      <w:tr>
+        <w:trPr>
+          <w:cantSplit/>
+        </w:trPr>
+        <w:tc>
+          <w:tcPr>
+            <w:tcW w:type="dxa" w:w="4300"/>
+            <w:tcBorders>
+              <w:top w:val="single" w:color="BFBFBF" w:sz="4"/>
+              <w:left w:val="single" w:color="BFBFBF" w:sz="4"/>
+              <w:bottom w:val="single" w:color="BFBFBF" w:sz="4"/>
+              <w:right w:val="single" w:color="BFBFBF" w:sz="4"/>
+            </w:tcBorders>
+            <w:tcMar>
+              <w:top w:type="dxa" w:w="60"/>
+              <w:left w:type="dxa" w:w="90"/>
+              <w:bottom w:type="dxa" w:w="60"/>
+              <w:right w:type="dxa" w:w="90"/>
+            </w:tcMar>
+            <w:vAlign w:val="center"/>
+          </w:tcPr>
+          <w:p>
+            <w:pPr>
+              <w:spacing w:after="30" w:line="250"/>
+              <w:jc w:val="left"/>
+            </w:pPr>
+            <w:r>
+              <w:rPr>
+                <w:rFonts w:ascii="Cambria" w:cs="Cambria" w:eastAsia="Cambria" w:hAnsi="Cambria"/>
+                <w:color w:val="3A3A3A"/>
+                <w:sz w:val="18"/>
+                <w:szCs w:val="18"/>
+              </w:rPr>
+              <w:t xml:space="preserve">Échantillon de fichiers VCF 4.4 (archive ZIP)</w:t>
+            </w:r>
+          </w:p>
+        </w:tc>
+        <w:tc>
+          <w:tcPr>
+            <w:tcW w:type="dxa" w:w="5338"/>
+            <w:tcBorders>
+              <w:top w:val="single" w:color="BFBFBF" w:sz="4"/>
+              <w:left w:val="single" w:color="BFBFBF" w:sz="4"/>
+              <w:bottom w:val="single" w:color="BFBFBF" w:sz="4"/>
+              <w:right w:val="single" w:color="BFBFBF" w:sz="4"/>
+            </w:tcBorders>
+            <w:tcMar>
+              <w:top w:type="dxa" w:w="60"/>
+              <w:left w:type="dxa" w:w="90"/>
+              <w:bottom w:type="dxa" w:w="60"/>
+              <w:right w:type="dxa" w:w="90"/>
+            </w:tcMar>
+            <w:vAlign w:val="center"/>
+          </w:tcPr>
+          <w:p>
+            <w:pPr>
+              <w:spacing w:after="30" w:line="250"/>
+              <w:jc w:val="left"/>
+            </w:pPr>
+            <w:r>
+              <w:rPr>
+                <w:rFonts w:ascii="Cambria" w:cs="Cambria" w:eastAsia="Cambria" w:hAnsi="Cambria"/>
+                <w:color w:val="3A3A3A"/>
+                <w:sz w:val="18"/>
+                <w:szCs w:val="18"/>
+              </w:rPr>
+              <w:t xml:space="preserve">Archive protégée par mot de passe : non analysée</w:t>
+            </w:r>
+          </w:p>
+        </w:tc>
+      </w:tr>
+    </w:tbl>
+    <w:p>
+      <w:pPr>
+        <w:spacing w:after="80"/>
+      </w:pPr>
+    </w:p>
+    <w:p>
+      <w:pPr>
+        <w:pStyle w:val="Heading2"/>
+        <w:keepNext/>
+        <w:pBdr>
+          <w:bottom w:val="single" w:color="C00000" w:sz="6" w:space="2"/>
+        </w:pBdr>
+        <w:spacing w:after="120" w:before="260"/>
+      </w:pPr>
+      <w:r>
+        <w:rPr>
+          <w:rFonts w:ascii="Cambria" w:cs="Cambria" w:eastAsia="Cambria" w:hAnsi="Cambria"/>
+          <w:b/>
+          <w:bCs/>
+          <w:color w:val="C00000"/>
+          <w:sz w:val="25"/>
+          <w:szCs w:val="25"/>
+        </w:rPr>
+        <w:t xml:space="preserve">3.5 Traitement et limites de l’analyse</w:t>
       </w:r>
     </w:p>
     <w:p>
@@ -3799,6 +4472,79 @@
                 <w:szCs w:val="18"/>
               </w:rPr>
               <w:t xml:space="preserve">Lecture qualitative uniquement ; seuils à fixer pour la phase complémentaire</w:t>
+            </w:r>
+          </w:p>
+        </w:tc>
+      </w:tr>
+      <w:tr>
+        <w:trPr>
+          <w:cantSplit/>
+        </w:trPr>
+        <w:tc>
+          <w:tcPr>
+            <w:tcW w:type="dxa" w:w="4700"/>
+            <w:tcBorders>
+              <w:top w:val="single" w:color="BFBFBF" w:sz="4"/>
+              <w:left w:val="single" w:color="BFBFBF" w:sz="4"/>
+              <w:bottom w:val="single" w:color="BFBFBF" w:sz="4"/>
+              <w:right w:val="single" w:color="BFBFBF" w:sz="4"/>
+            </w:tcBorders>
+            <w:shd w:fill="F2F2F2" w:color="auto" w:val="clear"/>
+            <w:tcMar>
+              <w:top w:type="dxa" w:w="60"/>
+              <w:left w:type="dxa" w:w="90"/>
+              <w:bottom w:type="dxa" w:w="60"/>
+              <w:right w:type="dxa" w:w="90"/>
+            </w:tcMar>
+            <w:vAlign w:val="center"/>
+          </w:tcPr>
+          <w:p>
+            <w:pPr>
+              <w:spacing w:after="30" w:line="250"/>
+              <w:jc w:val="left"/>
+            </w:pPr>
+            <w:r>
+              <w:rPr>
+                <w:rFonts w:ascii="Cambria" w:cs="Cambria" w:eastAsia="Cambria" w:hAnsi="Cambria"/>
+                <w:color w:val="3A3A3A"/>
+                <w:sz w:val="18"/>
+                <w:szCs w:val="18"/>
+              </w:rPr>
+              <w:t xml:space="preserve">Tarifs Visa de 2023, document confidentiel Visa ; échantillon VCF non lisible</w:t>
+            </w:r>
+          </w:p>
+        </w:tc>
+        <w:tc>
+          <w:tcPr>
+            <w:tcW w:type="dxa" w:w="4938"/>
+            <w:tcBorders>
+              <w:top w:val="single" w:color="BFBFBF" w:sz="4"/>
+              <w:left w:val="single" w:color="BFBFBF" w:sz="4"/>
+              <w:bottom w:val="single" w:color="BFBFBF" w:sz="4"/>
+              <w:right w:val="single" w:color="BFBFBF" w:sz="4"/>
+            </w:tcBorders>
+            <w:shd w:fill="F2F2F2" w:color="auto" w:val="clear"/>
+            <w:tcMar>
+              <w:top w:type="dxa" w:w="60"/>
+              <w:left w:type="dxa" w:w="90"/>
+              <w:bottom w:type="dxa" w:w="60"/>
+              <w:right w:type="dxa" w:w="90"/>
+            </w:tcMar>
+            <w:vAlign w:val="center"/>
+          </w:tcPr>
+          <w:p>
+            <w:pPr>
+              <w:spacing w:after="30" w:line="250"/>
+              <w:jc w:val="left"/>
+            </w:pPr>
+            <w:r>
+              <w:rPr>
+                <w:rFonts w:ascii="Cambria" w:cs="Cambria" w:eastAsia="Cambria" w:hAnsi="Cambria"/>
+                <w:color w:val="3A3A3A"/>
+                <w:sz w:val="18"/>
+                <w:szCs w:val="18"/>
+              </w:rPr>
+              <w:t xml:space="preserve">Coûts à réactualiser avec Visa ; analyse technique du format VCF non réalisée</w:t>
             </w:r>
           </w:p>
         </w:tc>
@@ -5275,6 +6021,9 @@
         <w:gridCol w:w="9638"/>
       </w:tblGrid>
       <w:tr>
+        <w:trPr>
+          <w:cantSplit/>
+        </w:trPr>
         <w:tc>
           <w:tcPr>
             <w:tcW w:type="dxa" w:w="9638"/>
@@ -10024,7 +10773,7 @@
                 <w:sz w:val="18"/>
                 <w:szCs w:val="18"/>
               </w:rPr>
-              <w:t xml:space="preserve">Condition la plus citée</w:t>
+              <w:t xml:space="preserve">Condition la plus citée ; un contrat Starter coûte au moins 2,0 M FCFA la première année (20 cartes × 10 000 FCFA + 12 × 150 000 FCFA), hors commissions</w:t>
             </w:r>
           </w:p>
         </w:tc>
@@ -10061,6 +10810,229 @@
                 <w:szCs w:val="18"/>
               </w:rPr>
               <w:t xml:space="preserve">Définir une grille tarifaire d’entrée accessible (période d’essai, modules)</w:t>
+            </w:r>
+          </w:p>
+        </w:tc>
+      </w:tr>
+      <w:tr>
+        <w:trPr>
+          <w:cantSplit/>
+        </w:trPr>
+        <w:tc>
+          <w:tcPr>
+            <w:tcW w:type="dxa" w:w="2300"/>
+            <w:tcBorders>
+              <w:top w:val="single" w:color="BFBFBF" w:sz="4"/>
+              <w:left w:val="single" w:color="BFBFBF" w:sz="4"/>
+              <w:bottom w:val="single" w:color="BFBFBF" w:sz="4"/>
+              <w:right w:val="single" w:color="BFBFBF" w:sz="4"/>
+            </w:tcBorders>
+            <w:tcMar>
+              <w:top w:type="dxa" w:w="60"/>
+              <w:left w:type="dxa" w:w="90"/>
+              <w:bottom w:type="dxa" w:w="60"/>
+              <w:right w:type="dxa" w:w="90"/>
+            </w:tcMar>
+            <w:vAlign w:val="center"/>
+          </w:tcPr>
+          <w:p>
+            <w:pPr>
+              <w:spacing w:after="30" w:line="250"/>
+              <w:jc w:val="left"/>
+            </w:pPr>
+            <w:r>
+              <w:rPr>
+                <w:rFonts w:ascii="Cambria" w:cs="Cambria" w:eastAsia="Cambria" w:hAnsi="Cambria"/>
+                <w:b/>
+                <w:bCs/>
+                <w:color w:val="3A3A3A"/>
+                <w:sz w:val="18"/>
+                <w:szCs w:val="18"/>
+              </w:rPr>
+              <w:t xml:space="preserve">Cartes sans retrait d’espèces</w:t>
+            </w:r>
+          </w:p>
+        </w:tc>
+        <w:tc>
+          <w:tcPr>
+            <w:tcW w:type="dxa" w:w="3900"/>
+            <w:tcBorders>
+              <w:top w:val="single" w:color="BFBFBF" w:sz="4"/>
+              <w:left w:val="single" w:color="BFBFBF" w:sz="4"/>
+              <w:bottom w:val="single" w:color="BFBFBF" w:sz="4"/>
+              <w:right w:val="single" w:color="BFBFBF" w:sz="4"/>
+            </w:tcBorders>
+            <w:tcMar>
+              <w:top w:type="dxa" w:w="60"/>
+              <w:left w:type="dxa" w:w="90"/>
+              <w:bottom w:type="dxa" w:w="60"/>
+              <w:right w:type="dxa" w:w="90"/>
+            </w:tcMar>
+            <w:vAlign w:val="center"/>
+          </w:tcPr>
+          <w:p>
+            <w:pPr>
+              <w:spacing w:after="30" w:line="250"/>
+              <w:jc w:val="left"/>
+            </w:pPr>
+            <w:r>
+              <w:rPr>
+                <w:rFonts w:ascii="Cambria" w:cs="Cambria" w:eastAsia="Cambria" w:hAnsi="Cambria"/>
+                <w:b w:val="false"/>
+                <w:bCs w:val="false"/>
+                <w:color w:val="3A3A3A"/>
+                <w:sz w:val="18"/>
+                <w:szCs w:val="18"/>
+              </w:rPr>
+              <w:t xml:space="preserve">67 % des répondants règlent des dépenses en espèces (frais de mission, zones rurales, petits montants) que la carte seule ne remplace pas</w:t>
+            </w:r>
+          </w:p>
+        </w:tc>
+        <w:tc>
+          <w:tcPr>
+            <w:tcW w:type="dxa" w:w="3438"/>
+            <w:tcBorders>
+              <w:top w:val="single" w:color="BFBFBF" w:sz="4"/>
+              <w:left w:val="single" w:color="BFBFBF" w:sz="4"/>
+              <w:bottom w:val="single" w:color="BFBFBF" w:sz="4"/>
+              <w:right w:val="single" w:color="BFBFBF" w:sz="4"/>
+            </w:tcBorders>
+            <w:tcMar>
+              <w:top w:type="dxa" w:w="60"/>
+              <w:left w:type="dxa" w:w="90"/>
+              <w:bottom w:type="dxa" w:w="60"/>
+              <w:right w:type="dxa" w:w="90"/>
+            </w:tcMar>
+            <w:vAlign w:val="center"/>
+          </w:tcPr>
+          <w:p>
+            <w:pPr>
+              <w:spacing w:after="30" w:line="250"/>
+              <w:jc w:val="left"/>
+            </w:pPr>
+            <w:r>
+              <w:rPr>
+                <w:rFonts w:ascii="Cambria" w:cs="Cambria" w:eastAsia="Cambria" w:hAnsi="Cambria"/>
+                <w:b w:val="false"/>
+                <w:bCs w:val="false"/>
+                <w:color w:val="3A3A3A"/>
+                <w:sz w:val="18"/>
+                <w:szCs w:val="18"/>
+              </w:rPr>
+              <w:t xml:space="preserve">Prévoir des dotations complémentaires (virement, mobile money) ou un retrait encadré</w:t>
+            </w:r>
+          </w:p>
+        </w:tc>
+      </w:tr>
+      <w:tr>
+        <w:trPr>
+          <w:cantSplit/>
+        </w:trPr>
+        <w:tc>
+          <w:tcPr>
+            <w:tcW w:type="dxa" w:w="2300"/>
+            <w:tcBorders>
+              <w:top w:val="single" w:color="BFBFBF" w:sz="4"/>
+              <w:left w:val="single" w:color="BFBFBF" w:sz="4"/>
+              <w:bottom w:val="single" w:color="BFBFBF" w:sz="4"/>
+              <w:right w:val="single" w:color="BFBFBF" w:sz="4"/>
+            </w:tcBorders>
+            <w:shd w:fill="F2F2F2" w:color="auto" w:val="clear"/>
+            <w:tcMar>
+              <w:top w:type="dxa" w:w="60"/>
+              <w:left w:type="dxa" w:w="90"/>
+              <w:bottom w:type="dxa" w:w="60"/>
+              <w:right w:type="dxa" w:w="90"/>
+            </w:tcMar>
+            <w:vAlign w:val="center"/>
+          </w:tcPr>
+          <w:p>
+            <w:pPr>
+              <w:spacing w:after="30" w:line="250"/>
+              <w:jc w:val="left"/>
+            </w:pPr>
+            <w:r>
+              <w:rPr>
+                <w:rFonts w:ascii="Cambria" w:cs="Cambria" w:eastAsia="Cambria" w:hAnsi="Cambria"/>
+                <w:b/>
+                <w:bCs/>
+                <w:color w:val="3A3A3A"/>
+                <w:sz w:val="18"/>
+                <w:szCs w:val="18"/>
+              </w:rPr>
+              <w:t xml:space="preserve">Minimum de 20 cartes par contrat</w:t>
+            </w:r>
+          </w:p>
+        </w:tc>
+        <w:tc>
+          <w:tcPr>
+            <w:tcW w:type="dxa" w:w="3900"/>
+            <w:tcBorders>
+              <w:top w:val="single" w:color="BFBFBF" w:sz="4"/>
+              <w:left w:val="single" w:color="BFBFBF" w:sz="4"/>
+              <w:bottom w:val="single" w:color="BFBFBF" w:sz="4"/>
+              <w:right w:val="single" w:color="BFBFBF" w:sz="4"/>
+            </w:tcBorders>
+            <w:shd w:fill="F2F2F2" w:color="auto" w:val="clear"/>
+            <w:tcMar>
+              <w:top w:type="dxa" w:w="60"/>
+              <w:left w:type="dxa" w:w="90"/>
+              <w:bottom w:type="dxa" w:w="60"/>
+              <w:right w:type="dxa" w:w="90"/>
+            </w:tcMar>
+            <w:vAlign w:val="center"/>
+          </w:tcPr>
+          <w:p>
+            <w:pPr>
+              <w:spacing w:after="30" w:line="250"/>
+              <w:jc w:val="left"/>
+            </w:pPr>
+            <w:r>
+              <w:rPr>
+                <w:rFonts w:ascii="Cambria" w:cs="Cambria" w:eastAsia="Cambria" w:hAnsi="Cambria"/>
+                <w:b w:val="false"/>
+                <w:bCs w:val="false"/>
+                <w:color w:val="3A3A3A"/>
+                <w:sz w:val="18"/>
+                <w:szCs w:val="18"/>
+              </w:rPr>
+              <w:t xml:space="preserve">Échantillon composé de petites entreprises locales (20/27) ; nombre de collaborateurs à équiper non relevé</w:t>
+            </w:r>
+          </w:p>
+        </w:tc>
+        <w:tc>
+          <w:tcPr>
+            <w:tcW w:type="dxa" w:w="3438"/>
+            <w:tcBorders>
+              <w:top w:val="single" w:color="BFBFBF" w:sz="4"/>
+              <w:left w:val="single" w:color="BFBFBF" w:sz="4"/>
+              <w:bottom w:val="single" w:color="BFBFBF" w:sz="4"/>
+              <w:right w:val="single" w:color="BFBFBF" w:sz="4"/>
+            </w:tcBorders>
+            <w:shd w:fill="F2F2F2" w:color="auto" w:val="clear"/>
+            <w:tcMar>
+              <w:top w:type="dxa" w:w="60"/>
+              <w:left w:type="dxa" w:w="90"/>
+              <w:bottom w:type="dxa" w:w="60"/>
+              <w:right w:type="dxa" w:w="90"/>
+            </w:tcMar>
+            <w:vAlign w:val="center"/>
+          </w:tcPr>
+          <w:p>
+            <w:pPr>
+              <w:spacing w:after="30" w:line="250"/>
+              <w:jc w:val="left"/>
+            </w:pPr>
+            <w:r>
+              <w:rPr>
+                <w:rFonts w:ascii="Cambria" w:cs="Cambria" w:eastAsia="Cambria" w:hAnsi="Cambria"/>
+                <w:b w:val="false"/>
+                <w:bCs w:val="false"/>
+                <w:color w:val="3A3A3A"/>
+                <w:sz w:val="18"/>
+                <w:szCs w:val="18"/>
+              </w:rPr>
+              <w:t xml:space="preserve">Mesurer le nombre de porteurs potentiels ; étudier une entrée sous 20 cartes</w:t>
             </w:r>
           </w:p>
         </w:tc>
@@ -10272,7 +11244,7 @@
                 <w:sz w:val="18"/>
                 <w:szCs w:val="18"/>
               </w:rPr>
-              <w:t xml:space="preserve">Marché : gestion manuelle et absence d’offre structurée</w:t>
+              <w:t xml:space="preserve">Constat de départ : gestion manuelle et absence d’offre structurée</w:t>
             </w:r>
           </w:p>
         </w:tc>
@@ -10342,7 +11314,7 @@
                 <w:sz w:val="18"/>
                 <w:szCs w:val="18"/>
               </w:rPr>
-              <w:t xml:space="preserve">Confirmé (indicatif)</w:t>
+              <w:t xml:space="preserve">Confirmé</w:t>
             </w:r>
           </w:p>
         </w:tc>
@@ -10383,7 +11355,7 @@
                 <w:sz w:val="18"/>
                 <w:szCs w:val="18"/>
               </w:rPr>
-              <w:t xml:space="preserve">Cartes commerciales au nom de l’entreprise</w:t>
+              <w:t xml:space="preserve">Constat de départ : avances sur fonds personnels et remboursement en 15 à 45 jours</w:t>
             </w:r>
           </w:p>
         </w:tc>
@@ -10419,7 +11391,7 @@
                 <w:sz w:val="18"/>
                 <w:szCs w:val="18"/>
               </w:rPr>
-              <w:t xml:space="preserve">15 % d’adoption (4/27) ; attrait pour les flottes prépayées ; frictions sur plafonds, étranger et zones rurales</w:t>
+              <w:t xml:space="preserve">Les entreprises remettent surtout des espèces ou des dotations aux collaborateurs (fiche de frais de mission, argent mis à disposition) ; la lenteur des remboursements n’est citée que 3 fois sur 27</w:t>
             </w:r>
           </w:p>
         </w:tc>
@@ -10455,7 +11427,7 @@
                 <w:sz w:val="18"/>
                 <w:szCs w:val="18"/>
               </w:rPr>
-              <w:t xml:space="preserve">Partiellement confirmé, ajustements requis</w:t>
+              <w:t xml:space="preserve">Partiellement confirmé : le risque dominant est la gestion du cash</w:t>
             </w:r>
           </w:p>
         </w:tc>
@@ -10495,7 +11467,7 @@
                 <w:sz w:val="18"/>
                 <w:szCs w:val="18"/>
               </w:rPr>
-              <w:t xml:space="preserve">Contrôles de dépenses paramétrables</w:t>
+              <w:t xml:space="preserve">Concurrence : aucune offre locale équivalente</w:t>
             </w:r>
           </w:p>
         </w:tc>
@@ -10530,7 +11502,7 @@
                 <w:sz w:val="18"/>
                 <w:szCs w:val="18"/>
               </w:rPr>
-              <w:t xml:space="preserve">Traçabilité, contrôle et détournement cités par 8 répondants sur 27, premier thème de difficulté</w:t>
+              <w:t xml:space="preserve">Aucune offre structurée citée. Substituts réels non listés dans la fiche : cartes carburant (Total, Tradex), flottes télécom (Orange, MTN, Camtel), mobile money, cartes UBA et Visa ponctuelles, plateformes internes (Intouch)</w:t>
             </w:r>
           </w:p>
         </w:tc>
@@ -10565,7 +11537,7 @@
                 <w:sz w:val="18"/>
                 <w:szCs w:val="18"/>
               </w:rPr>
-              <w:t xml:space="preserve">Confirmé</w:t>
+              <w:t xml:space="preserve">Confirmé, benchmark à compléter</w:t>
             </w:r>
           </w:p>
         </w:tc>
@@ -10606,7 +11578,7 @@
                 <w:sz w:val="18"/>
                 <w:szCs w:val="18"/>
               </w:rPr>
-              <w:t xml:space="preserve">Plateforme web de pilotage</w:t>
+              <w:t xml:space="preserve">Pack d’au moins 20 cartes Visa par contrat</w:t>
             </w:r>
           </w:p>
         </w:tc>
@@ -10642,7 +11614,7 @@
                 <w:sz w:val="18"/>
                 <w:szCs w:val="18"/>
               </w:rPr>
-              <w:t xml:space="preserve">Lenteur citée par 3 répondants ; mais outils internes déjà en place chez les grands groupes</w:t>
+              <w:t xml:space="preserve">Taille des équipes à équiper non relevée ; échantillon majoritairement composé de petites entreprises locales</w:t>
             </w:r>
           </w:p>
         </w:tc>
@@ -10678,7 +11650,7 @@
                 <w:sz w:val="18"/>
                 <w:szCs w:val="18"/>
               </w:rPr>
-              <w:t xml:space="preserve">Partiellement confirmé</w:t>
+              <w:t xml:space="preserve">À vérifier</w:t>
             </w:r>
           </w:p>
         </w:tc>
@@ -10718,7 +11690,7 @@
                 <w:sz w:val="18"/>
                 <w:szCs w:val="18"/>
               </w:rPr>
-              <w:t xml:space="preserve">Rapprochement comptable et justificatifs digitalisés</w:t>
+              <w:t xml:space="preserve">Cartes dédiées aux paiements, sans retrait d’espèces</w:t>
             </w:r>
           </w:p>
         </w:tc>
@@ -10753,7 +11725,7 @@
                 <w:sz w:val="18"/>
                 <w:szCs w:val="18"/>
               </w:rPr>
-              <w:t xml:space="preserve">Besoin de justificatifs et de comptabilité cité (3 répondants) ; logiciel comptable existant chez certains</w:t>
+              <w:t xml:space="preserve">Espèces utilisées par 67 % des entreprises ; acceptation des cartes limitée en zone rurale ; usage à l’étranger bloqué chez les utilisateurs actuels</w:t>
             </w:r>
           </w:p>
         </w:tc>
@@ -10788,7 +11760,7 @@
                 <w:sz w:val="18"/>
                 <w:szCs w:val="18"/>
               </w:rPr>
-              <w:t xml:space="preserve">À consolider</w:t>
+              <w:t xml:space="preserve">À réexaminer</w:t>
             </w:r>
           </w:p>
         </w:tc>
@@ -10829,7 +11801,7 @@
                 <w:sz w:val="18"/>
                 <w:szCs w:val="18"/>
               </w:rPr>
-              <w:t xml:space="preserve">Cible : grandes et moyennes entreprises</w:t>
+              <w:t xml:space="preserve">Contrôles de dépenses paramétrables (plafonds par collaborateur, catégorie, zone)</w:t>
             </w:r>
           </w:p>
         </w:tc>
@@ -10865,7 +11837,7 @@
                 <w:sz w:val="18"/>
                 <w:szCs w:val="18"/>
               </w:rPr>
-              <w:t xml:space="preserve">Non testée de façon représentative ; filiales de groupes moins demandeuses (2/5)</w:t>
+              <w:t xml:space="preserve">Traçabilité, contrôle et détournement : 8 répondants sur 27, premier thème de difficulté ; plafonds trop bas cités par un utilisateur de cartes</w:t>
             </w:r>
           </w:p>
         </w:tc>
@@ -10901,7 +11873,7 @@
                 <w:sz w:val="18"/>
                 <w:szCs w:val="18"/>
               </w:rPr>
-              <w:t xml:space="preserve">À vérifier</w:t>
+              <w:t xml:space="preserve">Confirmé</w:t>
             </w:r>
           </w:p>
         </w:tc>
@@ -10941,7 +11913,7 @@
                 <w:sz w:val="18"/>
                 <w:szCs w:val="18"/>
               </w:rPr>
-              <w:t xml:space="preserve">Intérêt et disposition des DAF à adopter</w:t>
+              <w:t xml:space="preserve">Capture numérique des justificatifs et workflow d’approbation</w:t>
             </w:r>
           </w:p>
         </w:tc>
@@ -10976,7 +11948,7 @@
                 <w:sz w:val="18"/>
                 <w:szCs w:val="18"/>
               </w:rPr>
-              <w:t xml:space="preserve">55 % favorables, 18 % sans condition ; coût et fiabilité comme conditions</w:t>
+              <w:t xml:space="preserve">Besoin de justificatifs et de comptabilité cité (3 répondants) ; lenteur des circuits citée par 3 répondants</w:t>
             </w:r>
           </w:p>
         </w:tc>
@@ -11011,7 +11983,7 @@
                 <w:sz w:val="18"/>
                 <w:szCs w:val="18"/>
               </w:rPr>
-              <w:t xml:space="preserve">Encourageant, non concluant</w:t>
+              <w:t xml:space="preserve">Confirmé (à consolider)</w:t>
             </w:r>
           </w:p>
         </w:tc>
@@ -11052,7 +12024,7 @@
                 <w:sz w:val="18"/>
                 <w:szCs w:val="18"/>
               </w:rPr>
-              <w:t xml:space="preserve">Utilité des fonctionnalités par segment</w:t>
+              <w:t xml:space="preserve">Intégration ERP et comptabilité (Sage, Odoo, SAP)</w:t>
             </w:r>
           </w:p>
         </w:tc>
@@ -11088,7 +12060,7 @@
                 <w:sz w:val="18"/>
                 <w:szCs w:val="18"/>
               </w:rPr>
-              <w:t xml:space="preserve">Non mesurée directement</w:t>
+              <w:t xml:space="preserve">Un logiciel de comptabilité déjà en place chez certains ; ERP utilisés par les clients non relevés</w:t>
             </w:r>
           </w:p>
         </w:tc>
@@ -11124,7 +12096,563 @@
                 <w:sz w:val="18"/>
                 <w:szCs w:val="18"/>
               </w:rPr>
+              <w:t xml:space="preserve">À vérifier</w:t>
+            </w:r>
+          </w:p>
+        </w:tc>
+      </w:tr>
+      <w:tr>
+        <w:trPr>
+          <w:cantSplit/>
+        </w:trPr>
+        <w:tc>
+          <w:tcPr>
+            <w:tcW w:type="dxa" w:w="3100"/>
+            <w:tcBorders>
+              <w:top w:val="single" w:color="BFBFBF" w:sz="4"/>
+              <w:left w:val="single" w:color="BFBFBF" w:sz="4"/>
+              <w:bottom w:val="single" w:color="BFBFBF" w:sz="4"/>
+              <w:right w:val="single" w:color="BFBFBF" w:sz="4"/>
+            </w:tcBorders>
+            <w:tcMar>
+              <w:top w:type="dxa" w:w="60"/>
+              <w:left w:type="dxa" w:w="90"/>
+              <w:bottom w:type="dxa" w:w="60"/>
+              <w:right w:type="dxa" w:w="90"/>
+            </w:tcMar>
+            <w:vAlign w:val="center"/>
+          </w:tcPr>
+          <w:p>
+            <w:pPr>
+              <w:spacing w:after="30" w:line="250"/>
+              <w:jc w:val="left"/>
+            </w:pPr>
+            <w:r>
+              <w:rPr>
+                <w:rFonts w:ascii="Cambria" w:cs="Cambria" w:eastAsia="Cambria" w:hAnsi="Cambria"/>
+                <w:b/>
+                <w:bCs/>
+                <w:color w:val="3A3A3A"/>
+                <w:sz w:val="18"/>
+                <w:szCs w:val="18"/>
+              </w:rPr>
+              <w:t xml:space="preserve">Cartes virtuelles pour les paiements fournisseurs</w:t>
+            </w:r>
+          </w:p>
+        </w:tc>
+        <w:tc>
+          <w:tcPr>
+            <w:tcW w:type="dxa" w:w="4438"/>
+            <w:tcBorders>
+              <w:top w:val="single" w:color="BFBFBF" w:sz="4"/>
+              <w:left w:val="single" w:color="BFBFBF" w:sz="4"/>
+              <w:bottom w:val="single" w:color="BFBFBF" w:sz="4"/>
+              <w:right w:val="single" w:color="BFBFBF" w:sz="4"/>
+            </w:tcBorders>
+            <w:tcMar>
+              <w:top w:type="dxa" w:w="60"/>
+              <w:left w:type="dxa" w:w="90"/>
+              <w:bottom w:type="dxa" w:w="60"/>
+              <w:right w:type="dxa" w:w="90"/>
+            </w:tcMar>
+            <w:vAlign w:val="center"/>
+          </w:tcPr>
+          <w:p>
+            <w:pPr>
+              <w:spacing w:after="30" w:line="250"/>
+              <w:jc w:val="left"/>
+            </w:pPr>
+            <w:r>
+              <w:rPr>
+                <w:rFonts w:ascii="Cambria" w:cs="Cambria" w:eastAsia="Cambria" w:hAnsi="Cambria"/>
+                <w:b w:val="false"/>
+                <w:bCs w:val="false"/>
+                <w:color w:val="3A3A3A"/>
+                <w:sz w:val="18"/>
+                <w:szCs w:val="18"/>
+              </w:rPr>
+              <w:t xml:space="preserve">Besoin non exploré par l’enquête ; paiements fournisseurs réglés surtout par virement</w:t>
+            </w:r>
+          </w:p>
+        </w:tc>
+        <w:tc>
+          <w:tcPr>
+            <w:tcW w:type="dxa" w:w="2100"/>
+            <w:tcBorders>
+              <w:top w:val="single" w:color="BFBFBF" w:sz="4"/>
+              <w:left w:val="single" w:color="BFBFBF" w:sz="4"/>
+              <w:bottom w:val="single" w:color="BFBFBF" w:sz="4"/>
+              <w:right w:val="single" w:color="BFBFBF" w:sz="4"/>
+            </w:tcBorders>
+            <w:tcMar>
+              <w:top w:type="dxa" w:w="60"/>
+              <w:left w:type="dxa" w:w="90"/>
+              <w:bottom w:type="dxa" w:w="60"/>
+              <w:right w:type="dxa" w:w="90"/>
+            </w:tcMar>
+            <w:vAlign w:val="center"/>
+          </w:tcPr>
+          <w:p>
+            <w:pPr>
+              <w:spacing w:after="30" w:line="250"/>
+              <w:jc w:val="left"/>
+            </w:pPr>
+            <w:r>
+              <w:rPr>
+                <w:rFonts w:ascii="Cambria" w:cs="Cambria" w:eastAsia="Cambria" w:hAnsi="Cambria"/>
+                <w:b w:val="false"/>
+                <w:bCs w:val="false"/>
+                <w:color w:val="3A3A3A"/>
+                <w:sz w:val="18"/>
+                <w:szCs w:val="18"/>
+              </w:rPr>
               <w:t xml:space="preserve">Non évalué</w:t>
+            </w:r>
+          </w:p>
+        </w:tc>
+      </w:tr>
+      <w:tr>
+        <w:trPr>
+          <w:cantSplit/>
+        </w:trPr>
+        <w:tc>
+          <w:tcPr>
+            <w:tcW w:type="dxa" w:w="3100"/>
+            <w:tcBorders>
+              <w:top w:val="single" w:color="BFBFBF" w:sz="4"/>
+              <w:left w:val="single" w:color="BFBFBF" w:sz="4"/>
+              <w:bottom w:val="single" w:color="BFBFBF" w:sz="4"/>
+              <w:right w:val="single" w:color="BFBFBF" w:sz="4"/>
+            </w:tcBorders>
+            <w:shd w:fill="F2F2F2" w:color="auto" w:val="clear"/>
+            <w:tcMar>
+              <w:top w:type="dxa" w:w="60"/>
+              <w:left w:type="dxa" w:w="90"/>
+              <w:bottom w:type="dxa" w:w="60"/>
+              <w:right w:type="dxa" w:w="90"/>
+            </w:tcMar>
+            <w:vAlign w:val="center"/>
+          </w:tcPr>
+          <w:p>
+            <w:pPr>
+              <w:spacing w:after="30" w:line="250"/>
+              <w:jc w:val="left"/>
+            </w:pPr>
+            <w:r>
+              <w:rPr>
+                <w:rFonts w:ascii="Cambria" w:cs="Cambria" w:eastAsia="Cambria" w:hAnsi="Cambria"/>
+                <w:b/>
+                <w:bCs/>
+                <w:color w:val="3A3A3A"/>
+                <w:sz w:val="18"/>
+                <w:szCs w:val="18"/>
+              </w:rPr>
+              <w:t xml:space="preserve">Packages tarifaires Starter / Business / Corporate+</w:t>
+            </w:r>
+          </w:p>
+        </w:tc>
+        <w:tc>
+          <w:tcPr>
+            <w:tcW w:type="dxa" w:w="4438"/>
+            <w:tcBorders>
+              <w:top w:val="single" w:color="BFBFBF" w:sz="4"/>
+              <w:left w:val="single" w:color="BFBFBF" w:sz="4"/>
+              <w:bottom w:val="single" w:color="BFBFBF" w:sz="4"/>
+              <w:right w:val="single" w:color="BFBFBF" w:sz="4"/>
+            </w:tcBorders>
+            <w:shd w:fill="F2F2F2" w:color="auto" w:val="clear"/>
+            <w:tcMar>
+              <w:top w:type="dxa" w:w="60"/>
+              <w:left w:type="dxa" w:w="90"/>
+              <w:bottom w:type="dxa" w:w="60"/>
+              <w:right w:type="dxa" w:w="90"/>
+            </w:tcMar>
+            <w:vAlign w:val="center"/>
+          </w:tcPr>
+          <w:p>
+            <w:pPr>
+              <w:spacing w:after="30" w:line="250"/>
+              <w:jc w:val="left"/>
+            </w:pPr>
+            <w:r>
+              <w:rPr>
+                <w:rFonts w:ascii="Cambria" w:cs="Cambria" w:eastAsia="Cambria" w:hAnsi="Cambria"/>
+                <w:b w:val="false"/>
+                <w:bCs w:val="false"/>
+                <w:color w:val="3A3A3A"/>
+                <w:sz w:val="18"/>
+                <w:szCs w:val="18"/>
+              </w:rPr>
+              <w:t xml:space="preserve">Coût : condition la plus citée à l’adoption (4 mentions) ; coût minimum de 2,0 M FCFA la première année pour un Starter</w:t>
+            </w:r>
+          </w:p>
+        </w:tc>
+        <w:tc>
+          <w:tcPr>
+            <w:tcW w:type="dxa" w:w="2100"/>
+            <w:tcBorders>
+              <w:top w:val="single" w:color="BFBFBF" w:sz="4"/>
+              <w:left w:val="single" w:color="BFBFBF" w:sz="4"/>
+              <w:bottom w:val="single" w:color="BFBFBF" w:sz="4"/>
+              <w:right w:val="single" w:color="BFBFBF" w:sz="4"/>
+            </w:tcBorders>
+            <w:shd w:fill="F2F2F2" w:color="auto" w:val="clear"/>
+            <w:tcMar>
+              <w:top w:type="dxa" w:w="60"/>
+              <w:left w:type="dxa" w:w="90"/>
+              <w:bottom w:type="dxa" w:w="60"/>
+              <w:right w:type="dxa" w:w="90"/>
+            </w:tcMar>
+            <w:vAlign w:val="center"/>
+          </w:tcPr>
+          <w:p>
+            <w:pPr>
+              <w:spacing w:after="30" w:line="250"/>
+              <w:jc w:val="left"/>
+            </w:pPr>
+            <w:r>
+              <w:rPr>
+                <w:rFonts w:ascii="Cambria" w:cs="Cambria" w:eastAsia="Cambria" w:hAnsi="Cambria"/>
+                <w:b w:val="false"/>
+                <w:bCs w:val="false"/>
+                <w:color w:val="3A3A3A"/>
+                <w:sz w:val="18"/>
+                <w:szCs w:val="18"/>
+              </w:rPr>
+              <w:t xml:space="preserve">À ajuster : entrée accessible</w:t>
+            </w:r>
+          </w:p>
+        </w:tc>
+      </w:tr>
+      <w:tr>
+        <w:trPr>
+          <w:cantSplit/>
+        </w:trPr>
+        <w:tc>
+          <w:tcPr>
+            <w:tcW w:type="dxa" w:w="3100"/>
+            <w:tcBorders>
+              <w:top w:val="single" w:color="BFBFBF" w:sz="4"/>
+              <w:left w:val="single" w:color="BFBFBF" w:sz="4"/>
+              <w:bottom w:val="single" w:color="BFBFBF" w:sz="4"/>
+              <w:right w:val="single" w:color="BFBFBF" w:sz="4"/>
+            </w:tcBorders>
+            <w:tcMar>
+              <w:top w:type="dxa" w:w="60"/>
+              <w:left w:type="dxa" w:w="90"/>
+              <w:bottom w:type="dxa" w:w="60"/>
+              <w:right w:type="dxa" w:w="90"/>
+            </w:tcMar>
+            <w:vAlign w:val="center"/>
+          </w:tcPr>
+          <w:p>
+            <w:pPr>
+              <w:spacing w:after="30" w:line="250"/>
+              <w:jc w:val="left"/>
+            </w:pPr>
+            <w:r>
+              <w:rPr>
+                <w:rFonts w:ascii="Cambria" w:cs="Cambria" w:eastAsia="Cambria" w:hAnsi="Cambria"/>
+                <w:b/>
+                <w:bCs/>
+                <w:color w:val="3A3A3A"/>
+                <w:sz w:val="18"/>
+                <w:szCs w:val="18"/>
+              </w:rPr>
+              <w:t xml:space="preserve">Cible : grandes entreprises, PME/ETI structurées, réseau d’externalisation</w:t>
+            </w:r>
+          </w:p>
+        </w:tc>
+        <w:tc>
+          <w:tcPr>
+            <w:tcW w:type="dxa" w:w="4438"/>
+            <w:tcBorders>
+              <w:top w:val="single" w:color="BFBFBF" w:sz="4"/>
+              <w:left w:val="single" w:color="BFBFBF" w:sz="4"/>
+              <w:bottom w:val="single" w:color="BFBFBF" w:sz="4"/>
+              <w:right w:val="single" w:color="BFBFBF" w:sz="4"/>
+            </w:tcBorders>
+            <w:tcMar>
+              <w:top w:type="dxa" w:w="60"/>
+              <w:left w:type="dxa" w:w="90"/>
+              <w:bottom w:type="dxa" w:w="60"/>
+              <w:right w:type="dxa" w:w="90"/>
+            </w:tcMar>
+            <w:vAlign w:val="center"/>
+          </w:tcPr>
+          <w:p>
+            <w:pPr>
+              <w:spacing w:after="30" w:line="250"/>
+              <w:jc w:val="left"/>
+            </w:pPr>
+            <w:r>
+              <w:rPr>
+                <w:rFonts w:ascii="Cambria" w:cs="Cambria" w:eastAsia="Cambria" w:hAnsi="Cambria"/>
+                <w:b w:val="false"/>
+                <w:bCs w:val="false"/>
+                <w:color w:val="3A3A3A"/>
+                <w:sz w:val="18"/>
+                <w:szCs w:val="18"/>
+              </w:rPr>
+              <w:t xml:space="preserve">Cible GE/ME non représentée dans l’échantillon ; filiales de groupes moins demandeuses (2/5) ; réseau d’externalisation non interrogé</w:t>
+            </w:r>
+          </w:p>
+        </w:tc>
+        <w:tc>
+          <w:tcPr>
+            <w:tcW w:type="dxa" w:w="2100"/>
+            <w:tcBorders>
+              <w:top w:val="single" w:color="BFBFBF" w:sz="4"/>
+              <w:left w:val="single" w:color="BFBFBF" w:sz="4"/>
+              <w:bottom w:val="single" w:color="BFBFBF" w:sz="4"/>
+              <w:right w:val="single" w:color="BFBFBF" w:sz="4"/>
+            </w:tcBorders>
+            <w:tcMar>
+              <w:top w:type="dxa" w:w="60"/>
+              <w:left w:type="dxa" w:w="90"/>
+              <w:bottom w:type="dxa" w:w="60"/>
+              <w:right w:type="dxa" w:w="90"/>
+            </w:tcMar>
+            <w:vAlign w:val="center"/>
+          </w:tcPr>
+          <w:p>
+            <w:pPr>
+              <w:spacing w:after="30" w:line="250"/>
+              <w:jc w:val="left"/>
+            </w:pPr>
+            <w:r>
+              <w:rPr>
+                <w:rFonts w:ascii="Cambria" w:cs="Cambria" w:eastAsia="Cambria" w:hAnsi="Cambria"/>
+                <w:b w:val="false"/>
+                <w:bCs w:val="false"/>
+                <w:color w:val="3A3A3A"/>
+                <w:sz w:val="18"/>
+                <w:szCs w:val="18"/>
+              </w:rPr>
+              <w:t xml:space="preserve">À vérifier</w:t>
+            </w:r>
+          </w:p>
+        </w:tc>
+      </w:tr>
+      <w:tr>
+        <w:trPr>
+          <w:cantSplit/>
+        </w:trPr>
+        <w:tc>
+          <w:tcPr>
+            <w:tcW w:type="dxa" w:w="3100"/>
+            <w:tcBorders>
+              <w:top w:val="single" w:color="BFBFBF" w:sz="4"/>
+              <w:left w:val="single" w:color="BFBFBF" w:sz="4"/>
+              <w:bottom w:val="single" w:color="BFBFBF" w:sz="4"/>
+              <w:right w:val="single" w:color="BFBFBF" w:sz="4"/>
+            </w:tcBorders>
+            <w:shd w:fill="F2F2F2" w:color="auto" w:val="clear"/>
+            <w:tcMar>
+              <w:top w:type="dxa" w:w="60"/>
+              <w:left w:type="dxa" w:w="90"/>
+              <w:bottom w:type="dxa" w:w="60"/>
+              <w:right w:type="dxa" w:w="90"/>
+            </w:tcMar>
+            <w:vAlign w:val="center"/>
+          </w:tcPr>
+          <w:p>
+            <w:pPr>
+              <w:spacing w:after="30" w:line="250"/>
+              <w:jc w:val="left"/>
+            </w:pPr>
+            <w:r>
+              <w:rPr>
+                <w:rFonts w:ascii="Cambria" w:cs="Cambria" w:eastAsia="Cambria" w:hAnsi="Cambria"/>
+                <w:b/>
+                <w:bCs/>
+                <w:color w:val="3A3A3A"/>
+                <w:sz w:val="18"/>
+                <w:szCs w:val="18"/>
+              </w:rPr>
+              <w:t xml:space="preserve">Pilote auprès de 3 à 5 grandes entreprises</w:t>
+            </w:r>
+          </w:p>
+        </w:tc>
+        <w:tc>
+          <w:tcPr>
+            <w:tcW w:type="dxa" w:w="4438"/>
+            <w:tcBorders>
+              <w:top w:val="single" w:color="BFBFBF" w:sz="4"/>
+              <w:left w:val="single" w:color="BFBFBF" w:sz="4"/>
+              <w:bottom w:val="single" w:color="BFBFBF" w:sz="4"/>
+              <w:right w:val="single" w:color="BFBFBF" w:sz="4"/>
+            </w:tcBorders>
+            <w:shd w:fill="F2F2F2" w:color="auto" w:val="clear"/>
+            <w:tcMar>
+              <w:top w:type="dxa" w:w="60"/>
+              <w:left w:type="dxa" w:w="90"/>
+              <w:bottom w:type="dxa" w:w="60"/>
+              <w:right w:type="dxa" w:w="90"/>
+            </w:tcMar>
+            <w:vAlign w:val="center"/>
+          </w:tcPr>
+          <w:p>
+            <w:pPr>
+              <w:spacing w:after="30" w:line="250"/>
+              <w:jc w:val="left"/>
+            </w:pPr>
+            <w:r>
+              <w:rPr>
+                <w:rFonts w:ascii="Cambria" w:cs="Cambria" w:eastAsia="Cambria" w:hAnsi="Cambria"/>
+                <w:b w:val="false"/>
+                <w:bCs w:val="false"/>
+                <w:color w:val="3A3A3A"/>
+                <w:sz w:val="18"/>
+                <w:szCs w:val="18"/>
+              </w:rPr>
+              <w:t xml:space="preserve">Entreprises favorables identifiées (annexe A), de taille variable ; l’éligibilité au pack minimal reste à confirmer</w:t>
+            </w:r>
+          </w:p>
+        </w:tc>
+        <w:tc>
+          <w:tcPr>
+            <w:tcW w:type="dxa" w:w="2100"/>
+            <w:tcBorders>
+              <w:top w:val="single" w:color="BFBFBF" w:sz="4"/>
+              <w:left w:val="single" w:color="BFBFBF" w:sz="4"/>
+              <w:bottom w:val="single" w:color="BFBFBF" w:sz="4"/>
+              <w:right w:val="single" w:color="BFBFBF" w:sz="4"/>
+            </w:tcBorders>
+            <w:shd w:fill="F2F2F2" w:color="auto" w:val="clear"/>
+            <w:tcMar>
+              <w:top w:type="dxa" w:w="60"/>
+              <w:left w:type="dxa" w:w="90"/>
+              <w:bottom w:type="dxa" w:w="60"/>
+              <w:right w:type="dxa" w:w="90"/>
+            </w:tcMar>
+            <w:vAlign w:val="center"/>
+          </w:tcPr>
+          <w:p>
+            <w:pPr>
+              <w:spacing w:after="30" w:line="250"/>
+              <w:jc w:val="left"/>
+            </w:pPr>
+            <w:r>
+              <w:rPr>
+                <w:rFonts w:ascii="Cambria" w:cs="Cambria" w:eastAsia="Cambria" w:hAnsi="Cambria"/>
+                <w:b w:val="false"/>
+                <w:bCs w:val="false"/>
+                <w:color w:val="3A3A3A"/>
+                <w:sz w:val="18"/>
+                <w:szCs w:val="18"/>
+              </w:rPr>
+              <w:t xml:space="preserve">Cohérent, à cadrer</w:t>
+            </w:r>
+          </w:p>
+        </w:tc>
+      </w:tr>
+      <w:tr>
+        <w:trPr>
+          <w:cantSplit/>
+        </w:trPr>
+        <w:tc>
+          <w:tcPr>
+            <w:tcW w:type="dxa" w:w="3100"/>
+            <w:tcBorders>
+              <w:top w:val="single" w:color="BFBFBF" w:sz="4"/>
+              <w:left w:val="single" w:color="BFBFBF" w:sz="4"/>
+              <w:bottom w:val="single" w:color="BFBFBF" w:sz="4"/>
+              <w:right w:val="single" w:color="BFBFBF" w:sz="4"/>
+            </w:tcBorders>
+            <w:tcMar>
+              <w:top w:type="dxa" w:w="60"/>
+              <w:left w:type="dxa" w:w="90"/>
+              <w:bottom w:type="dxa" w:w="60"/>
+              <w:right w:type="dxa" w:w="90"/>
+            </w:tcMar>
+            <w:vAlign w:val="center"/>
+          </w:tcPr>
+          <w:p>
+            <w:pPr>
+              <w:spacing w:after="30" w:line="250"/>
+              <w:jc w:val="left"/>
+            </w:pPr>
+            <w:r>
+              <w:rPr>
+                <w:rFonts w:ascii="Cambria" w:cs="Cambria" w:eastAsia="Cambria" w:hAnsi="Cambria"/>
+                <w:b/>
+                <w:bCs/>
+                <w:color w:val="3A3A3A"/>
+                <w:sz w:val="18"/>
+                <w:szCs w:val="18"/>
+              </w:rPr>
+              <w:t xml:space="preserve">Intérêt et disposition à adopter</w:t>
+            </w:r>
+          </w:p>
+        </w:tc>
+        <w:tc>
+          <w:tcPr>
+            <w:tcW w:type="dxa" w:w="4438"/>
+            <w:tcBorders>
+              <w:top w:val="single" w:color="BFBFBF" w:sz="4"/>
+              <w:left w:val="single" w:color="BFBFBF" w:sz="4"/>
+              <w:bottom w:val="single" w:color="BFBFBF" w:sz="4"/>
+              <w:right w:val="single" w:color="BFBFBF" w:sz="4"/>
+            </w:tcBorders>
+            <w:tcMar>
+              <w:top w:type="dxa" w:w="60"/>
+              <w:left w:type="dxa" w:w="90"/>
+              <w:bottom w:type="dxa" w:w="60"/>
+              <w:right w:type="dxa" w:w="90"/>
+            </w:tcMar>
+            <w:vAlign w:val="center"/>
+          </w:tcPr>
+          <w:p>
+            <w:pPr>
+              <w:spacing w:after="30" w:line="250"/>
+              <w:jc w:val="left"/>
+            </w:pPr>
+            <w:r>
+              <w:rPr>
+                <w:rFonts w:ascii="Cambria" w:cs="Cambria" w:eastAsia="Cambria" w:hAnsi="Cambria"/>
+                <w:b w:val="false"/>
+                <w:bCs w:val="false"/>
+                <w:color w:val="3A3A3A"/>
+                <w:sz w:val="18"/>
+                <w:szCs w:val="18"/>
+              </w:rPr>
+              <w:t xml:space="preserve">55 % favorables (12/22), 18 % sans condition ; coût et fiabilité comme conditions</w:t>
+            </w:r>
+          </w:p>
+        </w:tc>
+        <w:tc>
+          <w:tcPr>
+            <w:tcW w:type="dxa" w:w="2100"/>
+            <w:tcBorders>
+              <w:top w:val="single" w:color="BFBFBF" w:sz="4"/>
+              <w:left w:val="single" w:color="BFBFBF" w:sz="4"/>
+              <w:bottom w:val="single" w:color="BFBFBF" w:sz="4"/>
+              <w:right w:val="single" w:color="BFBFBF" w:sz="4"/>
+            </w:tcBorders>
+            <w:tcMar>
+              <w:top w:type="dxa" w:w="60"/>
+              <w:left w:type="dxa" w:w="90"/>
+              <w:bottom w:type="dxa" w:w="60"/>
+              <w:right w:type="dxa" w:w="90"/>
+            </w:tcMar>
+            <w:vAlign w:val="center"/>
+          </w:tcPr>
+          <w:p>
+            <w:pPr>
+              <w:spacing w:after="30" w:line="250"/>
+              <w:jc w:val="left"/>
+            </w:pPr>
+            <w:r>
+              <w:rPr>
+                <w:rFonts w:ascii="Cambria" w:cs="Cambria" w:eastAsia="Cambria" w:hAnsi="Cambria"/>
+                <w:b w:val="false"/>
+                <w:bCs w:val="false"/>
+                <w:color w:val="3A3A3A"/>
+                <w:sz w:val="18"/>
+                <w:szCs w:val="18"/>
+              </w:rPr>
+              <w:t xml:space="preserve">Encourageant, non concluant</w:t>
             </w:r>
           </w:p>
         </w:tc>
@@ -11147,7 +12675,33 @@
           <w:sz w:val="28"/>
           <w:szCs w:val="28"/>
         </w:rPr>
-        <w:t xml:space="preserve">8. Conclusion et recommandations</w:t>
+        <w:t xml:space="preserve">8. Éclairage économique et technique : documents Visa</w:t>
+      </w:r>
+    </w:p>
+    <w:p>
+      <w:pPr>
+        <w:spacing w:after="120" w:line="300"/>
+        <w:jc w:val="both"/>
+      </w:pPr>
+      <w:r>
+        <w:rPr>
+          <w:rFonts w:ascii="Cambria" w:cs="Cambria" w:eastAsia="Cambria" w:hAnsi="Cambria"/>
+          <w:color w:val="3A3A3A"/>
+          <w:sz w:val="21"/>
+          <w:szCs w:val="21"/>
+        </w:rPr>
+        <w:t xml:space="preserve">Les documents Visa transmis complètent l’enquête sur deux points : ce que coûte à la banque l’accès à la solution, et ce que la banque doit mettre en place pour l’exploiter. Ils ne relèvent pas de l’enquête auprès des entreprises ; ils servent à vérifier que les besoins exprimés trouvent une réponse dans l’offre Visa et que son équilibre économique est réaliste. </w:t>
+      </w:r>
+      <w:r>
+        <w:rPr>
+          <w:rFonts w:ascii="Cambria" w:cs="Cambria" w:eastAsia="Cambria" w:hAnsi="Cambria"/>
+          <w:b/>
+          <w:bCs/>
+          <w:color w:val="3A3A3A"/>
+          <w:sz w:val="21"/>
+          <w:szCs w:val="21"/>
+        </w:rPr>
+        <w:t xml:space="preserve">Données confidentielles Visa : diffusion restreinte.</w:t>
       </w:r>
     </w:p>
     <w:p>
@@ -11168,7 +12722,1578 @@
           <w:sz w:val="25"/>
           <w:szCs w:val="25"/>
         </w:rPr>
-        <w:t xml:space="preserve">8.1 Conclusion</w:t>
+        <w:t xml:space="preserve">8.1 Tarification Visa Spend Clarity for Enterprise (2023)</w:t>
+      </w:r>
+    </w:p>
+    <w:tbl>
+      <w:tblPr>
+        <w:tblW w:type="dxa" w:w="9638"/>
+        <w:tblBorders>
+          <w:top w:val="single" w:color="auto" w:sz="4"/>
+          <w:left w:val="single" w:color="auto" w:sz="4"/>
+          <w:bottom w:val="single" w:color="auto" w:sz="4"/>
+          <w:right w:val="single" w:color="auto" w:sz="4"/>
+          <w:insideH w:val="single" w:color="auto" w:sz="4"/>
+          <w:insideV w:val="single" w:color="auto" w:sz="4"/>
+        </w:tblBorders>
+      </w:tblPr>
+      <w:tblGrid>
+        <w:gridCol w:w="3500"/>
+        <w:gridCol w:w="2800"/>
+        <w:gridCol w:w="3338"/>
+      </w:tblGrid>
+      <w:tr>
+        <w:trPr>
+          <w:cantSplit/>
+          <w:tblHeader/>
+        </w:trPr>
+        <w:tc>
+          <w:tcPr>
+            <w:tcW w:type="dxa" w:w="3500"/>
+            <w:tcBorders>
+              <w:top w:val="single" w:color="BFBFBF" w:sz="4"/>
+              <w:left w:val="single" w:color="BFBFBF" w:sz="4"/>
+              <w:bottom w:val="single" w:color="BFBFBF" w:sz="4"/>
+              <w:right w:val="single" w:color="BFBFBF" w:sz="4"/>
+            </w:tcBorders>
+            <w:shd w:fill="C00000" w:color="auto" w:val="clear"/>
+            <w:tcMar>
+              <w:top w:type="dxa" w:w="60"/>
+              <w:left w:type="dxa" w:w="90"/>
+              <w:bottom w:type="dxa" w:w="60"/>
+              <w:right w:type="dxa" w:w="90"/>
+            </w:tcMar>
+            <w:vAlign w:val="center"/>
+          </w:tcPr>
+          <w:p>
+            <w:pPr>
+              <w:spacing w:after="30" w:line="250"/>
+              <w:jc w:val="left"/>
+            </w:pPr>
+            <w:r>
+              <w:rPr>
+                <w:rFonts w:ascii="Cambria" w:cs="Cambria" w:eastAsia="Cambria" w:hAnsi="Cambria"/>
+                <w:b/>
+                <w:bCs/>
+                <w:color w:val="FFFFFF"/>
+                <w:sz w:val="18"/>
+                <w:szCs w:val="18"/>
+              </w:rPr>
+              <w:t xml:space="preserve">Élément</w:t>
+            </w:r>
+          </w:p>
+        </w:tc>
+        <w:tc>
+          <w:tcPr>
+            <w:tcW w:type="dxa" w:w="2800"/>
+            <w:tcBorders>
+              <w:top w:val="single" w:color="BFBFBF" w:sz="4"/>
+              <w:left w:val="single" w:color="BFBFBF" w:sz="4"/>
+              <w:bottom w:val="single" w:color="BFBFBF" w:sz="4"/>
+              <w:right w:val="single" w:color="BFBFBF" w:sz="4"/>
+            </w:tcBorders>
+            <w:shd w:fill="C00000" w:color="auto" w:val="clear"/>
+            <w:tcMar>
+              <w:top w:type="dxa" w:w="60"/>
+              <w:left w:type="dxa" w:w="90"/>
+              <w:bottom w:type="dxa" w:w="60"/>
+              <w:right w:type="dxa" w:w="90"/>
+            </w:tcMar>
+            <w:vAlign w:val="center"/>
+          </w:tcPr>
+          <w:p>
+            <w:pPr>
+              <w:spacing w:after="30" w:line="250"/>
+              <w:jc w:val="left"/>
+            </w:pPr>
+            <w:r>
+              <w:rPr>
+                <w:rFonts w:ascii="Cambria" w:cs="Cambria" w:eastAsia="Cambria" w:hAnsi="Cambria"/>
+                <w:b/>
+                <w:bCs/>
+                <w:color w:val="FFFFFF"/>
+                <w:sz w:val="18"/>
+                <w:szCs w:val="18"/>
+              </w:rPr>
+              <w:t xml:space="preserve">Tarif Visa</w:t>
+            </w:r>
+          </w:p>
+        </w:tc>
+        <w:tc>
+          <w:tcPr>
+            <w:tcW w:type="dxa" w:w="3338"/>
+            <w:tcBorders>
+              <w:top w:val="single" w:color="BFBFBF" w:sz="4"/>
+              <w:left w:val="single" w:color="BFBFBF" w:sz="4"/>
+              <w:bottom w:val="single" w:color="BFBFBF" w:sz="4"/>
+              <w:right w:val="single" w:color="BFBFBF" w:sz="4"/>
+            </w:tcBorders>
+            <w:shd w:fill="C00000" w:color="auto" w:val="clear"/>
+            <w:tcMar>
+              <w:top w:type="dxa" w:w="60"/>
+              <w:left w:type="dxa" w:w="90"/>
+              <w:bottom w:type="dxa" w:w="60"/>
+              <w:right w:type="dxa" w:w="90"/>
+            </w:tcMar>
+            <w:vAlign w:val="center"/>
+          </w:tcPr>
+          <w:p>
+            <w:pPr>
+              <w:spacing w:after="30" w:line="250"/>
+              <w:jc w:val="left"/>
+            </w:pPr>
+            <w:r>
+              <w:rPr>
+                <w:rFonts w:ascii="Cambria" w:cs="Cambria" w:eastAsia="Cambria" w:hAnsi="Cambria"/>
+                <w:b/>
+                <w:bCs/>
+                <w:color w:val="FFFFFF"/>
+                <w:sz w:val="18"/>
+                <w:szCs w:val="18"/>
+              </w:rPr>
+              <w:t xml:space="preserve">Lecture au regard de l’enquête</w:t>
+            </w:r>
+          </w:p>
+        </w:tc>
+      </w:tr>
+      <w:tr>
+        <w:trPr>
+          <w:cantSplit/>
+        </w:trPr>
+        <w:tc>
+          <w:tcPr>
+            <w:tcW w:type="dxa" w:w="3500"/>
+            <w:tcBorders>
+              <w:top w:val="single" w:color="BFBFBF" w:sz="4"/>
+              <w:left w:val="single" w:color="BFBFBF" w:sz="4"/>
+              <w:bottom w:val="single" w:color="BFBFBF" w:sz="4"/>
+              <w:right w:val="single" w:color="BFBFBF" w:sz="4"/>
+            </w:tcBorders>
+            <w:tcMar>
+              <w:top w:type="dxa" w:w="60"/>
+              <w:left w:type="dxa" w:w="90"/>
+              <w:bottom w:type="dxa" w:w="60"/>
+              <w:right w:type="dxa" w:w="90"/>
+            </w:tcMar>
+            <w:vAlign w:val="center"/>
+          </w:tcPr>
+          <w:p>
+            <w:pPr>
+              <w:spacing w:after="30" w:line="250"/>
+              <w:jc w:val="left"/>
+            </w:pPr>
+            <w:r>
+              <w:rPr>
+                <w:rFonts w:ascii="Cambria" w:cs="Cambria" w:eastAsia="Cambria" w:hAnsi="Cambria"/>
+                <w:color w:val="3A3A3A"/>
+                <w:sz w:val="18"/>
+                <w:szCs w:val="18"/>
+              </w:rPr>
+              <w:t xml:space="preserve">Package BASE : gestion des dépenses, tableaux de bord émetteur</w:t>
+            </w:r>
+          </w:p>
+        </w:tc>
+        <w:tc>
+          <w:tcPr>
+            <w:tcW w:type="dxa" w:w="2800"/>
+            <w:tcBorders>
+              <w:top w:val="single" w:color="BFBFBF" w:sz="4"/>
+              <w:left w:val="single" w:color="BFBFBF" w:sz="4"/>
+              <w:bottom w:val="single" w:color="BFBFBF" w:sz="4"/>
+              <w:right w:val="single" w:color="BFBFBF" w:sz="4"/>
+            </w:tcBorders>
+            <w:tcMar>
+              <w:top w:type="dxa" w:w="60"/>
+              <w:left w:type="dxa" w:w="90"/>
+              <w:bottom w:type="dxa" w:w="60"/>
+              <w:right w:type="dxa" w:w="90"/>
+            </w:tcMar>
+            <w:vAlign w:val="center"/>
+          </w:tcPr>
+          <w:p>
+            <w:pPr>
+              <w:spacing w:after="30" w:line="250"/>
+              <w:jc w:val="left"/>
+            </w:pPr>
+            <w:r>
+              <w:rPr>
+                <w:rFonts w:ascii="Cambria" w:cs="Cambria" w:eastAsia="Cambria" w:hAnsi="Cambria"/>
+                <w:color w:val="3A3A3A"/>
+                <w:sz w:val="18"/>
+                <w:szCs w:val="18"/>
+              </w:rPr>
+              <w:t xml:space="preserve">4 bps sur toutes les dépenses</w:t>
+            </w:r>
+          </w:p>
+        </w:tc>
+        <w:tc>
+          <w:tcPr>
+            <w:tcW w:type="dxa" w:w="3338"/>
+            <w:tcBorders>
+              <w:top w:val="single" w:color="BFBFBF" w:sz="4"/>
+              <w:left w:val="single" w:color="BFBFBF" w:sz="4"/>
+              <w:bottom w:val="single" w:color="BFBFBF" w:sz="4"/>
+              <w:right w:val="single" w:color="BFBFBF" w:sz="4"/>
+            </w:tcBorders>
+            <w:tcMar>
+              <w:top w:type="dxa" w:w="60"/>
+              <w:left w:type="dxa" w:w="90"/>
+              <w:bottom w:type="dxa" w:w="60"/>
+              <w:right w:type="dxa" w:w="90"/>
+            </w:tcMar>
+            <w:vAlign w:val="center"/>
+          </w:tcPr>
+          <w:p>
+            <w:pPr>
+              <w:spacing w:after="30" w:line="250"/>
+              <w:jc w:val="left"/>
+            </w:pPr>
+            <w:r>
+              <w:rPr>
+                <w:rFonts w:ascii="Cambria" w:cs="Cambria" w:eastAsia="Cambria" w:hAnsi="Cambria"/>
+                <w:color w:val="3A3A3A"/>
+                <w:sz w:val="18"/>
+                <w:szCs w:val="18"/>
+              </w:rPr>
+              <w:t xml:space="preserve">Ne comprend ni contrôles de cartes ni cartes virtuelles : insuffisant pour répondre aux besoins exprimés</w:t>
+            </w:r>
+          </w:p>
+        </w:tc>
+      </w:tr>
+      <w:tr>
+        <w:trPr>
+          <w:cantSplit/>
+        </w:trPr>
+        <w:tc>
+          <w:tcPr>
+            <w:tcW w:type="dxa" w:w="3500"/>
+            <w:tcBorders>
+              <w:top w:val="single" w:color="BFBFBF" w:sz="4"/>
+              <w:left w:val="single" w:color="BFBFBF" w:sz="4"/>
+              <w:bottom w:val="single" w:color="BFBFBF" w:sz="4"/>
+              <w:right w:val="single" w:color="BFBFBF" w:sz="4"/>
+            </w:tcBorders>
+            <w:shd w:fill="F2F2F2" w:color="auto" w:val="clear"/>
+            <w:tcMar>
+              <w:top w:type="dxa" w:w="60"/>
+              <w:left w:type="dxa" w:w="90"/>
+              <w:bottom w:type="dxa" w:w="60"/>
+              <w:right w:type="dxa" w:w="90"/>
+            </w:tcMar>
+            <w:vAlign w:val="center"/>
+          </w:tcPr>
+          <w:p>
+            <w:pPr>
+              <w:spacing w:after="30" w:line="250"/>
+              <w:jc w:val="left"/>
+            </w:pPr>
+            <w:r>
+              <w:rPr>
+                <w:rFonts w:ascii="Cambria" w:cs="Cambria" w:eastAsia="Cambria" w:hAnsi="Cambria"/>
+                <w:color w:val="3A3A3A"/>
+                <w:sz w:val="18"/>
+                <w:szCs w:val="18"/>
+              </w:rPr>
+              <w:t xml:space="preserve">Package PLUS : BASE + tableaux de bord entreprise, cartes virtuelles, contrôles de cartes</w:t>
+            </w:r>
+          </w:p>
+        </w:tc>
+        <w:tc>
+          <w:tcPr>
+            <w:tcW w:type="dxa" w:w="2800"/>
+            <w:tcBorders>
+              <w:top w:val="single" w:color="BFBFBF" w:sz="4"/>
+              <w:left w:val="single" w:color="BFBFBF" w:sz="4"/>
+              <w:bottom w:val="single" w:color="BFBFBF" w:sz="4"/>
+              <w:right w:val="single" w:color="BFBFBF" w:sz="4"/>
+            </w:tcBorders>
+            <w:shd w:fill="F2F2F2" w:color="auto" w:val="clear"/>
+            <w:tcMar>
+              <w:top w:type="dxa" w:w="60"/>
+              <w:left w:type="dxa" w:w="90"/>
+              <w:bottom w:type="dxa" w:w="60"/>
+              <w:right w:type="dxa" w:w="90"/>
+            </w:tcMar>
+            <w:vAlign w:val="center"/>
+          </w:tcPr>
+          <w:p>
+            <w:pPr>
+              <w:spacing w:after="30" w:line="250"/>
+              <w:jc w:val="left"/>
+            </w:pPr>
+            <w:r>
+              <w:rPr>
+                <w:rFonts w:ascii="Cambria" w:cs="Cambria" w:eastAsia="Cambria" w:hAnsi="Cambria"/>
+                <w:color w:val="3A3A3A"/>
+                <w:sz w:val="18"/>
+                <w:szCs w:val="18"/>
+              </w:rPr>
+              <w:t xml:space="preserve">6 bps sur toutes les dépenses</w:t>
+            </w:r>
+          </w:p>
+        </w:tc>
+        <w:tc>
+          <w:tcPr>
+            <w:tcW w:type="dxa" w:w="3338"/>
+            <w:tcBorders>
+              <w:top w:val="single" w:color="BFBFBF" w:sz="4"/>
+              <w:left w:val="single" w:color="BFBFBF" w:sz="4"/>
+              <w:bottom w:val="single" w:color="BFBFBF" w:sz="4"/>
+              <w:right w:val="single" w:color="BFBFBF" w:sz="4"/>
+            </w:tcBorders>
+            <w:shd w:fill="F2F2F2" w:color="auto" w:val="clear"/>
+            <w:tcMar>
+              <w:top w:type="dxa" w:w="60"/>
+              <w:left w:type="dxa" w:w="90"/>
+              <w:bottom w:type="dxa" w:w="60"/>
+              <w:right w:type="dxa" w:w="90"/>
+            </w:tcMar>
+            <w:vAlign w:val="center"/>
+          </w:tcPr>
+          <w:p>
+            <w:pPr>
+              <w:spacing w:after="30" w:line="250"/>
+              <w:jc w:val="left"/>
+            </w:pPr>
+            <w:r>
+              <w:rPr>
+                <w:rFonts w:ascii="Cambria" w:cs="Cambria" w:eastAsia="Cambria" w:hAnsi="Cambria"/>
+                <w:color w:val="3A3A3A"/>
+                <w:sz w:val="18"/>
+                <w:szCs w:val="18"/>
+              </w:rPr>
+              <w:t xml:space="preserve">Couvre le besoin prioritaire (contrôle, plafonds) et l’idée produit</w:t>
+            </w:r>
+          </w:p>
+        </w:tc>
+      </w:tr>
+      <w:tr>
+        <w:trPr>
+          <w:cantSplit/>
+        </w:trPr>
+        <w:tc>
+          <w:tcPr>
+            <w:tcW w:type="dxa" w:w="3500"/>
+            <w:tcBorders>
+              <w:top w:val="single" w:color="BFBFBF" w:sz="4"/>
+              <w:left w:val="single" w:color="BFBFBF" w:sz="4"/>
+              <w:bottom w:val="single" w:color="BFBFBF" w:sz="4"/>
+              <w:right w:val="single" w:color="BFBFBF" w:sz="4"/>
+            </w:tcBorders>
+            <w:tcMar>
+              <w:top w:type="dxa" w:w="60"/>
+              <w:left w:type="dxa" w:w="90"/>
+              <w:bottom w:type="dxa" w:w="60"/>
+              <w:right w:type="dxa" w:w="90"/>
+            </w:tcMar>
+            <w:vAlign w:val="center"/>
+          </w:tcPr>
+          <w:p>
+            <w:pPr>
+              <w:spacing w:after="30" w:line="250"/>
+              <w:jc w:val="left"/>
+            </w:pPr>
+            <w:r>
+              <w:rPr>
+                <w:rFonts w:ascii="Cambria" w:cs="Cambria" w:eastAsia="Cambria" w:hAnsi="Cambria"/>
+                <w:color w:val="3A3A3A"/>
+                <w:sz w:val="18"/>
+                <w:szCs w:val="18"/>
+              </w:rPr>
+              <w:t xml:space="preserve">Module Expense Management (inclut l’imagerie des reçus)</w:t>
+            </w:r>
+          </w:p>
+        </w:tc>
+        <w:tc>
+          <w:tcPr>
+            <w:tcW w:type="dxa" w:w="2800"/>
+            <w:tcBorders>
+              <w:top w:val="single" w:color="BFBFBF" w:sz="4"/>
+              <w:left w:val="single" w:color="BFBFBF" w:sz="4"/>
+              <w:bottom w:val="single" w:color="BFBFBF" w:sz="4"/>
+              <w:right w:val="single" w:color="BFBFBF" w:sz="4"/>
+            </w:tcBorders>
+            <w:tcMar>
+              <w:top w:type="dxa" w:w="60"/>
+              <w:left w:type="dxa" w:w="90"/>
+              <w:bottom w:type="dxa" w:w="60"/>
+              <w:right w:type="dxa" w:w="90"/>
+            </w:tcMar>
+            <w:vAlign w:val="center"/>
+          </w:tcPr>
+          <w:p>
+            <w:pPr>
+              <w:spacing w:after="30" w:line="250"/>
+              <w:jc w:val="left"/>
+            </w:pPr>
+            <w:r>
+              <w:rPr>
+                <w:rFonts w:ascii="Cambria" w:cs="Cambria" w:eastAsia="Cambria" w:hAnsi="Cambria"/>
+                <w:color w:val="3A3A3A"/>
+                <w:sz w:val="18"/>
+                <w:szCs w:val="18"/>
+              </w:rPr>
+              <w:t xml:space="preserve">+ 2 bps sur les dépenses concernées</w:t>
+            </w:r>
+          </w:p>
+        </w:tc>
+        <w:tc>
+          <w:tcPr>
+            <w:tcW w:type="dxa" w:w="3338"/>
+            <w:tcBorders>
+              <w:top w:val="single" w:color="BFBFBF" w:sz="4"/>
+              <w:left w:val="single" w:color="BFBFBF" w:sz="4"/>
+              <w:bottom w:val="single" w:color="BFBFBF" w:sz="4"/>
+              <w:right w:val="single" w:color="BFBFBF" w:sz="4"/>
+            </w:tcBorders>
+            <w:tcMar>
+              <w:top w:type="dxa" w:w="60"/>
+              <w:left w:type="dxa" w:w="90"/>
+              <w:bottom w:type="dxa" w:w="60"/>
+              <w:right w:type="dxa" w:w="90"/>
+            </w:tcMar>
+            <w:vAlign w:val="center"/>
+          </w:tcPr>
+          <w:p>
+            <w:pPr>
+              <w:spacing w:after="30" w:line="250"/>
+              <w:jc w:val="left"/>
+            </w:pPr>
+            <w:r>
+              <w:rPr>
+                <w:rFonts w:ascii="Cambria" w:cs="Cambria" w:eastAsia="Cambria" w:hAnsi="Cambria"/>
+                <w:color w:val="3A3A3A"/>
+                <w:sz w:val="18"/>
+                <w:szCs w:val="18"/>
+              </w:rPr>
+              <w:t xml:space="preserve">Répond au besoin de justificatifs et de traçabilité, cité en premier</w:t>
+            </w:r>
+          </w:p>
+        </w:tc>
+      </w:tr>
+      <w:tr>
+        <w:trPr>
+          <w:cantSplit/>
+        </w:trPr>
+        <w:tc>
+          <w:tcPr>
+            <w:tcW w:type="dxa" w:w="3500"/>
+            <w:tcBorders>
+              <w:top w:val="single" w:color="BFBFBF" w:sz="4"/>
+              <w:left w:val="single" w:color="BFBFBF" w:sz="4"/>
+              <w:bottom w:val="single" w:color="BFBFBF" w:sz="4"/>
+              <w:right w:val="single" w:color="BFBFBF" w:sz="4"/>
+            </w:tcBorders>
+            <w:shd w:fill="F2F2F2" w:color="auto" w:val="clear"/>
+            <w:tcMar>
+              <w:top w:type="dxa" w:w="60"/>
+              <w:left w:type="dxa" w:w="90"/>
+              <w:bottom w:type="dxa" w:w="60"/>
+              <w:right w:type="dxa" w:w="90"/>
+            </w:tcMar>
+            <w:vAlign w:val="center"/>
+          </w:tcPr>
+          <w:p>
+            <w:pPr>
+              <w:spacing w:after="30" w:line="250"/>
+              <w:jc w:val="left"/>
+            </w:pPr>
+            <w:r>
+              <w:rPr>
+                <w:rFonts w:ascii="Cambria" w:cs="Cambria" w:eastAsia="Cambria" w:hAnsi="Cambria"/>
+                <w:color w:val="3A3A3A"/>
+                <w:sz w:val="18"/>
+                <w:szCs w:val="18"/>
+              </w:rPr>
+              <w:t xml:space="preserve">Module Online Card Management</w:t>
+            </w:r>
+          </w:p>
+        </w:tc>
+        <w:tc>
+          <w:tcPr>
+            <w:tcW w:type="dxa" w:w="2800"/>
+            <w:tcBorders>
+              <w:top w:val="single" w:color="BFBFBF" w:sz="4"/>
+              <w:left w:val="single" w:color="BFBFBF" w:sz="4"/>
+              <w:bottom w:val="single" w:color="BFBFBF" w:sz="4"/>
+              <w:right w:val="single" w:color="BFBFBF" w:sz="4"/>
+            </w:tcBorders>
+            <w:shd w:fill="F2F2F2" w:color="auto" w:val="clear"/>
+            <w:tcMar>
+              <w:top w:type="dxa" w:w="60"/>
+              <w:left w:type="dxa" w:w="90"/>
+              <w:bottom w:type="dxa" w:w="60"/>
+              <w:right w:type="dxa" w:w="90"/>
+            </w:tcMar>
+            <w:vAlign w:val="center"/>
+          </w:tcPr>
+          <w:p>
+            <w:pPr>
+              <w:spacing w:after="30" w:line="250"/>
+              <w:jc w:val="left"/>
+            </w:pPr>
+            <w:r>
+              <w:rPr>
+                <w:rFonts w:ascii="Cambria" w:cs="Cambria" w:eastAsia="Cambria" w:hAnsi="Cambria"/>
+                <w:color w:val="3A3A3A"/>
+                <w:sz w:val="18"/>
+                <w:szCs w:val="18"/>
+              </w:rPr>
+              <w:t xml:space="preserve">+ 1 bps sur toutes les dépenses ; 40 000 USD de frais de mise en œuvre distincts</w:t>
+            </w:r>
+          </w:p>
+        </w:tc>
+        <w:tc>
+          <w:tcPr>
+            <w:tcW w:type="dxa" w:w="3338"/>
+            <w:tcBorders>
+              <w:top w:val="single" w:color="BFBFBF" w:sz="4"/>
+              <w:left w:val="single" w:color="BFBFBF" w:sz="4"/>
+              <w:bottom w:val="single" w:color="BFBFBF" w:sz="4"/>
+              <w:right w:val="single" w:color="BFBFBF" w:sz="4"/>
+            </w:tcBorders>
+            <w:shd w:fill="F2F2F2" w:color="auto" w:val="clear"/>
+            <w:tcMar>
+              <w:top w:type="dxa" w:w="60"/>
+              <w:left w:type="dxa" w:w="90"/>
+              <w:bottom w:type="dxa" w:w="60"/>
+              <w:right w:type="dxa" w:w="90"/>
+            </w:tcMar>
+            <w:vAlign w:val="center"/>
+          </w:tcPr>
+          <w:p>
+            <w:pPr>
+              <w:spacing w:after="30" w:line="250"/>
+              <w:jc w:val="left"/>
+            </w:pPr>
+            <w:r>
+              <w:rPr>
+                <w:rFonts w:ascii="Cambria" w:cs="Cambria" w:eastAsia="Cambria" w:hAnsi="Cambria"/>
+                <w:color w:val="3A3A3A"/>
+                <w:sz w:val="18"/>
+                <w:szCs w:val="18"/>
+              </w:rPr>
+              <w:t xml:space="preserve">Optionnel ; utile si les plafonds et déblocages sont gérés en libre-service</w:t>
+            </w:r>
+          </w:p>
+        </w:tc>
+      </w:tr>
+      <w:tr>
+        <w:trPr>
+          <w:cantSplit/>
+        </w:trPr>
+        <w:tc>
+          <w:tcPr>
+            <w:tcW w:type="dxa" w:w="3500"/>
+            <w:tcBorders>
+              <w:top w:val="single" w:color="BFBFBF" w:sz="4"/>
+              <w:left w:val="single" w:color="BFBFBF" w:sz="4"/>
+              <w:bottom w:val="single" w:color="BFBFBF" w:sz="4"/>
+              <w:right w:val="single" w:color="BFBFBF" w:sz="4"/>
+            </w:tcBorders>
+            <w:tcMar>
+              <w:top w:type="dxa" w:w="60"/>
+              <w:left w:type="dxa" w:w="90"/>
+              <w:bottom w:type="dxa" w:w="60"/>
+              <w:right w:type="dxa" w:w="90"/>
+            </w:tcMar>
+            <w:vAlign w:val="center"/>
+          </w:tcPr>
+          <w:p>
+            <w:pPr>
+              <w:spacing w:after="30" w:line="250"/>
+              <w:jc w:val="left"/>
+            </w:pPr>
+            <w:r>
+              <w:rPr>
+                <w:rFonts w:ascii="Cambria" w:cs="Cambria" w:eastAsia="Cambria" w:hAnsi="Cambria"/>
+                <w:color w:val="3A3A3A"/>
+                <w:sz w:val="18"/>
+                <w:szCs w:val="18"/>
+              </w:rPr>
+              <w:t xml:space="preserve">Frais de mise en œuvre</w:t>
+            </w:r>
+          </w:p>
+        </w:tc>
+        <w:tc>
+          <w:tcPr>
+            <w:tcW w:type="dxa" w:w="2800"/>
+            <w:tcBorders>
+              <w:top w:val="single" w:color="BFBFBF" w:sz="4"/>
+              <w:left w:val="single" w:color="BFBFBF" w:sz="4"/>
+              <w:bottom w:val="single" w:color="BFBFBF" w:sz="4"/>
+              <w:right w:val="single" w:color="BFBFBF" w:sz="4"/>
+            </w:tcBorders>
+            <w:tcMar>
+              <w:top w:type="dxa" w:w="60"/>
+              <w:left w:type="dxa" w:w="90"/>
+              <w:bottom w:type="dxa" w:w="60"/>
+              <w:right w:type="dxa" w:w="90"/>
+            </w:tcMar>
+            <w:vAlign w:val="center"/>
+          </w:tcPr>
+          <w:p>
+            <w:pPr>
+              <w:spacing w:after="30" w:line="250"/>
+              <w:jc w:val="left"/>
+            </w:pPr>
+            <w:r>
+              <w:rPr>
+                <w:rFonts w:ascii="Cambria" w:cs="Cambria" w:eastAsia="Cambria" w:hAnsi="Cambria"/>
+                <w:color w:val="3A3A3A"/>
+                <w:sz w:val="18"/>
+                <w:szCs w:val="18"/>
+              </w:rPr>
+              <w:t xml:space="preserve">25 000 USD</w:t>
+            </w:r>
+          </w:p>
+        </w:tc>
+        <w:tc>
+          <w:tcPr>
+            <w:tcW w:type="dxa" w:w="3338"/>
+            <w:tcBorders>
+              <w:top w:val="single" w:color="BFBFBF" w:sz="4"/>
+              <w:left w:val="single" w:color="BFBFBF" w:sz="4"/>
+              <w:bottom w:val="single" w:color="BFBFBF" w:sz="4"/>
+              <w:right w:val="single" w:color="BFBFBF" w:sz="4"/>
+            </w:tcBorders>
+            <w:tcMar>
+              <w:top w:type="dxa" w:w="60"/>
+              <w:left w:type="dxa" w:w="90"/>
+              <w:bottom w:type="dxa" w:w="60"/>
+              <w:right w:type="dxa" w:w="90"/>
+            </w:tcMar>
+            <w:vAlign w:val="center"/>
+          </w:tcPr>
+          <w:p>
+            <w:pPr>
+              <w:spacing w:after="30" w:line="250"/>
+              <w:jc w:val="left"/>
+            </w:pPr>
+            <w:r>
+              <w:rPr>
+                <w:rFonts w:ascii="Cambria" w:cs="Cambria" w:eastAsia="Cambria" w:hAnsi="Cambria"/>
+                <w:color w:val="3A3A3A"/>
+                <w:sz w:val="18"/>
+                <w:szCs w:val="18"/>
+              </w:rPr>
+              <w:t xml:space="preserve">Coût unique</w:t>
+            </w:r>
+          </w:p>
+        </w:tc>
+      </w:tr>
+      <w:tr>
+        <w:trPr>
+          <w:cantSplit/>
+        </w:trPr>
+        <w:tc>
+          <w:tcPr>
+            <w:tcW w:type="dxa" w:w="3500"/>
+            <w:tcBorders>
+              <w:top w:val="single" w:color="BFBFBF" w:sz="4"/>
+              <w:left w:val="single" w:color="BFBFBF" w:sz="4"/>
+              <w:bottom w:val="single" w:color="BFBFBF" w:sz="4"/>
+              <w:right w:val="single" w:color="BFBFBF" w:sz="4"/>
+            </w:tcBorders>
+            <w:shd w:fill="F2F2F2" w:color="auto" w:val="clear"/>
+            <w:tcMar>
+              <w:top w:type="dxa" w:w="60"/>
+              <w:left w:type="dxa" w:w="90"/>
+              <w:bottom w:type="dxa" w:w="60"/>
+              <w:right w:type="dxa" w:w="90"/>
+            </w:tcMar>
+            <w:vAlign w:val="center"/>
+          </w:tcPr>
+          <w:p>
+            <w:pPr>
+              <w:spacing w:after="30" w:line="250"/>
+              <w:jc w:val="left"/>
+            </w:pPr>
+            <w:r>
+              <w:rPr>
+                <w:rFonts w:ascii="Cambria" w:cs="Cambria" w:eastAsia="Cambria" w:hAnsi="Cambria"/>
+                <w:color w:val="3A3A3A"/>
+                <w:sz w:val="18"/>
+                <w:szCs w:val="18"/>
+              </w:rPr>
+              <w:t xml:space="preserve">Minimum mensuel</w:t>
+            </w:r>
+          </w:p>
+        </w:tc>
+        <w:tc>
+          <w:tcPr>
+            <w:tcW w:type="dxa" w:w="2800"/>
+            <w:tcBorders>
+              <w:top w:val="single" w:color="BFBFBF" w:sz="4"/>
+              <w:left w:val="single" w:color="BFBFBF" w:sz="4"/>
+              <w:bottom w:val="single" w:color="BFBFBF" w:sz="4"/>
+              <w:right w:val="single" w:color="BFBFBF" w:sz="4"/>
+            </w:tcBorders>
+            <w:shd w:fill="F2F2F2" w:color="auto" w:val="clear"/>
+            <w:tcMar>
+              <w:top w:type="dxa" w:w="60"/>
+              <w:left w:type="dxa" w:w="90"/>
+              <w:bottom w:type="dxa" w:w="60"/>
+              <w:right w:type="dxa" w:w="90"/>
+            </w:tcMar>
+            <w:vAlign w:val="center"/>
+          </w:tcPr>
+          <w:p>
+            <w:pPr>
+              <w:spacing w:after="30" w:line="250"/>
+              <w:jc w:val="left"/>
+            </w:pPr>
+            <w:r>
+              <w:rPr>
+                <w:rFonts w:ascii="Cambria" w:cs="Cambria" w:eastAsia="Cambria" w:hAnsi="Cambria"/>
+                <w:color w:val="3A3A3A"/>
+                <w:sz w:val="18"/>
+                <w:szCs w:val="18"/>
+              </w:rPr>
+              <w:t xml:space="preserve">2 000 USD</w:t>
+            </w:r>
+          </w:p>
+        </w:tc>
+        <w:tc>
+          <w:tcPr>
+            <w:tcW w:type="dxa" w:w="3338"/>
+            <w:tcBorders>
+              <w:top w:val="single" w:color="BFBFBF" w:sz="4"/>
+              <w:left w:val="single" w:color="BFBFBF" w:sz="4"/>
+              <w:bottom w:val="single" w:color="BFBFBF" w:sz="4"/>
+              <w:right w:val="single" w:color="BFBFBF" w:sz="4"/>
+            </w:tcBorders>
+            <w:shd w:fill="F2F2F2" w:color="auto" w:val="clear"/>
+            <w:tcMar>
+              <w:top w:type="dxa" w:w="60"/>
+              <w:left w:type="dxa" w:w="90"/>
+              <w:bottom w:type="dxa" w:w="60"/>
+              <w:right w:type="dxa" w:w="90"/>
+            </w:tcMar>
+            <w:vAlign w:val="center"/>
+          </w:tcPr>
+          <w:p>
+            <w:pPr>
+              <w:spacing w:after="30" w:line="250"/>
+              <w:jc w:val="left"/>
+            </w:pPr>
+            <w:r>
+              <w:rPr>
+                <w:rFonts w:ascii="Cambria" w:cs="Cambria" w:eastAsia="Cambria" w:hAnsi="Cambria"/>
+                <w:color w:val="3A3A3A"/>
+                <w:sz w:val="18"/>
+                <w:szCs w:val="18"/>
+              </w:rPr>
+              <w:t xml:space="preserve">Dû quel que soit le volume de dépenses</w:t>
+            </w:r>
+          </w:p>
+        </w:tc>
+      </w:tr>
+      <w:tr>
+        <w:trPr>
+          <w:cantSplit/>
+        </w:trPr>
+        <w:tc>
+          <w:tcPr>
+            <w:tcW w:type="dxa" w:w="3500"/>
+            <w:tcBorders>
+              <w:top w:val="single" w:color="BFBFBF" w:sz="4"/>
+              <w:left w:val="single" w:color="BFBFBF" w:sz="4"/>
+              <w:bottom w:val="single" w:color="BFBFBF" w:sz="4"/>
+              <w:right w:val="single" w:color="BFBFBF" w:sz="4"/>
+            </w:tcBorders>
+            <w:tcMar>
+              <w:top w:type="dxa" w:w="60"/>
+              <w:left w:type="dxa" w:w="90"/>
+              <w:bottom w:type="dxa" w:w="60"/>
+              <w:right w:type="dxa" w:w="90"/>
+            </w:tcMar>
+            <w:vAlign w:val="center"/>
+          </w:tcPr>
+          <w:p>
+            <w:pPr>
+              <w:spacing w:after="30" w:line="250"/>
+              <w:jc w:val="left"/>
+            </w:pPr>
+            <w:r>
+              <w:rPr>
+                <w:rFonts w:ascii="Cambria" w:cs="Cambria" w:eastAsia="Cambria" w:hAnsi="Cambria"/>
+                <w:color w:val="3A3A3A"/>
+                <w:sz w:val="18"/>
+                <w:szCs w:val="18"/>
+              </w:rPr>
+              <w:t xml:space="preserve">Certification VCF (Visa Commercial Format)</w:t>
+            </w:r>
+          </w:p>
+        </w:tc>
+        <w:tc>
+          <w:tcPr>
+            <w:tcW w:type="dxa" w:w="2800"/>
+            <w:tcBorders>
+              <w:top w:val="single" w:color="BFBFBF" w:sz="4"/>
+              <w:left w:val="single" w:color="BFBFBF" w:sz="4"/>
+              <w:bottom w:val="single" w:color="BFBFBF" w:sz="4"/>
+              <w:right w:val="single" w:color="BFBFBF" w:sz="4"/>
+            </w:tcBorders>
+            <w:tcMar>
+              <w:top w:type="dxa" w:w="60"/>
+              <w:left w:type="dxa" w:w="90"/>
+              <w:bottom w:type="dxa" w:w="60"/>
+              <w:right w:type="dxa" w:w="90"/>
+            </w:tcMar>
+            <w:vAlign w:val="center"/>
+          </w:tcPr>
+          <w:p>
+            <w:pPr>
+              <w:spacing w:after="30" w:line="250"/>
+              <w:jc w:val="left"/>
+            </w:pPr>
+            <w:r>
+              <w:rPr>
+                <w:rFonts w:ascii="Cambria" w:cs="Cambria" w:eastAsia="Cambria" w:hAnsi="Cambria"/>
+                <w:color w:val="3A3A3A"/>
+                <w:sz w:val="18"/>
+                <w:szCs w:val="18"/>
+              </w:rPr>
+              <w:t xml:space="preserve">14 000 USD (facturée une seule fois pour plusieurs services)</w:t>
+            </w:r>
+          </w:p>
+        </w:tc>
+        <w:tc>
+          <w:tcPr>
+            <w:tcW w:type="dxa" w:w="3338"/>
+            <w:tcBorders>
+              <w:top w:val="single" w:color="BFBFBF" w:sz="4"/>
+              <w:left w:val="single" w:color="BFBFBF" w:sz="4"/>
+              <w:bottom w:val="single" w:color="BFBFBF" w:sz="4"/>
+              <w:right w:val="single" w:color="BFBFBF" w:sz="4"/>
+            </w:tcBorders>
+            <w:tcMar>
+              <w:top w:type="dxa" w:w="60"/>
+              <w:left w:type="dxa" w:w="90"/>
+              <w:bottom w:type="dxa" w:w="60"/>
+              <w:right w:type="dxa" w:w="90"/>
+            </w:tcMar>
+            <w:vAlign w:val="center"/>
+          </w:tcPr>
+          <w:p>
+            <w:pPr>
+              <w:spacing w:after="30" w:line="250"/>
+              <w:jc w:val="left"/>
+            </w:pPr>
+            <w:r>
+              <w:rPr>
+                <w:rFonts w:ascii="Cambria" w:cs="Cambria" w:eastAsia="Cambria" w:hAnsi="Cambria"/>
+                <w:color w:val="3A3A3A"/>
+                <w:sz w:val="18"/>
+                <w:szCs w:val="18"/>
+              </w:rPr>
+              <w:t xml:space="preserve">Prérequis technique</w:t>
+            </w:r>
+          </w:p>
+        </w:tc>
+      </w:tr>
+      <w:tr>
+        <w:trPr>
+          <w:cantSplit/>
+        </w:trPr>
+        <w:tc>
+          <w:tcPr>
+            <w:tcW w:type="dxa" w:w="3500"/>
+            <w:tcBorders>
+              <w:top w:val="single" w:color="BFBFBF" w:sz="4"/>
+              <w:left w:val="single" w:color="BFBFBF" w:sz="4"/>
+              <w:bottom w:val="single" w:color="BFBFBF" w:sz="4"/>
+              <w:right w:val="single" w:color="BFBFBF" w:sz="4"/>
+            </w:tcBorders>
+            <w:shd w:fill="F2F2F2" w:color="auto" w:val="clear"/>
+            <w:tcMar>
+              <w:top w:type="dxa" w:w="60"/>
+              <w:left w:type="dxa" w:w="90"/>
+              <w:bottom w:type="dxa" w:w="60"/>
+              <w:right w:type="dxa" w:w="90"/>
+            </w:tcMar>
+            <w:vAlign w:val="center"/>
+          </w:tcPr>
+          <w:p>
+            <w:pPr>
+              <w:spacing w:after="30" w:line="250"/>
+              <w:jc w:val="left"/>
+            </w:pPr>
+            <w:r>
+              <w:rPr>
+                <w:rFonts w:ascii="Cambria" w:cs="Cambria" w:eastAsia="Cambria" w:hAnsi="Cambria"/>
+                <w:color w:val="3A3A3A"/>
+                <w:sz w:val="18"/>
+                <w:szCs w:val="18"/>
+              </w:rPr>
+              <w:t xml:space="preserve">Report ou annulation de projet ; rejet de fichier</w:t>
+            </w:r>
+          </w:p>
+        </w:tc>
+        <w:tc>
+          <w:tcPr>
+            <w:tcW w:type="dxa" w:w="2800"/>
+            <w:tcBorders>
+              <w:top w:val="single" w:color="BFBFBF" w:sz="4"/>
+              <w:left w:val="single" w:color="BFBFBF" w:sz="4"/>
+              <w:bottom w:val="single" w:color="BFBFBF" w:sz="4"/>
+              <w:right w:val="single" w:color="BFBFBF" w:sz="4"/>
+            </w:tcBorders>
+            <w:shd w:fill="F2F2F2" w:color="auto" w:val="clear"/>
+            <w:tcMar>
+              <w:top w:type="dxa" w:w="60"/>
+              <w:left w:type="dxa" w:w="90"/>
+              <w:bottom w:type="dxa" w:w="60"/>
+              <w:right w:type="dxa" w:w="90"/>
+            </w:tcMar>
+            <w:vAlign w:val="center"/>
+          </w:tcPr>
+          <w:p>
+            <w:pPr>
+              <w:spacing w:after="30" w:line="250"/>
+              <w:jc w:val="left"/>
+            </w:pPr>
+            <w:r>
+              <w:rPr>
+                <w:rFonts w:ascii="Cambria" w:cs="Cambria" w:eastAsia="Cambria" w:hAnsi="Cambria"/>
+                <w:color w:val="3A3A3A"/>
+                <w:sz w:val="18"/>
+                <w:szCs w:val="18"/>
+              </w:rPr>
+              <w:t xml:space="preserve">2 000 USD ; 4 000 USD ; 500 USD par fichier rejeté</w:t>
+            </w:r>
+          </w:p>
+        </w:tc>
+        <w:tc>
+          <w:tcPr>
+            <w:tcW w:type="dxa" w:w="3338"/>
+            <w:tcBorders>
+              <w:top w:val="single" w:color="BFBFBF" w:sz="4"/>
+              <w:left w:val="single" w:color="BFBFBF" w:sz="4"/>
+              <w:bottom w:val="single" w:color="BFBFBF" w:sz="4"/>
+              <w:right w:val="single" w:color="BFBFBF" w:sz="4"/>
+            </w:tcBorders>
+            <w:shd w:fill="F2F2F2" w:color="auto" w:val="clear"/>
+            <w:tcMar>
+              <w:top w:type="dxa" w:w="60"/>
+              <w:left w:type="dxa" w:w="90"/>
+              <w:bottom w:type="dxa" w:w="60"/>
+              <w:right w:type="dxa" w:w="90"/>
+            </w:tcMar>
+            <w:vAlign w:val="center"/>
+          </w:tcPr>
+          <w:p>
+            <w:pPr>
+              <w:spacing w:after="30" w:line="250"/>
+              <w:jc w:val="left"/>
+            </w:pPr>
+            <w:r>
+              <w:rPr>
+                <w:rFonts w:ascii="Cambria" w:cs="Cambria" w:eastAsia="Cambria" w:hAnsi="Cambria"/>
+                <w:color w:val="3A3A3A"/>
+                <w:sz w:val="18"/>
+                <w:szCs w:val="18"/>
+              </w:rPr>
+              <w:t xml:space="preserve">Risque lié à la qualité des données transmises</w:t>
+            </w:r>
+          </w:p>
+        </w:tc>
+      </w:tr>
+    </w:tbl>
+    <w:p>
+      <w:pPr>
+        <w:spacing w:after="100"/>
+      </w:pPr>
+    </w:p>
+    <w:p>
+      <w:pPr>
+        <w:spacing w:after="60" w:line="300"/>
+        <w:jc w:val="both"/>
+      </w:pPr>
+      <w:r>
+        <w:rPr>
+          <w:rFonts w:ascii="Cambria" w:cs="Cambria" w:eastAsia="Cambria" w:hAnsi="Cambria"/>
+          <w:b/>
+          <w:bCs/>
+          <w:color w:val="3A3A3A"/>
+          <w:sz w:val="21"/>
+          <w:szCs w:val="21"/>
+        </w:rPr>
+        <w:t xml:space="preserve">Ce qu’il faut en retenir :</w:t>
+      </w:r>
+    </w:p>
+    <w:p>
+      <w:pPr>
+        <w:pStyle w:val="ListParagraph"/>
+        <w:numPr>
+          <w:ilvl w:val="0"/>
+          <w:numId w:val="2"/>
+        </w:numPr>
+        <w:spacing w:after="70" w:line="290"/>
+        <w:jc w:val="left"/>
+      </w:pPr>
+      <w:r>
+        <w:rPr>
+          <w:rFonts w:ascii="Cambria" w:cs="Cambria" w:eastAsia="Cambria" w:hAnsi="Cambria"/>
+          <w:b/>
+          <w:bCs/>
+          <w:color w:val="3A3A3A"/>
+          <w:sz w:val="21"/>
+          <w:szCs w:val="21"/>
+        </w:rPr>
+        <w:t xml:space="preserve">Le périmètre fonctionnel utile est PLUS + Expense Management, soit 8 bps sur les dépenses concernées.</w:t>
+      </w:r>
+      <w:r>
+        <w:rPr>
+          <w:rFonts w:ascii="Cambria" w:cs="Cambria" w:eastAsia="Cambria" w:hAnsi="Cambria"/>
+          <w:color w:val="3A3A3A"/>
+          <w:sz w:val="21"/>
+          <w:szCs w:val="21"/>
+        </w:rPr>
+        <w:t xml:space="preserve"> Ce sont les besoins les plus cités (traçabilité, contrôle, justificatifs) qui imposent ce niveau, et non le package de base.</w:t>
+      </w:r>
+    </w:p>
+    <w:p>
+      <w:pPr>
+        <w:pStyle w:val="ListParagraph"/>
+        <w:numPr>
+          <w:ilvl w:val="0"/>
+          <w:numId w:val="2"/>
+        </w:numPr>
+        <w:spacing w:after="70" w:line="290"/>
+        <w:jc w:val="left"/>
+      </w:pPr>
+      <w:r>
+        <w:rPr>
+          <w:rFonts w:ascii="Cambria" w:cs="Cambria" w:eastAsia="Cambria" w:hAnsi="Cambria"/>
+          <w:b/>
+          <w:bCs/>
+          <w:color w:val="3A3A3A"/>
+          <w:sz w:val="21"/>
+          <w:szCs w:val="21"/>
+        </w:rPr>
+        <w:t xml:space="preserve">Coûts fixes de démarrage d’environ 39 000 USD</w:t>
+      </w:r>
+      <w:r>
+        <w:rPr>
+          <w:rFonts w:ascii="Cambria" w:cs="Cambria" w:eastAsia="Cambria" w:hAnsi="Cambria"/>
+          <w:color w:val="3A3A3A"/>
+          <w:sz w:val="21"/>
+          <w:szCs w:val="21"/>
+        </w:rPr>
+        <w:t xml:space="preserve"> (mise en œuvre et certification), auxquels s’ajoutent 40 000 USD si le module Online Card Management est retenu.</w:t>
+      </w:r>
+    </w:p>
+    <w:p>
+      <w:pPr>
+        <w:pStyle w:val="ListParagraph"/>
+        <w:numPr>
+          <w:ilvl w:val="0"/>
+          <w:numId w:val="2"/>
+        </w:numPr>
+        <w:spacing w:after="70" w:line="290"/>
+        <w:jc w:val="left"/>
+      </w:pPr>
+      <w:r>
+        <w:rPr>
+          <w:rFonts w:ascii="Cambria" w:cs="Cambria" w:eastAsia="Cambria" w:hAnsi="Cambria"/>
+          <w:b/>
+          <w:bCs/>
+          <w:color w:val="3A3A3A"/>
+          <w:sz w:val="21"/>
+          <w:szCs w:val="21"/>
+        </w:rPr>
+        <w:t xml:space="preserve">Le minimum mensuel de 2 000 USD (24 000 USD par an) est dû dès le premier jour.</w:t>
+      </w:r>
+      <w:r>
+        <w:rPr>
+          <w:rFonts w:ascii="Cambria" w:cs="Cambria" w:eastAsia="Cambria" w:hAnsi="Cambria"/>
+          <w:color w:val="3A3A3A"/>
+          <w:sz w:val="21"/>
+          <w:szCs w:val="21"/>
+        </w:rPr>
+        <w:t xml:space="preserve"> Les frais proportionnels ne dépassent ce minimum qu’à partir d’environ 3,3 M USD de dépenses par mois avec le package PLUS (2,5 M USD avec le module Expense Management). Pendant la montée en charge, ce minimum doit être couvert par les abonnements. À titre indicatif, avec un taux de 600 FCFA pour 1 USD (hypothèse à actualiser), il équivaut à environ 14 M FCFA par an, soit près de </w:t>
+      </w:r>
+      <w:r>
+        <w:rPr>
+          <w:rFonts w:ascii="Cambria" w:cs="Cambria" w:eastAsia="Cambria" w:hAnsi="Cambria"/>
+          <w:b/>
+          <w:bCs/>
+          <w:color w:val="3A3A3A"/>
+          <w:sz w:val="21"/>
+          <w:szCs w:val="21"/>
+        </w:rPr>
+        <w:t xml:space="preserve">8 contrats Starter</w:t>
+      </w:r>
+      <w:r>
+        <w:rPr>
+          <w:rFonts w:ascii="Cambria" w:cs="Cambria" w:eastAsia="Cambria" w:hAnsi="Cambria"/>
+          <w:color w:val="3A3A3A"/>
+          <w:sz w:val="21"/>
+          <w:szCs w:val="21"/>
+        </w:rPr>
+        <w:t xml:space="preserve"> (1,8 M FCFA d’abonnement annuel chacun).</w:t>
+      </w:r>
+    </w:p>
+    <w:p>
+      <w:pPr>
+        <w:pStyle w:val="ListParagraph"/>
+        <w:numPr>
+          <w:ilvl w:val="0"/>
+          <w:numId w:val="2"/>
+        </w:numPr>
+        <w:spacing w:after="70" w:line="290"/>
+        <w:jc w:val="left"/>
+      </w:pPr>
+      <w:r>
+        <w:rPr>
+          <w:rFonts w:ascii="Cambria" w:cs="Cambria" w:eastAsia="Cambria" w:hAnsi="Cambria"/>
+          <w:b/>
+          <w:bCs/>
+          <w:color w:val="3A3A3A"/>
+          <w:sz w:val="21"/>
+          <w:szCs w:val="21"/>
+        </w:rPr>
+        <w:t xml:space="preserve">Le coût variable de Visa (6 à 8 bps) reste très inférieur aux commissions envisagées sur transactions (0,5 % à 1,0 %, soit 50 à 100 bps).</w:t>
+      </w:r>
+      <w:r>
+        <w:rPr>
+          <w:rFonts w:ascii="Cambria" w:cs="Cambria" w:eastAsia="Cambria" w:hAnsi="Cambria"/>
+          <w:color w:val="3A3A3A"/>
+          <w:sz w:val="21"/>
+          <w:szCs w:val="21"/>
+        </w:rPr>
+        <w:t xml:space="preserve"> La marge brute dépend donc du volume et des autres coûts de la banque (émission, monétique, support), à documenter dans le business case prévu à l’étape de cadrage.</w:t>
+      </w:r>
+    </w:p>
+    <w:p>
+      <w:pPr>
+        <w:spacing w:after="100" w:line="300"/>
+        <w:jc w:val="both"/>
+      </w:pPr>
+      <w:r>
+        <w:rPr>
+          <w:rFonts w:ascii="Cambria" w:cs="Cambria" w:eastAsia="Cambria" w:hAnsi="Cambria"/>
+          <w:color w:val="3A3A3A"/>
+          <w:sz w:val="21"/>
+          <w:szCs w:val="21"/>
+        </w:rPr>
+        <w:t xml:space="preserve">Ces tarifs datent de 2023 et doivent être confirmés par Visa avant toute décision.</w:t>
+      </w:r>
+    </w:p>
+    <w:p>
+      <w:pPr>
+        <w:pStyle w:val="Heading2"/>
+        <w:keepNext/>
+        <w:pBdr>
+          <w:bottom w:val="single" w:color="C00000" w:sz="6" w:space="2"/>
+        </w:pBdr>
+        <w:spacing w:after="120" w:before="260"/>
+      </w:pPr>
+      <w:r>
+        <w:rPr>
+          <w:rFonts w:ascii="Cambria" w:cs="Cambria" w:eastAsia="Cambria" w:hAnsi="Cambria"/>
+          <w:b/>
+          <w:bCs/>
+          <w:color w:val="C00000"/>
+          <w:sz w:val="25"/>
+          <w:szCs w:val="25"/>
+        </w:rPr>
+        <w:t xml:space="preserve">8.2 Prérequis techniques : transmission des fichiers à Visa</w:t>
+      </w:r>
+    </w:p>
+    <w:p>
+      <w:pPr>
+        <w:spacing w:after="120" w:line="300"/>
+        <w:jc w:val="both"/>
+      </w:pPr>
+      <w:r>
+        <w:rPr>
+          <w:rFonts w:ascii="Cambria" w:cs="Cambria" w:eastAsia="Cambria" w:hAnsi="Cambria"/>
+          <w:color w:val="3A3A3A"/>
+          <w:sz w:val="21"/>
+          <w:szCs w:val="21"/>
+        </w:rPr>
+        <w:t xml:space="preserve">Pour alimenter la plateforme, la banque (émetteur) doit transmettre à Visa des fichiers de données de transactions au format VCF (Visa Commercial Format, version 4.4 pour l’échantillon fourni). Deux modes de livraison sont possibles :</w:t>
+      </w:r>
+    </w:p>
+    <w:tbl>
+      <w:tblPr>
+        <w:tblW w:type="dxa" w:w="9638"/>
+        <w:tblBorders>
+          <w:top w:val="single" w:color="auto" w:sz="4"/>
+          <w:left w:val="single" w:color="auto" w:sz="4"/>
+          <w:bottom w:val="single" w:color="auto" w:sz="4"/>
+          <w:right w:val="single" w:color="auto" w:sz="4"/>
+          <w:insideH w:val="single" w:color="auto" w:sz="4"/>
+          <w:insideV w:val="single" w:color="auto" w:sz="4"/>
+        </w:tblBorders>
+      </w:tblPr>
+      <w:tblGrid>
+        <w:gridCol w:w="3500"/>
+        <w:gridCol w:w="6138"/>
+      </w:tblGrid>
+      <w:tr>
+        <w:trPr>
+          <w:cantSplit/>
+          <w:tblHeader/>
+        </w:trPr>
+        <w:tc>
+          <w:tcPr>
+            <w:tcW w:type="dxa" w:w="3500"/>
+            <w:tcBorders>
+              <w:top w:val="single" w:color="BFBFBF" w:sz="4"/>
+              <w:left w:val="single" w:color="BFBFBF" w:sz="4"/>
+              <w:bottom w:val="single" w:color="BFBFBF" w:sz="4"/>
+              <w:right w:val="single" w:color="BFBFBF" w:sz="4"/>
+            </w:tcBorders>
+            <w:shd w:fill="C00000" w:color="auto" w:val="clear"/>
+            <w:tcMar>
+              <w:top w:type="dxa" w:w="60"/>
+              <w:left w:type="dxa" w:w="90"/>
+              <w:bottom w:type="dxa" w:w="60"/>
+              <w:right w:type="dxa" w:w="90"/>
+            </w:tcMar>
+            <w:vAlign w:val="center"/>
+          </w:tcPr>
+          <w:p>
+            <w:pPr>
+              <w:spacing w:after="30" w:line="250"/>
+              <w:jc w:val="left"/>
+            </w:pPr>
+            <w:r>
+              <w:rPr>
+                <w:rFonts w:ascii="Cambria" w:cs="Cambria" w:eastAsia="Cambria" w:hAnsi="Cambria"/>
+                <w:b/>
+                <w:bCs/>
+                <w:color w:val="FFFFFF"/>
+                <w:sz w:val="18"/>
+                <w:szCs w:val="18"/>
+              </w:rPr>
+              <w:t xml:space="preserve">Mode</w:t>
+            </w:r>
+          </w:p>
+        </w:tc>
+        <w:tc>
+          <w:tcPr>
+            <w:tcW w:type="dxa" w:w="6138"/>
+            <w:tcBorders>
+              <w:top w:val="single" w:color="BFBFBF" w:sz="4"/>
+              <w:left w:val="single" w:color="BFBFBF" w:sz="4"/>
+              <w:bottom w:val="single" w:color="BFBFBF" w:sz="4"/>
+              <w:right w:val="single" w:color="BFBFBF" w:sz="4"/>
+            </w:tcBorders>
+            <w:shd w:fill="C00000" w:color="auto" w:val="clear"/>
+            <w:tcMar>
+              <w:top w:type="dxa" w:w="60"/>
+              <w:left w:type="dxa" w:w="90"/>
+              <w:bottom w:type="dxa" w:w="60"/>
+              <w:right w:type="dxa" w:w="90"/>
+            </w:tcMar>
+            <w:vAlign w:val="center"/>
+          </w:tcPr>
+          <w:p>
+            <w:pPr>
+              <w:spacing w:after="30" w:line="250"/>
+              <w:jc w:val="left"/>
+            </w:pPr>
+            <w:r>
+              <w:rPr>
+                <w:rFonts w:ascii="Cambria" w:cs="Cambria" w:eastAsia="Cambria" w:hAnsi="Cambria"/>
+                <w:b/>
+                <w:bCs/>
+                <w:color w:val="FFFFFF"/>
+                <w:sz w:val="18"/>
+                <w:szCs w:val="18"/>
+              </w:rPr>
+              <w:t xml:space="preserve">Principales exigences</w:t>
+            </w:r>
+          </w:p>
+        </w:tc>
+      </w:tr>
+      <w:tr>
+        <w:trPr>
+          <w:cantSplit/>
+        </w:trPr>
+        <w:tc>
+          <w:tcPr>
+            <w:tcW w:type="dxa" w:w="3500"/>
+            <w:tcBorders>
+              <w:top w:val="single" w:color="BFBFBF" w:sz="4"/>
+              <w:left w:val="single" w:color="BFBFBF" w:sz="4"/>
+              <w:bottom w:val="single" w:color="BFBFBF" w:sz="4"/>
+              <w:right w:val="single" w:color="BFBFBF" w:sz="4"/>
+            </w:tcBorders>
+            <w:tcMar>
+              <w:top w:type="dxa" w:w="60"/>
+              <w:left w:type="dxa" w:w="90"/>
+              <w:bottom w:type="dxa" w:w="60"/>
+              <w:right w:type="dxa" w:w="90"/>
+            </w:tcMar>
+            <w:vAlign w:val="center"/>
+          </w:tcPr>
+          <w:p>
+            <w:pPr>
+              <w:spacing w:after="30" w:line="250"/>
+              <w:jc w:val="left"/>
+            </w:pPr>
+            <w:r>
+              <w:rPr>
+                <w:rFonts w:ascii="Cambria" w:cs="Cambria" w:eastAsia="Cambria" w:hAnsi="Cambria"/>
+                <w:color w:val="3A3A3A"/>
+                <w:sz w:val="18"/>
+                <w:szCs w:val="18"/>
+              </w:rPr>
+              <w:t xml:space="preserve">Serveur hébergé par l’émetteur (Visa vient récupérer les fichiers)</w:t>
+            </w:r>
+          </w:p>
+        </w:tc>
+        <w:tc>
+          <w:tcPr>
+            <w:tcW w:type="dxa" w:w="6138"/>
+            <w:tcBorders>
+              <w:top w:val="single" w:color="BFBFBF" w:sz="4"/>
+              <w:left w:val="single" w:color="BFBFBF" w:sz="4"/>
+              <w:bottom w:val="single" w:color="BFBFBF" w:sz="4"/>
+              <w:right w:val="single" w:color="BFBFBF" w:sz="4"/>
+            </w:tcBorders>
+            <w:tcMar>
+              <w:top w:type="dxa" w:w="60"/>
+              <w:left w:type="dxa" w:w="90"/>
+              <w:bottom w:type="dxa" w:w="60"/>
+              <w:right w:type="dxa" w:w="90"/>
+            </w:tcMar>
+            <w:vAlign w:val="center"/>
+          </w:tcPr>
+          <w:p>
+            <w:pPr>
+              <w:spacing w:after="30" w:line="250"/>
+              <w:jc w:val="left"/>
+            </w:pPr>
+            <w:r>
+              <w:rPr>
+                <w:rFonts w:ascii="Cambria" w:cs="Cambria" w:eastAsia="Cambria" w:hAnsi="Cambria"/>
+                <w:color w:val="3A3A3A"/>
+                <w:sz w:val="18"/>
+                <w:szCs w:val="18"/>
+              </w:rPr>
+              <w:t xml:space="preserve">Chiffrement des fichiers avec la clé publique PGP de Visa ; communication des chemin et accès SFTP (identifiant et mot de passe ou clé SSH) ; port 22 uniquement ; emplacement, fréquence et nomenclature des fichiers définis par la banque ; test de connectivité par Visa</w:t>
+            </w:r>
+          </w:p>
+        </w:tc>
+      </w:tr>
+      <w:tr>
+        <w:trPr>
+          <w:cantSplit/>
+        </w:trPr>
+        <w:tc>
+          <w:tcPr>
+            <w:tcW w:type="dxa" w:w="3500"/>
+            <w:tcBorders>
+              <w:top w:val="single" w:color="BFBFBF" w:sz="4"/>
+              <w:left w:val="single" w:color="BFBFBF" w:sz="4"/>
+              <w:bottom w:val="single" w:color="BFBFBF" w:sz="4"/>
+              <w:right w:val="single" w:color="BFBFBF" w:sz="4"/>
+            </w:tcBorders>
+            <w:shd w:fill="F2F2F2" w:color="auto" w:val="clear"/>
+            <w:tcMar>
+              <w:top w:type="dxa" w:w="60"/>
+              <w:left w:type="dxa" w:w="90"/>
+              <w:bottom w:type="dxa" w:w="60"/>
+              <w:right w:type="dxa" w:w="90"/>
+            </w:tcMar>
+            <w:vAlign w:val="center"/>
+          </w:tcPr>
+          <w:p>
+            <w:pPr>
+              <w:spacing w:after="30" w:line="250"/>
+              <w:jc w:val="left"/>
+            </w:pPr>
+            <w:r>
+              <w:rPr>
+                <w:rFonts w:ascii="Cambria" w:cs="Cambria" w:eastAsia="Cambria" w:hAnsi="Cambria"/>
+                <w:color w:val="3A3A3A"/>
+                <w:sz w:val="18"/>
+                <w:szCs w:val="18"/>
+              </w:rPr>
+              <w:t xml:space="preserve">VFES, Visa File Exchange Service (la banque livre les fichiers sur le serveur de Visa)</w:t>
+            </w:r>
+          </w:p>
+        </w:tc>
+        <w:tc>
+          <w:tcPr>
+            <w:tcW w:type="dxa" w:w="6138"/>
+            <w:tcBorders>
+              <w:top w:val="single" w:color="BFBFBF" w:sz="4"/>
+              <w:left w:val="single" w:color="BFBFBF" w:sz="4"/>
+              <w:bottom w:val="single" w:color="BFBFBF" w:sz="4"/>
+              <w:right w:val="single" w:color="BFBFBF" w:sz="4"/>
+            </w:tcBorders>
+            <w:shd w:fill="F2F2F2" w:color="auto" w:val="clear"/>
+            <w:tcMar>
+              <w:top w:type="dxa" w:w="60"/>
+              <w:left w:type="dxa" w:w="90"/>
+              <w:bottom w:type="dxa" w:w="60"/>
+              <w:right w:type="dxa" w:w="90"/>
+            </w:tcMar>
+            <w:vAlign w:val="center"/>
+          </w:tcPr>
+          <w:p>
+            <w:pPr>
+              <w:spacing w:after="30" w:line="250"/>
+              <w:jc w:val="left"/>
+            </w:pPr>
+            <w:r>
+              <w:rPr>
+                <w:rFonts w:ascii="Cambria" w:cs="Cambria" w:eastAsia="Cambria" w:hAnsi="Cambria"/>
+                <w:color w:val="3A3A3A"/>
+                <w:sz w:val="18"/>
+                <w:szCs w:val="18"/>
+              </w:rPr>
+              <w:t xml:space="preserve">Protocoles SFTP (recommandé), FTPS, HTTPS ou Connect:Direct ; inscription de l’utilisateur sur Visa Online ; automatisation possible par script ou logiciel ; clé PGP de Visa ; adresse IP et clé SSH de la banque ; certificat numérique uniquement pour FTPS ou HTTPS ; test de connectivité</w:t>
+            </w:r>
+          </w:p>
+        </w:tc>
+      </w:tr>
+    </w:tbl>
+    <w:p>
+      <w:pPr>
+        <w:spacing w:after="100"/>
+      </w:pPr>
+    </w:p>
+    <w:p>
+      <w:pPr>
+        <w:pStyle w:val="ListParagraph"/>
+        <w:numPr>
+          <w:ilvl w:val="0"/>
+          <w:numId w:val="2"/>
+        </w:numPr>
+        <w:spacing w:after="70" w:line="290"/>
+        <w:jc w:val="left"/>
+      </w:pPr>
+      <w:r>
+        <w:rPr>
+          <w:rFonts w:ascii="Cambria" w:cs="Cambria" w:eastAsia="Cambria" w:hAnsi="Cambria"/>
+          <w:b/>
+          <w:bCs/>
+          <w:color w:val="3A3A3A"/>
+          <w:sz w:val="21"/>
+          <w:szCs w:val="21"/>
+        </w:rPr>
+        <w:t xml:space="preserve">Charge pour la DSI et la Direction Monétique</w:t>
+      </w:r>
+      <w:r>
+        <w:rPr>
+          <w:rFonts w:ascii="Cambria" w:cs="Cambria" w:eastAsia="Cambria" w:hAnsi="Cambria"/>
+          <w:color w:val="3A3A3A"/>
+          <w:sz w:val="21"/>
+          <w:szCs w:val="21"/>
+        </w:rPr>
+        <w:t xml:space="preserve"> : choix du mode de livraison, gestion des clés, automatisation des envois, qualité des fichiers (chaque fichier rejeté coûte 500 USD). Ces éléments doivent figurer dans l’étape « configuration et intégration technique » du planning (3 mois) avec la certification VCF.</w:t>
+      </w:r>
+    </w:p>
+    <w:p>
+      <w:pPr>
+        <w:pStyle w:val="ListParagraph"/>
+        <w:numPr>
+          <w:ilvl w:val="0"/>
+          <w:numId w:val="2"/>
+        </w:numPr>
+        <w:spacing w:after="70" w:line="290"/>
+        <w:jc w:val="left"/>
+      </w:pPr>
+      <w:r>
+        <w:rPr>
+          <w:rFonts w:ascii="Cambria" w:cs="Cambria" w:eastAsia="Cambria" w:hAnsi="Cambria"/>
+          <w:b/>
+          <w:bCs/>
+          <w:color w:val="3A3A3A"/>
+          <w:sz w:val="21"/>
+          <w:szCs w:val="21"/>
+        </w:rPr>
+        <w:t xml:space="preserve">Intégration comptable</w:t>
+      </w:r>
+      <w:r>
+        <w:rPr>
+          <w:rFonts w:ascii="Cambria" w:cs="Cambria" w:eastAsia="Cambria" w:hAnsi="Cambria"/>
+          <w:color w:val="3A3A3A"/>
+          <w:sz w:val="21"/>
+          <w:szCs w:val="21"/>
+        </w:rPr>
+        <w:t xml:space="preserve"> : l’idée produit annonce des exports vers Sage, Odoo et SAP. L’enquête n’a pas relevé les logiciels utilisés par les clients ; la question devra être ajoutée à la phase complémentaire.</w:t>
+      </w:r>
+    </w:p>
+    <w:p>
+      <w:pPr>
+        <w:pStyle w:val="ListParagraph"/>
+        <w:numPr>
+          <w:ilvl w:val="0"/>
+          <w:numId w:val="2"/>
+        </w:numPr>
+        <w:spacing w:after="70" w:line="290"/>
+        <w:jc w:val="left"/>
+      </w:pPr>
+      <w:r>
+        <w:rPr>
+          <w:rFonts w:ascii="Cambria" w:cs="Cambria" w:eastAsia="Cambria" w:hAnsi="Cambria"/>
+          <w:b/>
+          <w:bCs/>
+          <w:color w:val="3A3A3A"/>
+          <w:sz w:val="21"/>
+          <w:szCs w:val="21"/>
+        </w:rPr>
+        <w:t xml:space="preserve">Échantillon VCF 4.4</w:t>
+      </w:r>
+      <w:r>
+        <w:rPr>
+          <w:rFonts w:ascii="Cambria" w:cs="Cambria" w:eastAsia="Cambria" w:hAnsi="Cambria"/>
+          <w:color w:val="3A3A3A"/>
+          <w:sz w:val="21"/>
+          <w:szCs w:val="21"/>
+        </w:rPr>
+        <w:t xml:space="preserve"> : l’archive fournie est protégée par un mot de passe et n’a pas pu être analysée.</w:t>
+      </w:r>
+    </w:p>
+    <w:p>
+      <w:pPr>
+        <w:pStyle w:val="Heading1"/>
+        <w:keepNext/>
+        <w:shd w:fill="C00000" w:color="auto" w:val="clear"/>
+        <w:spacing w:after="200" w:before="360"/>
+        <w:ind w:left="0"/>
+      </w:pPr>
+      <w:r>
+        <w:rPr>
+          <w:rFonts w:ascii="Cambria" w:cs="Cambria" w:eastAsia="Cambria" w:hAnsi="Cambria"/>
+          <w:b/>
+          <w:bCs/>
+          <w:color w:val="FFFFFF"/>
+          <w:sz w:val="28"/>
+          <w:szCs w:val="28"/>
+        </w:rPr>
+        <w:t xml:space="preserve">9. Conclusion et recommandations</w:t>
+      </w:r>
+    </w:p>
+    <w:p>
+      <w:pPr>
+        <w:pStyle w:val="Heading2"/>
+        <w:keepNext/>
+        <w:pBdr>
+          <w:bottom w:val="single" w:color="C00000" w:sz="6" w:space="2"/>
+        </w:pBdr>
+        <w:spacing w:after="120" w:before="260"/>
+      </w:pPr>
+      <w:r>
+        <w:rPr>
+          <w:rFonts w:ascii="Cambria" w:cs="Cambria" w:eastAsia="Cambria" w:hAnsi="Cambria"/>
+          <w:b/>
+          <w:bCs/>
+          <w:color w:val="C00000"/>
+          <w:sz w:val="25"/>
+          <w:szCs w:val="25"/>
+        </w:rPr>
+        <w:t xml:space="preserve">9.1 Conclusion</w:t>
       </w:r>
     </w:p>
     <w:p>
@@ -11254,6 +14379,21 @@
     </w:p>
     <w:p>
       <w:pPr>
+        <w:spacing w:after="120" w:line="300"/>
+        <w:jc w:val="both"/>
+      </w:pPr>
+      <w:r>
+        <w:rPr>
+          <w:rFonts w:ascii="Cambria" w:cs="Cambria" w:eastAsia="Cambria" w:hAnsi="Cambria"/>
+          <w:color w:val="3A3A3A"/>
+          <w:sz w:val="21"/>
+          <w:szCs w:val="21"/>
+        </w:rPr>
+        <w:t xml:space="preserve">Les documents complémentaires confirment que l’offre Visa répond aux besoins prioritaires (PLUS et Expense Management), mais mettent en évidence deux choix de conception à arbitrer (absence de retrait d’espèces, minimum de 20 cartes) et un équilibre économique qui dépend d’un nombre minimal de contrats.</w:t>
+      </w:r>
+    </w:p>
+    <w:p>
+      <w:pPr>
         <w:pStyle w:val="Heading2"/>
         <w:keepNext/>
         <w:pBdr>
@@ -11270,7 +14410,7 @@
           <w:sz w:val="25"/>
           <w:szCs w:val="25"/>
         </w:rPr>
-        <w:t xml:space="preserve">8.2 Recommandations</w:t>
+        <w:t xml:space="preserve">9.2 Recommandations</w:t>
       </w:r>
     </w:p>
     <w:tbl>
@@ -11959,16 +15099,16 @@
                 <w:sz w:val="18"/>
                 <w:szCs w:val="18"/>
               </w:rPr>
-              <w:t xml:space="preserve">Digitaliser le circuit de validation et de remboursement</w:t>
-            </w:r>
-            <w:r>
-              <w:rPr>
-                <w:rFonts w:ascii="Cambria" w:cs="Cambria" w:eastAsia="Cambria" w:hAnsi="Cambria"/>
-                <w:color w:val="3A3A3A"/>
-                <w:sz w:val="18"/>
-                <w:szCs w:val="18"/>
-              </w:rPr>
-              <w:t xml:space="preserve"> avec justificatifs photographiés et notification en temps réel</w:t>
+              <w:t xml:space="preserve">Digitaliser le circuit de validation</w:t>
+            </w:r>
+            <w:r>
+              <w:rPr>
+                <w:rFonts w:ascii="Cambria" w:cs="Cambria" w:eastAsia="Cambria" w:hAnsi="Cambria"/>
+                <w:color w:val="3A3A3A"/>
+                <w:sz w:val="18"/>
+                <w:szCs w:val="18"/>
+              </w:rPr>
+              <w:t xml:space="preserve"> avec justificatifs photographiés et notification en temps réel (module Expense Management de Visa)</w:t>
             </w:r>
           </w:p>
         </w:tc>
@@ -12002,7 +15142,7 @@
                 <w:sz w:val="18"/>
                 <w:szCs w:val="18"/>
               </w:rPr>
-              <w:t xml:space="preserve">Lenteur des circuits citée par 3 entreprises</w:t>
+              <w:t xml:space="preserve">Lenteur des circuits et besoin de justificatifs</w:t>
             </w:r>
           </w:p>
         </w:tc>
@@ -12109,16 +15249,16 @@
                 <w:sz w:val="18"/>
                 <w:szCs w:val="18"/>
               </w:rPr>
-              <w:t xml:space="preserve">Proposer des cartes prépayées en flotte</w:t>
-            </w:r>
-            <w:r>
-              <w:rPr>
-                <w:rFonts w:ascii="Cambria" w:cs="Cambria" w:eastAsia="Cambria" w:hAnsi="Cambria"/>
-                <w:color w:val="3A3A3A"/>
-                <w:sz w:val="18"/>
-                <w:szCs w:val="18"/>
-              </w:rPr>
-              <w:t xml:space="preserve"> et des modes de dotation complémentaires (virement, mobile money) pour les zones où la carte est peu acceptée</w:t>
+              <w:t xml:space="preserve">Arbitrer deux choix de conception</w:t>
+            </w:r>
+            <w:r>
+              <w:rPr>
+                <w:rFonts w:ascii="Cambria" w:cs="Cambria" w:eastAsia="Cambria" w:hAnsi="Cambria"/>
+                <w:color w:val="3A3A3A"/>
+                <w:sz w:val="18"/>
+                <w:szCs w:val="18"/>
+              </w:rPr>
+              <w:t xml:space="preserve"> : prévoir des modes de dotation complémentaires (virement, mobile money, retrait encadré) pour les dépenses que la carte ne couvre pas, et étudier une entrée sous 20 cartes ou un pack prépayé allégé</w:t>
             </w:r>
           </w:p>
         </w:tc>
@@ -12151,7 +15291,7 @@
                 <w:sz w:val="18"/>
                 <w:szCs w:val="18"/>
               </w:rPr>
-              <w:t xml:space="preserve">Demande exprimée ; frein des zones rurales</w:t>
+              <w:t xml:space="preserve">67 % d’entreprises en espèces, zones rurales, profil de petites entreprises</w:t>
             </w:r>
           </w:p>
         </w:tc>
@@ -12184,7 +15324,7 @@
                 <w:sz w:val="18"/>
                 <w:szCs w:val="18"/>
               </w:rPr>
-              <w:t xml:space="preserve">Cahier des charges</w:t>
+              <w:t xml:space="preserve">Avant comité des produits</w:t>
             </w:r>
           </w:p>
         </w:tc>
@@ -12409,16 +15549,16 @@
                 <w:sz w:val="18"/>
                 <w:szCs w:val="18"/>
               </w:rPr>
-              <w:t xml:space="preserve">Lancer un pilote</w:t>
-            </w:r>
-            <w:r>
-              <w:rPr>
-                <w:rFonts w:ascii="Cambria" w:cs="Cambria" w:eastAsia="Cambria" w:hAnsi="Cambria"/>
-                <w:color w:val="3A3A3A"/>
-                <w:sz w:val="18"/>
-                <w:szCs w:val="18"/>
-              </w:rPr>
-              <w:t xml:space="preserve"> auprès de 5 à 8 entreprises favorables et ouvertes (Annexe A), avec accompagnement et indicateurs de suivi</w:t>
+              <w:t xml:space="preserve">Lancer le pilote prévu</w:t>
+            </w:r>
+            <w:r>
+              <w:rPr>
+                <w:rFonts w:ascii="Cambria" w:cs="Cambria" w:eastAsia="Cambria" w:hAnsi="Cambria"/>
+                <w:color w:val="3A3A3A"/>
+                <w:sz w:val="18"/>
+                <w:szCs w:val="18"/>
+              </w:rPr>
+              <w:t xml:space="preserve"> (3 à 5 entreprises) parmi les entreprises favorables et ouvertes (annexe A) équipables d’au moins 20 cartes, avec accompagnement et indicateurs de suivi</w:t>
             </w:r>
           </w:p>
         </w:tc>
@@ -12785,6 +15925,158 @@
                 <w:szCs w:val="18"/>
               </w:rPr>
               <w:t xml:space="preserve">Déploiement</w:t>
+            </w:r>
+          </w:p>
+        </w:tc>
+      </w:tr>
+      <w:tr>
+        <w:trPr>
+          <w:cantSplit/>
+        </w:trPr>
+        <w:tc>
+          <w:tcPr>
+            <w:tcW w:type="dxa" w:w="500"/>
+            <w:tcBorders>
+              <w:top w:val="single" w:color="BFBFBF" w:sz="4"/>
+              <w:left w:val="single" w:color="BFBFBF" w:sz="4"/>
+              <w:bottom w:val="single" w:color="BFBFBF" w:sz="4"/>
+              <w:right w:val="single" w:color="BFBFBF" w:sz="4"/>
+            </w:tcBorders>
+            <w:shd w:fill="F2F2F2" w:color="auto" w:val="clear"/>
+            <w:tcMar>
+              <w:top w:type="dxa" w:w="60"/>
+              <w:left w:type="dxa" w:w="90"/>
+              <w:bottom w:type="dxa" w:w="60"/>
+              <w:right w:type="dxa" w:w="90"/>
+            </w:tcMar>
+            <w:vAlign w:val="center"/>
+          </w:tcPr>
+          <w:p>
+            <w:pPr>
+              <w:spacing w:after="30" w:line="250"/>
+              <w:jc w:val="left"/>
+            </w:pPr>
+            <w:r>
+              <w:rPr>
+                <w:rFonts w:ascii="Cambria" w:cs="Cambria" w:eastAsia="Cambria" w:hAnsi="Cambria"/>
+                <w:color w:val="3A3A3A"/>
+                <w:sz w:val="18"/>
+                <w:szCs w:val="18"/>
+              </w:rPr>
+              <w:t xml:space="preserve">10</w:t>
+            </w:r>
+          </w:p>
+        </w:tc>
+        <w:tc>
+          <w:tcPr>
+            <w:tcW w:type="dxa" w:w="4300"/>
+            <w:tcBorders>
+              <w:top w:val="single" w:color="BFBFBF" w:sz="4"/>
+              <w:left w:val="single" w:color="BFBFBF" w:sz="4"/>
+              <w:bottom w:val="single" w:color="BFBFBF" w:sz="4"/>
+              <w:right w:val="single" w:color="BFBFBF" w:sz="4"/>
+            </w:tcBorders>
+            <w:shd w:fill="F2F2F2" w:color="auto" w:val="clear"/>
+            <w:tcMar>
+              <w:top w:type="dxa" w:w="60"/>
+              <w:left w:type="dxa" w:w="90"/>
+              <w:bottom w:type="dxa" w:w="60"/>
+              <w:right w:type="dxa" w:w="90"/>
+            </w:tcMar>
+            <w:vAlign w:val="center"/>
+          </w:tcPr>
+          <w:p>
+            <w:pPr>
+              <w:spacing w:after="30" w:line="250"/>
+              <w:jc w:val="left"/>
+            </w:pPr>
+            <w:r>
+              <w:rPr>
+                <w:rFonts w:ascii="Cambria" w:cs="Cambria" w:eastAsia="Cambria" w:hAnsi="Cambria"/>
+                <w:b/>
+                <w:bCs/>
+                <w:color w:val="3A3A3A"/>
+                <w:sz w:val="18"/>
+                <w:szCs w:val="18"/>
+              </w:rPr>
+              <w:t xml:space="preserve">Valider le niveau de service et l’équilibre économique avec Visa</w:t>
+            </w:r>
+            <w:r>
+              <w:rPr>
+                <w:rFonts w:ascii="Cambria" w:cs="Cambria" w:eastAsia="Cambria" w:hAnsi="Cambria"/>
+                <w:color w:val="3A3A3A"/>
+                <w:sz w:val="18"/>
+                <w:szCs w:val="18"/>
+              </w:rPr>
+              <w:t xml:space="preserve"> : package PLUS + Expense Management, tarifs actualisés, couverture du minimum mensuel (environ 8 contrats Starter), prérequis VCF</w:t>
+            </w:r>
+          </w:p>
+        </w:tc>
+        <w:tc>
+          <w:tcPr>
+            <w:tcW w:type="dxa" w:w="3238"/>
+            <w:tcBorders>
+              <w:top w:val="single" w:color="BFBFBF" w:sz="4"/>
+              <w:left w:val="single" w:color="BFBFBF" w:sz="4"/>
+              <w:bottom w:val="single" w:color="BFBFBF" w:sz="4"/>
+              <w:right w:val="single" w:color="BFBFBF" w:sz="4"/>
+            </w:tcBorders>
+            <w:shd w:fill="F2F2F2" w:color="auto" w:val="clear"/>
+            <w:tcMar>
+              <w:top w:type="dxa" w:w="60"/>
+              <w:left w:type="dxa" w:w="90"/>
+              <w:bottom w:type="dxa" w:w="60"/>
+              <w:right w:type="dxa" w:w="90"/>
+            </w:tcMar>
+            <w:vAlign w:val="center"/>
+          </w:tcPr>
+          <w:p>
+            <w:pPr>
+              <w:spacing w:after="30" w:line="250"/>
+              <w:jc w:val="left"/>
+            </w:pPr>
+            <w:r>
+              <w:rPr>
+                <w:rFonts w:ascii="Cambria" w:cs="Cambria" w:eastAsia="Cambria" w:hAnsi="Cambria"/>
+                <w:color w:val="3A3A3A"/>
+                <w:sz w:val="18"/>
+                <w:szCs w:val="18"/>
+              </w:rPr>
+              <w:t xml:space="preserve">Section 8 ; coûts fixes d’environ 39 000 USD</w:t>
+            </w:r>
+          </w:p>
+        </w:tc>
+        <w:tc>
+          <w:tcPr>
+            <w:tcW w:type="dxa" w:w="1600"/>
+            <w:tcBorders>
+              <w:top w:val="single" w:color="BFBFBF" w:sz="4"/>
+              <w:left w:val="single" w:color="BFBFBF" w:sz="4"/>
+              <w:bottom w:val="single" w:color="BFBFBF" w:sz="4"/>
+              <w:right w:val="single" w:color="BFBFBF" w:sz="4"/>
+            </w:tcBorders>
+            <w:shd w:fill="F2F2F2" w:color="auto" w:val="clear"/>
+            <w:tcMar>
+              <w:top w:type="dxa" w:w="60"/>
+              <w:left w:type="dxa" w:w="90"/>
+              <w:bottom w:type="dxa" w:w="60"/>
+              <w:right w:type="dxa" w:w="90"/>
+            </w:tcMar>
+            <w:vAlign w:val="center"/>
+          </w:tcPr>
+          <w:p>
+            <w:pPr>
+              <w:spacing w:after="30" w:line="250"/>
+              <w:jc w:val="left"/>
+            </w:pPr>
+            <w:r>
+              <w:rPr>
+                <w:rFonts w:ascii="Cambria" w:cs="Cambria" w:eastAsia="Cambria" w:hAnsi="Cambria"/>
+                <w:color w:val="3A3A3A"/>
+                <w:sz w:val="18"/>
+                <w:szCs w:val="18"/>
+              </w:rPr>
+              <w:t xml:space="preserve">Cadrage, avant contractualisation</w:t>
             </w:r>
           </w:p>
         </w:tc>
@@ -12813,7 +16105,7 @@
           <w:sz w:val="25"/>
           <w:szCs w:val="25"/>
         </w:rPr>
-        <w:t xml:space="preserve">8.3 Décisions attendues du Comité</w:t>
+        <w:t xml:space="preserve">9.3 Décisions attendues du Comité</w:t>
       </w:r>
     </w:p>
     <w:p>
@@ -12933,7 +16225,7 @@
           <w:sz w:val="21"/>
           <w:szCs w:val="21"/>
         </w:rPr>
-        <w:t xml:space="preserve"> prioritaires (recommandations 3 à 6).</w:t>
+        <w:t xml:space="preserve"> prioritaires (recommandations 3 à 6 et 10).</w:t>
       </w:r>
     </w:p>
     <w:p>

</xml_diff>

<commit_message>
Rapport FBC: version finale pour présentation au comité
Co-Authored-By: Claude Sonnet 5.5 <noreply@anthropic.com>
Claude-Session: https://claude.ai/code/session_01FbcMrHUb4kmJopxkhiarAy
</commit_message>
<xml_diff>
--- a/rapport_fbc/Rapport_Enquete_First_Business_Clarity.docx
+++ b/rapport_fbc/Rapport_Enquete_First_Business_Clarity.docx
@@ -1422,7 +1422,7 @@
           <w:sz w:val="22"/>
           <w:szCs w:val="22"/>
         </w:rPr>
-        <w:t xml:space="preserve">Ce que l’enquête ne permet pas encore de conclure</w:t>
+        <w:t xml:space="preserve">Portée des résultats</w:t>
       </w:r>
     </w:p>
     <w:p>
@@ -1500,7 +1500,7 @@
           <w:sz w:val="22"/>
           <w:szCs w:val="22"/>
         </w:rPr>
-        <w:t xml:space="preserve">Ce que les documents complémentaires (idée produit, tarifs Visa) ajoutent</w:t>
+        <w:t xml:space="preserve">Enseignements pour la conception de l’offre</w:t>
       </w:r>
     </w:p>
     <w:p>
@@ -1813,7 +1813,7 @@
           <w:sz w:val="21"/>
           <w:szCs w:val="21"/>
         </w:rPr>
-        <w:t xml:space="preserve">La fiche idée produit de juin 2026 (dénommée « FirstSpend » dans ce document de travail, et « First Business Clarity » dans le protocole d’enquête) précise le dispositif. Il s’agit d’une </w:t>
+        <w:t xml:space="preserve">La fiche idée produit de juin 2026 (« FirstSpend », nom de travail de l’offre commercialisée sous la dénomination First Business Clarity) précise le dispositif. Il s’agit d’une </w:t>
       </w:r>
       <w:r>
         <w:rPr>
@@ -2534,7 +2534,7 @@
           <w:sz w:val="25"/>
           <w:szCs w:val="25"/>
         </w:rPr>
-        <w:t xml:space="preserve">3.2 Dispositif effectivement réalisé</w:t>
+        <w:t xml:space="preserve">3.2 Réalisation de l’enquête</w:t>
       </w:r>
     </w:p>
     <w:tbl>
@@ -2814,7 +2814,7 @@
                 <w:sz w:val="18"/>
                 <w:szCs w:val="18"/>
               </w:rPr>
-              <w:t xml:space="preserve">Versions du formulaire</w:t>
+              <w:t xml:space="preserve">Questionnaire</w:t>
             </w:r>
           </w:p>
         </w:tc>
@@ -2886,7 +2886,7 @@
                 <w:sz w:val="18"/>
                 <w:szCs w:val="18"/>
               </w:rPr>
-              <w:t xml:space="preserve">Deux versions : lot 1 (5 réponses) et lot 2 (22 réponses)</w:t>
+              <w:t xml:space="preserve">Questionnaire en deux versions : A (5 réponses) et B (22 réponses)</w:t>
             </w:r>
           </w:p>
         </w:tc>
@@ -3109,7 +3109,7 @@
                 <w:sz w:val="18"/>
                 <w:szCs w:val="18"/>
               </w:rPr>
-              <w:t xml:space="preserve">Formulaires en ligne renseignés en mode anonyme ; plusieurs réponses sont rédigées à la troisième personne, signe d’une saisie par l’enquêteur</w:t>
+              <w:t xml:space="preserve">Entretiens renseignés dans un formulaire en ligne, réponses anonymes</w:t>
             </w:r>
           </w:p>
         </w:tc>
@@ -3219,7 +3219,7 @@
                 <w:sz w:val="18"/>
                 <w:szCs w:val="18"/>
               </w:rPr>
-              <w:t xml:space="preserve">Non relevée dans les formulaires</w:t>
+              <w:t xml:space="preserve">Non renseignée : segments GE et ME à qualifier par rapprochement avec le portefeuille</w:t>
             </w:r>
           </w:p>
         </w:tc>
@@ -3263,7 +3263,7 @@
           <w:sz w:val="21"/>
           <w:szCs w:val="21"/>
         </w:rPr>
-        <w:t xml:space="preserve">Deux versions du formulaire ont été utilisées, avec un tronc commun (identification, mécanismes de gestion par catégorie de dépenses, adoption des cartes professionnelles, difficultés rencontrées) :</w:t>
+        <w:t xml:space="preserve">Le questionnaire a été administré en deux versions, avec un tronc commun (identification, mécanismes de gestion par catégorie de dépenses, adoption des cartes professionnelles, difficultés rencontrées) :</w:t>
       </w:r>
     </w:p>
     <w:p>
@@ -3285,7 +3285,7 @@
           <w:sz w:val="21"/>
           <w:szCs w:val="21"/>
         </w:rPr>
-        <w:t xml:space="preserve">Lot 2 (22 réponses)</w:t>
+        <w:t xml:space="preserve">Version B (22 réponses)</w:t>
       </w:r>
       <w:r>
         <w:rPr>
@@ -3336,7 +3336,7 @@
           <w:sz w:val="21"/>
           <w:szCs w:val="21"/>
         </w:rPr>
-        <w:t xml:space="preserve">Lot 1 (5 réponses)</w:t>
+        <w:t xml:space="preserve">Version A (5 réponses)</w:t>
       </w:r>
       <w:r>
         <w:rPr>
@@ -3345,7 +3345,7 @@
           <w:sz w:val="21"/>
           <w:szCs w:val="21"/>
         </w:rPr>
-        <w:t xml:space="preserve"> : ajoute la raison principale de l’adoption ou de la non-adoption de cartes professionnelles, sans question sur la disposition à investir.</w:t>
+        <w:t xml:space="preserve"> : ajoute la raison principale de l’adoption ou de la non-adoption de cartes professionnelles.</w:t>
       </w:r>
     </w:p>
     <w:p>
@@ -3766,77 +3766,6 @@
           </w:p>
         </w:tc>
       </w:tr>
-      <w:tr>
-        <w:trPr>
-          <w:cantSplit/>
-        </w:trPr>
-        <w:tc>
-          <w:tcPr>
-            <w:tcW w:type="dxa" w:w="4300"/>
-            <w:tcBorders>
-              <w:top w:val="single" w:color="BFBFBF" w:sz="4"/>
-              <w:left w:val="single" w:color="BFBFBF" w:sz="4"/>
-              <w:bottom w:val="single" w:color="BFBFBF" w:sz="4"/>
-              <w:right w:val="single" w:color="BFBFBF" w:sz="4"/>
-            </w:tcBorders>
-            <w:tcMar>
-              <w:top w:type="dxa" w:w="60"/>
-              <w:left w:type="dxa" w:w="90"/>
-              <w:bottom w:type="dxa" w:w="60"/>
-              <w:right w:type="dxa" w:w="90"/>
-            </w:tcMar>
-            <w:vAlign w:val="center"/>
-          </w:tcPr>
-          <w:p>
-            <w:pPr>
-              <w:spacing w:after="30" w:line="250"/>
-              <w:jc w:val="left"/>
-            </w:pPr>
-            <w:r>
-              <w:rPr>
-                <w:rFonts w:ascii="Cambria" w:cs="Cambria" w:eastAsia="Cambria" w:hAnsi="Cambria"/>
-                <w:color w:val="3A3A3A"/>
-                <w:sz w:val="18"/>
-                <w:szCs w:val="18"/>
-              </w:rPr>
-              <w:t xml:space="preserve">Échantillon de fichiers VCF 4.4 (archive ZIP)</w:t>
-            </w:r>
-          </w:p>
-        </w:tc>
-        <w:tc>
-          <w:tcPr>
-            <w:tcW w:type="dxa" w:w="5338"/>
-            <w:tcBorders>
-              <w:top w:val="single" w:color="BFBFBF" w:sz="4"/>
-              <w:left w:val="single" w:color="BFBFBF" w:sz="4"/>
-              <w:bottom w:val="single" w:color="BFBFBF" w:sz="4"/>
-              <w:right w:val="single" w:color="BFBFBF" w:sz="4"/>
-            </w:tcBorders>
-            <w:tcMar>
-              <w:top w:type="dxa" w:w="60"/>
-              <w:left w:type="dxa" w:w="90"/>
-              <w:bottom w:type="dxa" w:w="60"/>
-              <w:right w:type="dxa" w:w="90"/>
-            </w:tcMar>
-            <w:vAlign w:val="center"/>
-          </w:tcPr>
-          <w:p>
-            <w:pPr>
-              <w:spacing w:after="30" w:line="250"/>
-              <w:jc w:val="left"/>
-            </w:pPr>
-            <w:r>
-              <w:rPr>
-                <w:rFonts w:ascii="Cambria" w:cs="Cambria" w:eastAsia="Cambria" w:hAnsi="Cambria"/>
-                <w:color w:val="3A3A3A"/>
-                <w:sz w:val="18"/>
-                <w:szCs w:val="18"/>
-              </w:rPr>
-              <w:t xml:space="preserve">Archive protégée par mot de passe : non analysée</w:t>
-            </w:r>
-          </w:p>
-        </w:tc>
-      </w:tr>
     </w:tbl>
     <w:p>
       <w:pPr>
@@ -3861,7 +3790,7 @@
           <w:sz w:val="25"/>
           <w:szCs w:val="25"/>
         </w:rPr>
-        <w:t xml:space="preserve">3.5 Traitement et limites de l’analyse</w:t>
+        <w:t xml:space="preserve">3.5 Traitement des données et précautions de lecture</w:t>
       </w:r>
     </w:p>
     <w:p>
@@ -3876,7 +3805,7 @@
           <w:sz w:val="21"/>
           <w:szCs w:val="21"/>
         </w:rPr>
-        <w:t xml:space="preserve">Conformément au protocole, les réponses ont été codées par thème (voir annexe A) puis analysées de façon descriptive. Compte tenu de la taille de l’échantillon, les pourcentages sont fournis à titre indicatif et leur marge d’incertitude est large : par exemple, 12 favorables sur 22 correspondent à une fourchette de 35 % à 73 % (intervalle de confiance à 95 %). Aucun test de significativité n’est présenté, car il n’aurait pas de portée à ce niveau d’effectif.</w:t>
+        <w:t xml:space="preserve">Conformément au protocole, les réponses ont été classées par thème (voir annexes A et B) puis analysées de façon descriptive. Compte tenu de la taille de l’échantillon, les pourcentages sont fournis à titre indicatif et leur marge d’incertitude est large : par exemple, 12 favorables sur 22 correspondent à une fourchette de 35 % à 73 % (intervalle de confiance à 95 %). Aucun test de significativité n’est présenté, l’effectif ne le justifiant pas.</w:t>
       </w:r>
     </w:p>
     <w:tbl>
@@ -3932,7 +3861,7 @@
                 <w:sz w:val="18"/>
                 <w:szCs w:val="18"/>
               </w:rPr>
-              <w:t xml:space="preserve">Limite</w:t>
+              <w:t xml:space="preserve">Point de vigilance méthodologique</w:t>
             </w:r>
           </w:p>
         </w:tc>
@@ -3968,7 +3897,7 @@
                 <w:sz w:val="18"/>
                 <w:szCs w:val="18"/>
               </w:rPr>
-              <w:t xml:space="preserve">Conséquence pour la lecture</w:t>
+              <w:t xml:space="preserve">Incidence sur la lecture</w:t>
             </w:r>
           </w:p>
         </w:tc>
@@ -4078,7 +4007,7 @@
                 <w:sz w:val="18"/>
                 <w:szCs w:val="18"/>
               </w:rPr>
-              <w:t xml:space="preserve">Taille des entreprises non relevée ; majorité d’entreprises locales (20/27) et de PME apparentes. Seules 7 réponses proviennent de filiales de groupes</w:t>
+              <w:t xml:space="preserve">Majorité d’entreprises locales (20/27) ; 7 réponses seulement émanent de filiales de groupes ; taille non renseignée</w:t>
             </w:r>
           </w:p>
         </w:tc>
@@ -4112,7 +4041,7 @@
                 <w:sz w:val="18"/>
                 <w:szCs w:val="18"/>
               </w:rPr>
-              <w:t xml:space="preserve">La cible GE/ME n’est pas représentée de façon démontrable</w:t>
+              <w:t xml:space="preserve">Les segments GE et ME ne peuvent pas être isolés : lecture à confirmer auprès du cœur de cible</w:t>
             </w:r>
           </w:p>
         </w:tc>
@@ -4222,7 +4151,7 @@
                 <w:sz w:val="18"/>
                 <w:szCs w:val="18"/>
               </w:rPr>
-              <w:t xml:space="preserve">Questions du guide d’entretien sur les bénéfices attendus, la valeur d’une plateforme connectée à la comptabilité et les critères de décision absentes des fichiers</w:t>
+              <w:t xml:space="preserve">Recueil centré sur les pratiques, les difficultés et la disposition à investir</w:t>
             </w:r>
           </w:p>
         </w:tc>
@@ -4256,7 +4185,7 @@
                 <w:sz w:val="18"/>
                 <w:szCs w:val="18"/>
               </w:rPr>
-              <w:t xml:space="preserve">Utilité par fonctionnalité et critères d’adoption non mesurables directement</w:t>
+              <w:t xml:space="preserve">Utilité par fonctionnalité et critères de décision à approfondir en phase complémentaire</w:t>
             </w:r>
           </w:p>
         </w:tc>
@@ -4294,7 +4223,7 @@
                 <w:sz w:val="18"/>
                 <w:szCs w:val="18"/>
               </w:rPr>
-              <w:t xml:space="preserve">Deux versions du formulaire : la disposition à investir n’a été posée qu’à 22 répondants sur 27</w:t>
+              <w:t xml:space="preserve">Disposition à investir renseignée par 22 répondants sur 27 (version B)</w:t>
             </w:r>
           </w:p>
         </w:tc>
@@ -4327,7 +4256,7 @@
                 <w:sz w:val="18"/>
                 <w:szCs w:val="18"/>
               </w:rPr>
-              <w:t xml:space="preserve">Intentions mesurées sur 22 réponses uniquement</w:t>
+              <w:t xml:space="preserve">Intentions mesurées sur 22 réponses</w:t>
             </w:r>
           </w:p>
         </w:tc>
@@ -4510,7 +4439,7 @@
                 <w:sz w:val="18"/>
                 <w:szCs w:val="18"/>
               </w:rPr>
-              <w:t xml:space="preserve">Tarifs Visa de 2023, document confidentiel Visa ; échantillon VCF non lisible</w:t>
+              <w:t xml:space="preserve">Grille tarifaire Visa datée de 2023</w:t>
             </w:r>
           </w:p>
         </w:tc>
@@ -4544,7 +4473,7 @@
                 <w:sz w:val="18"/>
                 <w:szCs w:val="18"/>
               </w:rPr>
-              <w:t xml:space="preserve">Coûts à réactualiser avec Visa ; analyse technique du format VCF non réalisée</w:t>
+              <w:t xml:space="preserve">Coûts à confirmer avec Visa lors du cadrage</w:t>
             </w:r>
           </w:p>
         </w:tc>
@@ -6054,7 +5983,7 @@
                 <w:sz w:val="21"/>
                 <w:szCs w:val="21"/>
               </w:rPr>
-              <w:t xml:space="preserve">Point d’attention</w:t>
+              <w:t xml:space="preserve">Composition de l’échantillon</w:t>
             </w:r>
           </w:p>
           <w:p>
@@ -6457,7 +6386,7 @@
           <w:sz w:val="21"/>
           <w:szCs w:val="21"/>
         </w:rPr>
-        <w:t xml:space="preserve">Les difficultés citées se regroupent en quatre thèmes, auxquels s’ajoutent les entreprises qui n’en citent aucune (réponses ouvertes codées, 27 répondants) :</w:t>
+        <w:t xml:space="preserve">Les difficultés citées se regroupent en quatre thèmes, auxquels s’ajoutent les entreprises qui n’en citent aucune (réponses ouvertes, 27 répondants) :</w:t>
       </w:r>
     </w:p>
     <w:tbl>
@@ -7352,7 +7281,7 @@
           <w:sz w:val="21"/>
           <w:szCs w:val="21"/>
         </w:rPr>
-        <w:t xml:space="preserve"> déclarent avoir adopté des cartes bancaires professionnelles : Vision Confort et Express Union (lot 2), Draaijer Turbo Service et New Design Builtshine (lot 1). Trois autres répondants (EGIS Cameroun, Carino, Digital Art 237) mentionnent pourtant des cartes Visa ou bancaires dans leurs mécanismes tout en répondant « non » à la question : ce sont des cartes d’usage ponctuel ou personnel, qui ne relèvent pas d’un programme de cartes d’entreprise.</w:t>
+        <w:t xml:space="preserve"> déclarent avoir adopté des cartes bancaires professionnelles : Vision Confort et Express Union (version B), Draaijer Turbo Service et New Design Builtshine (version A). Trois autres répondants (EGIS Cameroun, Carino, Digital Art 237) mentionnent pourtant des cartes Visa ou bancaires dans leurs mécanismes tout en répondant « non » à la question : ce sont des cartes d’usage ponctuel ou personnel, qui ne relèvent pas d’un programme de cartes d’entreprise.</w:t>
       </w:r>
     </w:p>
     <w:p>
@@ -7511,7 +7440,7 @@
           <w:sz w:val="21"/>
           <w:szCs w:val="21"/>
         </w:rPr>
-        <w:t xml:space="preserve">La question de la disposition à investir dans une solution assurant la gestion, la restriction, la collecte des justificatifs et la maîtrise globale de ces dépenses figurait dans le lot 2 : elle porte sur </w:t>
+        <w:t xml:space="preserve">La question de la disposition à investir dans une solution assurant la gestion, la restriction, la collecte des justificatifs et la maîtrise globale de ces dépenses figurait dans la version B du questionnaire : elle porte sur </w:t>
       </w:r>
       <w:r>
         <w:rPr>
@@ -7595,7 +7524,7 @@
           <w:sz w:val="17"/>
           <w:szCs w:val="17"/>
         </w:rPr>
-        <w:t xml:space="preserve">Graphique 3 – Disposition à investir (réponses ouvertes codées, n = 22)</w:t>
+        <w:t xml:space="preserve">Graphique 3 – Disposition à investir (n = 22)</w:t>
       </w:r>
     </w:p>
     <w:p>
@@ -8619,7 +8548,7 @@
                 <w:sz w:val="18"/>
                 <w:szCs w:val="18"/>
               </w:rPr>
-              <w:t xml:space="preserve">n (lot 2)</w:t>
+              <w:t xml:space="preserve">n (version B)</w:t>
             </w:r>
           </w:p>
         </w:tc>
@@ -10996,7 +10925,7 @@
                 <w:sz w:val="18"/>
                 <w:szCs w:val="18"/>
               </w:rPr>
-              <w:t xml:space="preserve">Échantillon composé de petites entreprises locales (20/27) ; nombre de collaborateurs à équiper non relevé</w:t>
+              <w:t xml:space="preserve">Échantillon composé de petites entreprises locales (20/27) ; nombre de porteurs potentiels à documenter</w:t>
             </w:r>
           </w:p>
         </w:tc>
@@ -11614,7 +11543,7 @@
                 <w:sz w:val="18"/>
                 <w:szCs w:val="18"/>
               </w:rPr>
-              <w:t xml:space="preserve">Taille des équipes à équiper non relevée ; échantillon majoritairement composé de petites entreprises locales</w:t>
+              <w:t xml:space="preserve">Taille des équipes à équiper à documenter ; échantillon majoritairement composé de petites entreprises locales</w:t>
             </w:r>
           </w:p>
         </w:tc>
@@ -11650,7 +11579,7 @@
                 <w:sz w:val="18"/>
                 <w:szCs w:val="18"/>
               </w:rPr>
-              <w:t xml:space="preserve">À vérifier</w:t>
+              <w:t xml:space="preserve">À consolider</w:t>
             </w:r>
           </w:p>
         </w:tc>
@@ -12060,7 +11989,7 @@
                 <w:sz w:val="18"/>
                 <w:szCs w:val="18"/>
               </w:rPr>
-              <w:t xml:space="preserve">Un logiciel de comptabilité déjà en place chez certains ; ERP utilisés par les clients non relevés</w:t>
+              <w:t xml:space="preserve">Un logiciel de comptabilité déjà en place chez certains ; ERP utilisés par les clients à documenter</w:t>
             </w:r>
           </w:p>
         </w:tc>
@@ -12096,7 +12025,7 @@
                 <w:sz w:val="18"/>
                 <w:szCs w:val="18"/>
               </w:rPr>
-              <w:t xml:space="preserve">À vérifier</w:t>
+              <w:t xml:space="preserve">À consolider</w:t>
             </w:r>
           </w:p>
         </w:tc>
@@ -12171,7 +12100,7 @@
                 <w:sz w:val="18"/>
                 <w:szCs w:val="18"/>
               </w:rPr>
-              <w:t xml:space="preserve">Besoin non exploré par l’enquête ; paiements fournisseurs réglés surtout par virement</w:t>
+              <w:t xml:space="preserve">Besoin à explorer en phase complémentaire ; paiements fournisseurs réglés surtout par virement</w:t>
             </w:r>
           </w:p>
         </w:tc>
@@ -12206,7 +12135,7 @@
                 <w:sz w:val="18"/>
                 <w:szCs w:val="18"/>
               </w:rPr>
-              <w:t xml:space="preserve">Non évalué</w:t>
+              <w:t xml:space="preserve">À explorer</w:t>
             </w:r>
           </w:p>
         </w:tc>
@@ -12394,7 +12323,7 @@
                 <w:sz w:val="18"/>
                 <w:szCs w:val="18"/>
               </w:rPr>
-              <w:t xml:space="preserve">Cible GE/ME non représentée dans l’échantillon ; filiales de groupes moins demandeuses (2/5) ; réseau d’externalisation non interrogé</w:t>
+              <w:t xml:space="preserve">Cible GE/ME à approfondir ; filiales de groupes moins demandeuses (2/5) ; réseau d’externalisation à interroger</w:t>
             </w:r>
           </w:p>
         </w:tc>
@@ -12429,7 +12358,7 @@
                 <w:sz w:val="18"/>
                 <w:szCs w:val="18"/>
               </w:rPr>
-              <w:t xml:space="preserve">À vérifier</w:t>
+              <w:t xml:space="preserve">À consolider</w:t>
             </w:r>
           </w:p>
         </w:tc>
@@ -12690,7 +12619,7 @@
           <w:sz w:val="21"/>
           <w:szCs w:val="21"/>
         </w:rPr>
-        <w:t xml:space="preserve">Les documents Visa transmis complètent l’enquête sur deux points : ce que coûte à la banque l’accès à la solution, et ce que la banque doit mettre en place pour l’exploiter. Ils ne relèvent pas de l’enquête auprès des entreprises ; ils servent à vérifier que les besoins exprimés trouvent une réponse dans l’offre Visa et que son équilibre économique est réaliste. </w:t>
+        <w:t xml:space="preserve">Cette section confronte les besoins exprimés par les entreprises aux conditions d’accès à la solution Visa : coût pour la banque, périmètre fonctionnel nécessaire et prérequis techniques. </w:t>
       </w:r>
       <w:r>
         <w:rPr>
@@ -12701,7 +12630,7 @@
           <w:sz w:val="21"/>
           <w:szCs w:val="21"/>
         </w:rPr>
-        <w:t xml:space="preserve">Données confidentielles Visa : diffusion restreinte.</w:t>
+        <w:t xml:space="preserve">Elle contient des informations tarifaires confidentielles Visa : diffusion restreinte.</w:t>
       </w:r>
     </w:p>
     <w:p>
@@ -13813,7 +13742,7 @@
           <w:sz w:val="21"/>
           <w:szCs w:val="21"/>
         </w:rPr>
-        <w:t xml:space="preserve"> Les frais proportionnels ne dépassent ce minimum qu’à partir d’environ 3,3 M USD de dépenses par mois avec le package PLUS (2,5 M USD avec le module Expense Management). Pendant la montée en charge, ce minimum doit être couvert par les abonnements. À titre indicatif, avec un taux de 600 FCFA pour 1 USD (hypothèse à actualiser), il équivaut à environ 14 M FCFA par an, soit près de </w:t>
+        <w:t xml:space="preserve"> Les frais proportionnels ne dépassent ce minimum qu’à partir d’environ 3,3 M USD de dépenses par mois avec le package PLUS (2,5 M USD avec le module Expense Management). Pendant la montée en charge, ce minimum doit être couvert par les abonnements. À titre indicatif, avec un taux de 600 FCFA pour 1 USD (taux indicatif), il équivaut à environ 14 M FCFA par an, soit près de </w:t>
       </w:r>
       <w:r>
         <w:rPr>
@@ -13879,7 +13808,7 @@
           <w:sz w:val="21"/>
           <w:szCs w:val="21"/>
         </w:rPr>
-        <w:t xml:space="preserve">Ces tarifs datent de 2023 et doivent être confirmés par Visa avant toute décision.</w:t>
+        <w:t xml:space="preserve">Ces tarifs datent de 2023 et seront confirmés par Visa lors du cadrage.</w:t>
       </w:r>
     </w:p>
     <w:p>
@@ -13915,7 +13844,7 @@
           <w:sz w:val="21"/>
           <w:szCs w:val="21"/>
         </w:rPr>
-        <w:t xml:space="preserve">Pour alimenter la plateforme, la banque (émetteur) doit transmettre à Visa des fichiers de données de transactions au format VCF (Visa Commercial Format, version 4.4 pour l’échantillon fourni). Deux modes de livraison sont possibles :</w:t>
+        <w:t xml:space="preserve">Pour alimenter la plateforme, la banque (émetteur) doit transmettre à Visa des fichiers de données de transactions au format VCF (Visa Commercial Format, version 4.4). Deux modes de livraison sont possibles :</w:t>
       </w:r>
     </w:p>
     <w:tbl>
@@ -14221,38 +14150,7 @@
           <w:sz w:val="21"/>
           <w:szCs w:val="21"/>
         </w:rPr>
-        <w:t xml:space="preserve"> : l’idée produit annonce des exports vers Sage, Odoo et SAP. L’enquête n’a pas relevé les logiciels utilisés par les clients ; la question devra être ajoutée à la phase complémentaire.</w:t>
-      </w:r>
-    </w:p>
-    <w:p>
-      <w:pPr>
-        <w:pStyle w:val="ListParagraph"/>
-        <w:numPr>
-          <w:ilvl w:val="0"/>
-          <w:numId w:val="2"/>
-        </w:numPr>
-        <w:spacing w:after="70" w:line="290"/>
-        <w:jc w:val="left"/>
-      </w:pPr>
-      <w:r>
-        <w:rPr>
-          <w:rFonts w:ascii="Cambria" w:cs="Cambria" w:eastAsia="Cambria" w:hAnsi="Cambria"/>
-          <w:b/>
-          <w:bCs/>
-          <w:color w:val="3A3A3A"/>
-          <w:sz w:val="21"/>
-          <w:szCs w:val="21"/>
-        </w:rPr>
-        <w:t xml:space="preserve">Échantillon VCF 4.4</w:t>
-      </w:r>
-      <w:r>
-        <w:rPr>
-          <w:rFonts w:ascii="Cambria" w:cs="Cambria" w:eastAsia="Cambria" w:hAnsi="Cambria"/>
-          <w:color w:val="3A3A3A"/>
-          <w:sz w:val="21"/>
-          <w:szCs w:val="21"/>
-        </w:rPr>
-        <w:t xml:space="preserve"> : l’archive fournie est protégée par un mot de passe et n’a pas pu être analysée.</w:t>
+        <w:t xml:space="preserve"> : l’idée produit annonce des exports vers Sage, Odoo et SAP. Les logiciels utilisés par les clients seront recensés lors de la phase complémentaire.</w:t>
       </w:r>
     </w:p>
     <w:p>
@@ -14389,7 +14287,7 @@
           <w:sz w:val="21"/>
           <w:szCs w:val="21"/>
         </w:rPr>
-        <w:t xml:space="preserve">Les documents complémentaires confirment que l’offre Visa répond aux besoins prioritaires (PLUS et Expense Management), mais mettent en évidence deux choix de conception à arbitrer (absence de retrait d’espèces, minimum de 20 cartes) et un équilibre économique qui dépend d’un nombre minimal de contrats.</w:t>
+        <w:t xml:space="preserve">La confrontation à la fiche idée produit et aux conditions Visa confirme que l’offre répond aux besoins prioritaires (PLUS et Expense Management), mais mettent en évidence deux choix de conception à arbitrer (absence de retrait d’espèces, minimum de 20 cartes) et un équilibre économique qui dépend d’un nombre minimal de contrats.</w:t>
       </w:r>
     </w:p>
     <w:p>
@@ -16290,7 +16188,7 @@
           <w:sz w:val="28"/>
           <w:szCs w:val="28"/>
         </w:rPr>
-        <w:t xml:space="preserve">Annexe A : Réponses codées par répondant</w:t>
+        <w:t xml:space="preserve">Annexe A : Détail des réponses par entreprise</w:t>
       </w:r>
     </w:p>
     <w:p>
@@ -16316,7 +16214,7 @@
           <w:sz w:val="19"/>
           <w:szCs w:val="19"/>
         </w:rPr>
-        <w:t xml:space="preserve">Lot</w:t>
+        <w:t xml:space="preserve">Vers.</w:t>
       </w:r>
       <w:r>
         <w:rPr>
@@ -16325,7 +16223,7 @@
           <w:sz w:val="19"/>
           <w:szCs w:val="19"/>
         </w:rPr>
-        <w:t xml:space="preserve"> = version du formulaire (1 : 5 réponses ; 2 : 22 réponses) ; </w:t>
+        <w:t xml:space="preserve"> = version du questionnaire (A : 5 réponses ; B : 22 réponses) ; </w:t>
       </w:r>
       <w:r>
         <w:rPr>
@@ -16385,7 +16283,7 @@
           <w:sz w:val="19"/>
           <w:szCs w:val="19"/>
         </w:rPr>
-        <w:t xml:space="preserve"> = intention : F = favorable, F* = favorable sous conditions, O = ouvert ou à reporter, D = défavorable (question posée dans le lot 2 uniquement). St. : L = entreprise locale, G = filiale de groupe.</w:t>
+        <w:t xml:space="preserve"> = intention : F = favorable, F* = favorable sous conditions, O = ouvert ou à reporter, D = défavorable (question posée dans la version B). St. : L = entreprise locale, G = filiale de groupe.</w:t>
       </w:r>
     </w:p>
     <w:tbl>
@@ -16447,7 +16345,7 @@
                 <w:sz w:val="18"/>
                 <w:szCs w:val="18"/>
               </w:rPr>
-              <w:t xml:space="preserve">Lot</w:t>
+              <w:t xml:space="preserve">Vers.</w:t>
             </w:r>
           </w:p>
         </w:tc>
@@ -16737,7 +16635,7 @@
                 <w:sz w:val="18"/>
                 <w:szCs w:val="18"/>
               </w:rPr>
-              <w:t xml:space="preserve">2</w:t>
+              <w:t xml:space="preserve">B</w:t>
             </w:r>
           </w:p>
         </w:tc>
@@ -17007,7 +16905,7 @@
                 <w:sz w:val="18"/>
                 <w:szCs w:val="18"/>
               </w:rPr>
-              <w:t xml:space="preserve">2</w:t>
+              <w:t xml:space="preserve">B</w:t>
             </w:r>
           </w:p>
         </w:tc>
@@ -17283,7 +17181,7 @@
                 <w:sz w:val="18"/>
                 <w:szCs w:val="18"/>
               </w:rPr>
-              <w:t xml:space="preserve">2</w:t>
+              <w:t xml:space="preserve">B</w:t>
             </w:r>
           </w:p>
         </w:tc>
@@ -17553,7 +17451,7 @@
                 <w:sz w:val="18"/>
                 <w:szCs w:val="18"/>
               </w:rPr>
-              <w:t xml:space="preserve">2</w:t>
+              <w:t xml:space="preserve">B</w:t>
             </w:r>
           </w:p>
         </w:tc>
@@ -17829,7 +17727,7 @@
                 <w:sz w:val="18"/>
                 <w:szCs w:val="18"/>
               </w:rPr>
-              <w:t xml:space="preserve">2</w:t>
+              <w:t xml:space="preserve">B</w:t>
             </w:r>
           </w:p>
         </w:tc>
@@ -18099,7 +17997,7 @@
                 <w:sz w:val="18"/>
                 <w:szCs w:val="18"/>
               </w:rPr>
-              <w:t xml:space="preserve">2</w:t>
+              <w:t xml:space="preserve">B</w:t>
             </w:r>
           </w:p>
         </w:tc>
@@ -18375,7 +18273,7 @@
                 <w:sz w:val="18"/>
                 <w:szCs w:val="18"/>
               </w:rPr>
-              <w:t xml:space="preserve">2</w:t>
+              <w:t xml:space="preserve">B</w:t>
             </w:r>
           </w:p>
         </w:tc>
@@ -18645,7 +18543,7 @@
                 <w:sz w:val="18"/>
                 <w:szCs w:val="18"/>
               </w:rPr>
-              <w:t xml:space="preserve">2</w:t>
+              <w:t xml:space="preserve">B</w:t>
             </w:r>
           </w:p>
         </w:tc>
@@ -18921,7 +18819,7 @@
                 <w:sz w:val="18"/>
                 <w:szCs w:val="18"/>
               </w:rPr>
-              <w:t xml:space="preserve">2</w:t>
+              <w:t xml:space="preserve">B</w:t>
             </w:r>
           </w:p>
         </w:tc>
@@ -19191,7 +19089,7 @@
                 <w:sz w:val="18"/>
                 <w:szCs w:val="18"/>
               </w:rPr>
-              <w:t xml:space="preserve">2</w:t>
+              <w:t xml:space="preserve">B</w:t>
             </w:r>
           </w:p>
         </w:tc>
@@ -19467,7 +19365,7 @@
                 <w:sz w:val="18"/>
                 <w:szCs w:val="18"/>
               </w:rPr>
-              <w:t xml:space="preserve">2</w:t>
+              <w:t xml:space="preserve">B</w:t>
             </w:r>
           </w:p>
         </w:tc>
@@ -19737,7 +19635,7 @@
                 <w:sz w:val="18"/>
                 <w:szCs w:val="18"/>
               </w:rPr>
-              <w:t xml:space="preserve">2</w:t>
+              <w:t xml:space="preserve">B</w:t>
             </w:r>
           </w:p>
         </w:tc>
@@ -20013,7 +19911,7 @@
                 <w:sz w:val="18"/>
                 <w:szCs w:val="18"/>
               </w:rPr>
-              <w:t xml:space="preserve">2</w:t>
+              <w:t xml:space="preserve">B</w:t>
             </w:r>
           </w:p>
         </w:tc>
@@ -20283,7 +20181,7 @@
                 <w:sz w:val="18"/>
                 <w:szCs w:val="18"/>
               </w:rPr>
-              <w:t xml:space="preserve">2</w:t>
+              <w:t xml:space="preserve">B</w:t>
             </w:r>
           </w:p>
         </w:tc>
@@ -20559,7 +20457,7 @@
                 <w:sz w:val="18"/>
                 <w:szCs w:val="18"/>
               </w:rPr>
-              <w:t xml:space="preserve">2</w:t>
+              <w:t xml:space="preserve">B</w:t>
             </w:r>
           </w:p>
         </w:tc>
@@ -20829,7 +20727,7 @@
                 <w:sz w:val="18"/>
                 <w:szCs w:val="18"/>
               </w:rPr>
-              <w:t xml:space="preserve">2</w:t>
+              <w:t xml:space="preserve">B</w:t>
             </w:r>
           </w:p>
         </w:tc>
@@ -21105,7 +21003,7 @@
                 <w:sz w:val="18"/>
                 <w:szCs w:val="18"/>
               </w:rPr>
-              <w:t xml:space="preserve">2</w:t>
+              <w:t xml:space="preserve">B</w:t>
             </w:r>
           </w:p>
         </w:tc>
@@ -21375,7 +21273,7 @@
                 <w:sz w:val="18"/>
                 <w:szCs w:val="18"/>
               </w:rPr>
-              <w:t xml:space="preserve">2</w:t>
+              <w:t xml:space="preserve">B</w:t>
             </w:r>
           </w:p>
         </w:tc>
@@ -21651,7 +21549,7 @@
                 <w:sz w:val="18"/>
                 <w:szCs w:val="18"/>
               </w:rPr>
-              <w:t xml:space="preserve">2</w:t>
+              <w:t xml:space="preserve">B</w:t>
             </w:r>
           </w:p>
         </w:tc>
@@ -21921,7 +21819,7 @@
                 <w:sz w:val="18"/>
                 <w:szCs w:val="18"/>
               </w:rPr>
-              <w:t xml:space="preserve">2</w:t>
+              <w:t xml:space="preserve">B</w:t>
             </w:r>
           </w:p>
         </w:tc>
@@ -22197,7 +22095,7 @@
                 <w:sz w:val="18"/>
                 <w:szCs w:val="18"/>
               </w:rPr>
-              <w:t xml:space="preserve">2</w:t>
+              <w:t xml:space="preserve">B</w:t>
             </w:r>
           </w:p>
         </w:tc>
@@ -22467,7 +22365,7 @@
                 <w:sz w:val="18"/>
                 <w:szCs w:val="18"/>
               </w:rPr>
-              <w:t xml:space="preserve">2</w:t>
+              <w:t xml:space="preserve">B</w:t>
             </w:r>
           </w:p>
         </w:tc>
@@ -22743,7 +22641,7 @@
                 <w:sz w:val="18"/>
                 <w:szCs w:val="18"/>
               </w:rPr>
-              <w:t xml:space="preserve">1</w:t>
+              <w:t xml:space="preserve">A</w:t>
             </w:r>
           </w:p>
         </w:tc>
@@ -23013,7 +22911,7 @@
                 <w:sz w:val="18"/>
                 <w:szCs w:val="18"/>
               </w:rPr>
-              <w:t xml:space="preserve">1</w:t>
+              <w:t xml:space="preserve">A</w:t>
             </w:r>
           </w:p>
         </w:tc>
@@ -23149,7 +23047,7 @@
                 <w:sz w:val="18"/>
                 <w:szCs w:val="18"/>
               </w:rPr>
-              <w:t xml:space="preserve">n.c.</w:t>
+              <w:t xml:space="preserve">n.p.</w:t>
             </w:r>
           </w:p>
         </w:tc>
@@ -23289,7 +23187,7 @@
                 <w:sz w:val="18"/>
                 <w:szCs w:val="18"/>
               </w:rPr>
-              <w:t xml:space="preserve">1</w:t>
+              <w:t xml:space="preserve">A</w:t>
             </w:r>
           </w:p>
         </w:tc>
@@ -23559,7 +23457,7 @@
                 <w:sz w:val="18"/>
                 <w:szCs w:val="18"/>
               </w:rPr>
-              <w:t xml:space="preserve">1</w:t>
+              <w:t xml:space="preserve">A</w:t>
             </w:r>
           </w:p>
         </w:tc>
@@ -23835,7 +23733,7 @@
                 <w:sz w:val="18"/>
                 <w:szCs w:val="18"/>
               </w:rPr>
-              <w:t xml:space="preserve">1</w:t>
+              <w:t xml:space="preserve">A</w:t>
             </w:r>
           </w:p>
         </w:tc>
@@ -24085,7 +23983,7 @@
           <w:sz w:val="17"/>
           <w:szCs w:val="17"/>
         </w:rPr>
-        <w:t xml:space="preserve">n.c. : « paiement direct », mode de règlement non précisé. Int. « – » : question non posée (lot 1).</w:t>
+        <w:t xml:space="preserve">n.p. : « paiement direct », mode de règlement non précisé. Int. « – » : question non posée dans la version A.</w:t>
       </w:r>
     </w:p>
     <w:p>
@@ -24110,7 +24008,7 @@
           <w:sz w:val="28"/>
           <w:szCs w:val="28"/>
         </w:rPr>
-        <w:t xml:space="preserve">Annexe B : Grille de codage</w:t>
+        <w:t xml:space="preserve">Annexe B : Grille de lecture des réponses</w:t>
       </w:r>
     </w:p>
     <w:tbl>
@@ -24202,7 +24100,7 @@
                 <w:sz w:val="18"/>
                 <w:szCs w:val="18"/>
               </w:rPr>
-              <w:t xml:space="preserve">Règle de codage</w:t>
+              <w:t xml:space="preserve">Règle de classement</w:t>
             </w:r>
           </w:p>
         </w:tc>
@@ -24429,7 +24327,7 @@
                 <w:sz w:val="18"/>
                 <w:szCs w:val="18"/>
               </w:rPr>
-              <w:t xml:space="preserve">Réponse à la question « L’entreprise a-t-elle déjà adopté des cartes bancaires professionnelles ? »</w:t>
+              <w:t xml:space="preserve">Réponse à la question sur l’adoption de cartes bancaires professionnelles</w:t>
             </w:r>
           </w:p>
         </w:tc>

</xml_diff>